<commit_message>
Accepted all changes for 1.1
</commit_message>
<xml_diff>
--- a/Service-Specification-for-route-exchange-ed1.1.docx
+++ b/Service-Specification-for-route-exchange-ed1.1.docx
@@ -612,23 +612,6 @@
         </w:rPr>
         <w:t>Edition 1</w:t>
       </w:r>
-      <w:del w:id="2" w:author="Ramin Miraftabi" w:date="2025-09-24T09:38:00Z" w16du:dateUtc="2025-09-24T07:38:00Z">
-        <w:r>
-          <w:rPr>
-            <w:rFonts w:ascii="Calibri" w:hAnsi="Calibri" w:cs="Calibri"/>
-            <w:color w:val="1F4E79" w:themeColor="accent5" w:themeShade="80"/>
-          </w:rPr>
-          <w:delText>.</w:delText>
-        </w:r>
-        <w:r>
-          <w:rPr>
-            <w:rFonts w:ascii="Calibri" w:eastAsiaTheme="minorEastAsia" w:hAnsi="Calibri" w:cs="Calibri" w:hint="eastAsia"/>
-            <w:color w:val="1F4E79" w:themeColor="accent5" w:themeShade="80"/>
-            <w:lang w:eastAsia="ko-KR"/>
-          </w:rPr>
-          <w:delText>0</w:delText>
-        </w:r>
-      </w:del>
       <w:r>
         <w:rPr>
           <w:rFonts w:ascii="Calibri" w:eastAsiaTheme="minorEastAsia" w:hAnsi="Calibri" w:cs="Calibri" w:hint="eastAsia"/>
@@ -737,16 +720,6 @@
         </w:rPr>
         <w:t>:1</w:t>
       </w:r>
-      <w:del w:id="3" w:author="Ramin Miraftabi" w:date="2025-09-24T09:38:00Z" w16du:dateUtc="2025-09-24T07:38:00Z">
-        <w:r>
-          <w:rPr>
-            <w:b/>
-            <w:bCs/>
-            <w:color w:val="1F4E79" w:themeColor="accent5" w:themeShade="80"/>
-          </w:rPr>
-          <w:delText>.0</w:delText>
-        </w:r>
-      </w:del>
       <w:r>
         <w:rPr>
           <w:rFonts w:eastAsiaTheme="minorEastAsia" w:hint="eastAsia"/>
@@ -1043,11 +1016,9 @@
               <w:pStyle w:val="Tabletext"/>
               <w:jc w:val="both"/>
             </w:pPr>
-            <w:ins w:id="4" w:author="Ramin Miraftabi" w:date="2025-09-24T09:38:00Z" w16du:dateUtc="2025-09-24T07:38:00Z">
-              <w:r>
-                <w:t>September 2025</w:t>
-              </w:r>
-            </w:ins>
+            <w:r>
+              <w:t>September 2025</w:t>
+            </w:r>
           </w:p>
         </w:tc>
         <w:tc>
@@ -1063,31 +1034,27 @@
                 <w:sz w:val="20"/>
               </w:rPr>
             </w:pPr>
-            <w:ins w:id="5" w:author="Ramin Miraftabi" w:date="2025-09-24T09:38:00Z" w16du:dateUtc="2025-09-24T07:38:00Z">
-              <w:r>
-                <w:rPr>
-                  <w:color w:val="000000" w:themeColor="text1"/>
-                  <w:sz w:val="20"/>
-                </w:rPr>
-                <w:t>Changes based on proposed changes in upcoming versions of SECOM and S-421 in IEC.</w:t>
-              </w:r>
-            </w:ins>
-            <w:ins w:id="6" w:author="Ramin Miraftabi" w:date="2025-09-25T11:04:00Z" w16du:dateUtc="2025-09-25T09:04:00Z">
-              <w:r>
-                <w:rPr>
-                  <w:color w:val="000000" w:themeColor="text1"/>
-                  <w:sz w:val="20"/>
-                </w:rPr>
-                <w:t xml:space="preserve"> Clarifications </w:t>
-              </w:r>
-              <w:r>
-                <w:rPr>
-                  <w:color w:val="000000" w:themeColor="text1"/>
-                  <w:sz w:val="20"/>
-                </w:rPr>
-                <w:t>based on global review.</w:t>
-              </w:r>
-            </w:ins>
+            <w:r>
+              <w:rPr>
+                <w:color w:val="000000" w:themeColor="text1"/>
+                <w:sz w:val="20"/>
+              </w:rPr>
+              <w:t>Changes based on proposed changes in upcoming versions of SECOM and S-421 in IEC.</w:t>
+            </w:r>
+            <w:r>
+              <w:rPr>
+                <w:color w:val="000000" w:themeColor="text1"/>
+                <w:sz w:val="20"/>
+              </w:rPr>
+              <w:t xml:space="preserve"> Clarifications </w:t>
+            </w:r>
+            <w:r>
+              <w:rPr>
+                <w:color w:val="000000" w:themeColor="text1"/>
+                <w:sz w:val="20"/>
+              </w:rPr>
+              <w:t>based on global review.</w:t>
+            </w:r>
           </w:p>
         </w:tc>
         <w:tc>
@@ -9098,7 +9065,7 @@
           <w:lang w:val="en-GB"/>
         </w:rPr>
       </w:pPr>
-      <w:bookmarkStart w:id="10" w:name="_Toc196502176"/>
+      <w:bookmarkStart w:id="4" w:name="_Toc196502176"/>
       <w:r>
         <w:rPr>
           <w:noProof w:val="0"/>
@@ -9107,7 +9074,7 @@
         <w:lastRenderedPageBreak/>
         <w:t>introduction</w:t>
       </w:r>
-      <w:bookmarkEnd w:id="10"/>
+      <w:bookmarkEnd w:id="4"/>
     </w:p>
     <w:p>
       <w:pPr>
@@ -9150,11 +9117,11 @@
       <w:pPr>
         <w:pStyle w:val="Heading2"/>
       </w:pPr>
-      <w:bookmarkStart w:id="11" w:name="_Toc196502177"/>
+      <w:bookmarkStart w:id="5" w:name="_Toc196502177"/>
       <w:r>
         <w:t>Purpose</w:t>
       </w:r>
-      <w:bookmarkEnd w:id="11"/>
+      <w:bookmarkEnd w:id="5"/>
     </w:p>
     <w:p>
       <w:pPr>
@@ -9309,11 +9276,11 @@
       <w:pPr>
         <w:pStyle w:val="Heading2"/>
       </w:pPr>
-      <w:bookmarkStart w:id="12" w:name="_Toc196502178"/>
+      <w:bookmarkStart w:id="6" w:name="_Toc196502178"/>
       <w:r>
         <w:t>Intended readership</w:t>
       </w:r>
-      <w:bookmarkEnd w:id="12"/>
+      <w:bookmarkEnd w:id="6"/>
     </w:p>
     <w:p>
       <w:pPr>
@@ -9343,11 +9310,11 @@
       <w:pPr>
         <w:pStyle w:val="Heading2"/>
       </w:pPr>
-      <w:bookmarkStart w:id="13" w:name="_Toc196502179"/>
+      <w:bookmarkStart w:id="7" w:name="_Toc196502179"/>
       <w:r>
         <w:t>Input from other sources</w:t>
       </w:r>
-      <w:bookmarkEnd w:id="13"/>
+      <w:bookmarkEnd w:id="7"/>
     </w:p>
     <w:p>
       <w:pPr>
@@ -9423,12 +9390,12 @@
       <w:pPr>
         <w:pStyle w:val="Heading1"/>
       </w:pPr>
-      <w:bookmarkStart w:id="14" w:name="_Toc196502180"/>
+      <w:bookmarkStart w:id="8" w:name="_Toc196502180"/>
       <w:r>
         <w:lastRenderedPageBreak/>
         <w:t>Service Identification</w:t>
       </w:r>
-      <w:bookmarkEnd w:id="14"/>
+      <w:bookmarkEnd w:id="8"/>
     </w:p>
     <w:p>
       <w:pPr>
@@ -9549,7 +9516,7 @@
                 <w:color w:val="00558C"/>
               </w:rPr>
             </w:pPr>
-            <w:bookmarkStart w:id="15" w:name="_Hlk196362966"/>
+            <w:bookmarkStart w:id="9" w:name="_Hlk196362966"/>
             <w:r>
               <w:rPr>
                 <w:b/>
@@ -9641,16 +9608,9 @@
             <w:r>
               <w:t>:iala:techsvc:ss:vts-res:1.</w:t>
             </w:r>
-            <w:ins w:id="16" w:author="Ramin Miraftabi" w:date="2025-09-24T09:38:00Z" w16du:dateUtc="2025-09-24T07:38:00Z">
-              <w:r>
-                <w:t>1</w:t>
-              </w:r>
-            </w:ins>
-            <w:del w:id="17" w:author="Ramin Miraftabi" w:date="2025-09-24T09:38:00Z" w16du:dateUtc="2025-09-24T07:38:00Z">
-              <w:r>
-                <w:delText>0</w:delText>
-              </w:r>
-            </w:del>
+            <w:r>
+              <w:t>1</w:t>
+            </w:r>
           </w:p>
         </w:tc>
       </w:tr>
@@ -9701,16 +9661,9 @@
             <w:r>
               <w:t>1.</w:t>
             </w:r>
-            <w:ins w:id="18" w:author="Ramin Miraftabi" w:date="2025-09-24T09:38:00Z" w16du:dateUtc="2025-09-24T07:38:00Z">
-              <w:r>
-                <w:t>1</w:t>
-              </w:r>
-            </w:ins>
-            <w:del w:id="19" w:author="Ramin Miraftabi" w:date="2025-09-24T09:38:00Z" w16du:dateUtc="2025-09-24T07:38:00Z">
-              <w:r>
-                <w:delText>0</w:delText>
-              </w:r>
-            </w:del>
+            <w:r>
+              <w:t>1</w:t>
+            </w:r>
           </w:p>
         </w:tc>
       </w:tr>
@@ -9919,13 +9872,13 @@
       <w:pPr>
         <w:pStyle w:val="Heading1"/>
       </w:pPr>
-      <w:bookmarkStart w:id="20" w:name="_Toc196502181"/>
-      <w:bookmarkEnd w:id="15"/>
+      <w:bookmarkStart w:id="10" w:name="_Toc196502181"/>
+      <w:bookmarkEnd w:id="9"/>
       <w:r>
         <w:lastRenderedPageBreak/>
         <w:t>Operational context</w:t>
       </w:r>
-      <w:bookmarkEnd w:id="20"/>
+      <w:bookmarkEnd w:id="10"/>
     </w:p>
     <w:p>
       <w:pPr>
@@ -9941,7 +9894,7 @@
           <w:lang w:val="en-US"/>
         </w:rPr>
       </w:pPr>
-      <w:bookmarkStart w:id="21" w:name="_Hlk196363732"/>
+      <w:bookmarkStart w:id="11" w:name="_Hlk196363732"/>
       <w:r>
         <w:rPr>
           <w:lang w:val="en-US"/>
@@ -10340,8 +10293,8 @@
           <w:lang w:val="en-US"/>
         </w:rPr>
       </w:pPr>
-      <w:bookmarkStart w:id="22" w:name="_Toc196502182"/>
-      <w:bookmarkEnd w:id="21"/>
+      <w:bookmarkStart w:id="12" w:name="_Toc196502182"/>
+      <w:bookmarkEnd w:id="11"/>
       <w:r>
         <w:rPr>
           <w:lang w:val="en-US"/>
@@ -10354,7 +10307,7 @@
         </w:rPr>
         <w:t>VTS – Vessel Route Exchange</w:t>
       </w:r>
-      <w:bookmarkEnd w:id="22"/>
+      <w:bookmarkEnd w:id="12"/>
     </w:p>
     <w:p>
       <w:pPr>
@@ -10487,7 +10440,7 @@
       <w:pPr>
         <w:pStyle w:val="Caption"/>
       </w:pPr>
-      <w:bookmarkStart w:id="23" w:name="_Toc196500260"/>
+      <w:bookmarkStart w:id="13" w:name="_Toc196500260"/>
       <w:r>
         <w:t xml:space="preserve">Figure </w:t>
       </w:r>
@@ -10502,7 +10455,7 @@
       <w:r>
         <w:t xml:space="preserve"> High-level view of route exchange use cases</w:t>
       </w:r>
-      <w:bookmarkEnd w:id="23"/>
+      <w:bookmarkEnd w:id="13"/>
     </w:p>
     <w:p>
       <w:pPr>
@@ -10519,16 +10472,16 @@
           <w:lang w:val="en-US"/>
         </w:rPr>
       </w:pPr>
-      <w:bookmarkStart w:id="24" w:name="_Ref196500825"/>
-      <w:bookmarkStart w:id="25" w:name="_Toc196502183"/>
+      <w:bookmarkStart w:id="14" w:name="_Ref196500825"/>
+      <w:bookmarkStart w:id="15" w:name="_Toc196502183"/>
       <w:r>
         <w:rPr>
           <w:lang w:val="en-US"/>
         </w:rPr>
         <w:t>Use case 1 - Initial sharing of the route from Vessel to VTS</w:t>
       </w:r>
-      <w:bookmarkEnd w:id="24"/>
-      <w:bookmarkEnd w:id="25"/>
+      <w:bookmarkEnd w:id="14"/>
+      <w:bookmarkEnd w:id="15"/>
     </w:p>
     <w:p>
       <w:pPr>
@@ -10725,47 +10678,18 @@
         </w:rPr>
         <w:t xml:space="preserve"> (including cross track distance limit (</w:t>
       </w:r>
-      <w:del w:id="26" w:author="Ramin Miraftabi" w:date="2025-09-23T11:16:00Z" w16du:dateUtc="2025-09-23T09:16:00Z">
-        <w:r>
-          <w:rPr>
-            <w:lang w:val="en-US"/>
-          </w:rPr>
-          <w:delText>XTD</w:delText>
-        </w:r>
-      </w:del>
-      <w:ins w:id="27" w:author="Ramin Miraftabi" w:date="2025-09-23T11:16:00Z" w16du:dateUtc="2025-09-23T09:16:00Z">
-        <w:r>
-          <w:rPr>
-            <w:lang w:val="en-US"/>
-          </w:rPr>
-          <w:t>C</w:t>
-        </w:r>
-      </w:ins>
+      <w:r>
+        <w:rPr>
+          <w:lang w:val="en-US"/>
+        </w:rPr>
+        <w:t>C</w:t>
+      </w:r>
       <w:r>
         <w:rPr>
           <w:lang w:val="en-US"/>
         </w:rPr>
         <w:t>L)</w:t>
       </w:r>
-    </w:p>
-    <w:p>
-      <w:pPr>
-        <w:pStyle w:val="Bullet1"/>
-        <w:spacing w:before="0"/>
-        <w:ind w:left="1080" w:hanging="360"/>
-        <w:rPr>
-          <w:del w:id="28" w:author="Ramin Miraftabi" w:date="2025-09-22T12:02:00Z" w16du:dateUtc="2025-09-22T10:02:00Z"/>
-          <w:lang w:val="en-US"/>
-        </w:rPr>
-      </w:pPr>
-      <w:del w:id="29" w:author="Ramin Miraftabi" w:date="2025-09-22T12:02:00Z" w16du:dateUtc="2025-09-22T10:02:00Z">
-        <w:r>
-          <w:rPr>
-            <w:lang w:val="en-US"/>
-          </w:rPr>
-          <w:delText>Route edition number should be 1</w:delText>
-        </w:r>
-      </w:del>
     </w:p>
     <w:p>
       <w:pPr>
@@ -10885,16 +10809,16 @@
           <w:lang w:val="en-US"/>
         </w:rPr>
       </w:pPr>
-      <w:bookmarkStart w:id="30" w:name="_Ref196500874"/>
-      <w:bookmarkStart w:id="31" w:name="_Toc196502184"/>
+      <w:bookmarkStart w:id="16" w:name="_Ref196500874"/>
+      <w:bookmarkStart w:id="17" w:name="_Toc196502184"/>
       <w:r>
         <w:rPr>
           <w:lang w:val="en-US"/>
         </w:rPr>
         <w:t>Use case 2 - VTS gives route recommendation to vessel within a geographically defined area</w:t>
       </w:r>
-      <w:bookmarkEnd w:id="30"/>
-      <w:bookmarkEnd w:id="31"/>
+      <w:bookmarkEnd w:id="16"/>
+      <w:bookmarkEnd w:id="17"/>
     </w:p>
     <w:p>
       <w:pPr>
@@ -11201,7 +11125,7 @@
           <w:lang w:val="fr-FR"/>
         </w:rPr>
       </w:pPr>
-      <w:bookmarkStart w:id="32" w:name="_Toc196502185"/>
+      <w:bookmarkStart w:id="18" w:name="_Toc196502185"/>
       <w:r>
         <w:rPr>
           <w:lang w:val="fr-FR"/>
@@ -11243,7 +11167,7 @@
         </w:rPr>
         <w:t>vessel</w:t>
       </w:r>
-      <w:bookmarkEnd w:id="32"/>
+      <w:bookmarkEnd w:id="18"/>
       <w:proofErr w:type="spellEnd"/>
     </w:p>
     <w:p>
@@ -11315,22 +11239,6 @@
     </w:p>
     <w:p>
       <w:pPr>
-        <w:pStyle w:val="Bullet1"/>
-        <w:spacing w:before="0"/>
-        <w:rPr>
-          <w:moveFrom w:id="33" w:author="Ramin Miraftabi" w:date="2025-09-22T12:04:00Z" w16du:dateUtc="2025-09-22T10:04:00Z"/>
-        </w:rPr>
-      </w:pPr>
-      <w:moveFromRangeStart w:id="34" w:author="Ramin Miraftabi" w:date="2025-09-22T12:04:00Z" w:name="move209435078"/>
-      <w:moveFrom w:id="35" w:author="Ramin Miraftabi" w:date="2025-09-22T12:04:00Z" w16du:dateUtc="2025-09-22T10:04:00Z">
-        <w:r>
-          <w:t xml:space="preserve">Service settings determine if updates are requested for only changes that affect a defined area of interest (geometry) or the whole route. </w:t>
-        </w:r>
-      </w:moveFrom>
-    </w:p>
-    <w:moveFromRangeEnd w:id="34"/>
-    <w:p>
-      <w:pPr>
         <w:pStyle w:val="ListParagraph"/>
         <w:ind w:left="709" w:hanging="425"/>
       </w:pPr>
@@ -11338,48 +11246,6 @@
         <w:t>Vessel sends route as requested when changes occur. For more details, see RESF012</w:t>
       </w:r>
     </w:p>
-    <w:p>
-      <w:pPr>
-        <w:pStyle w:val="ListParagraph"/>
-        <w:ind w:left="709" w:hanging="425"/>
-        <w:rPr>
-          <w:del w:id="36" w:author="Ramin Miraftabi" w:date="2025-09-22T12:04:00Z" w16du:dateUtc="2025-09-22T10:04:00Z"/>
-          <w:moveTo w:id="37" w:author="Ramin Miraftabi" w:date="2025-09-22T12:04:00Z" w16du:dateUtc="2025-09-22T10:04:00Z"/>
-        </w:rPr>
-        <w:pPrChange w:id="38" w:author="Ramin Miraftabi" w:date="2025-09-22T12:04:00Z" w16du:dateUtc="2025-09-22T10:04:00Z">
-          <w:pPr>
-            <w:pStyle w:val="ListParagraph"/>
-          </w:pPr>
-        </w:pPrChange>
-      </w:pPr>
-      <w:r>
-        <w:t>The service receives the route and forwards it to VTS system.</w:t>
-      </w:r>
-      <w:ins w:id="39" w:author="Ramin Miraftabi" w:date="2025-09-22T12:04:00Z" w16du:dateUtc="2025-09-22T10:04:00Z">
-        <w:r>
-          <w:t xml:space="preserve"> </w:t>
-        </w:r>
-      </w:ins>
-      <w:moveToRangeStart w:id="40" w:author="Ramin Miraftabi" w:date="2025-09-22T12:04:00Z" w:name="move209435078"/>
-      <w:moveTo w:id="41" w:author="Ramin Miraftabi" w:date="2025-09-22T12:04:00Z" w16du:dateUtc="2025-09-22T10:04:00Z">
-        <w:del w:id="42" w:author="Ramin Miraftabi" w:date="2025-09-24T09:48:00Z" w16du:dateUtc="2025-09-24T07:48:00Z">
-          <w:r>
-            <w:delText xml:space="preserve">Service settings determine if </w:delText>
-          </w:r>
-        </w:del>
-        <w:del w:id="43" w:author="Ramin Miraftabi" w:date="2025-09-22T12:04:00Z" w16du:dateUtc="2025-09-22T10:04:00Z">
-          <w:r>
-            <w:delText>updates are requested for only</w:delText>
-          </w:r>
-        </w:del>
-        <w:del w:id="44" w:author="Ramin Miraftabi" w:date="2025-09-24T09:48:00Z" w16du:dateUtc="2025-09-24T07:48:00Z">
-          <w:r>
-            <w:delText xml:space="preserve"> changes that affect a defined area of interest (geometry) or the whole route. </w:delText>
-          </w:r>
-        </w:del>
-      </w:moveTo>
-    </w:p>
-    <w:moveToRangeEnd w:id="40"/>
     <w:p>
       <w:pPr>
         <w:pStyle w:val="ListParagraph"/>
@@ -11388,13 +11254,13 @@
           <w:numId w:val="0"/>
         </w:numPr>
         <w:ind w:left="709"/>
-        <w:pPrChange w:id="45" w:author="Ramin Miraftabi" w:date="2025-09-22T12:05:00Z" w16du:dateUtc="2025-09-22T10:05:00Z">
-          <w:pPr>
-            <w:pStyle w:val="ListParagraph"/>
-            <w:ind w:left="709" w:hanging="425"/>
-          </w:pPr>
-        </w:pPrChange>
-      </w:pPr>
+      </w:pPr>
+      <w:r>
+        <w:t>The service receives the route and forwards it to VTS system.</w:t>
+      </w:r>
+      <w:r>
+        <w:t xml:space="preserve"> </w:t>
+      </w:r>
     </w:p>
     <w:p>
       <w:pPr>
@@ -11427,11 +11293,11 @@
       <w:pPr>
         <w:pStyle w:val="Heading3"/>
       </w:pPr>
-      <w:bookmarkStart w:id="46" w:name="_Toc196502186"/>
+      <w:bookmarkStart w:id="19" w:name="_Toc196502186"/>
       <w:r>
         <w:t>Use case 4 – Vessel’s route changes</w:t>
       </w:r>
-      <w:bookmarkEnd w:id="46"/>
+      <w:bookmarkEnd w:id="19"/>
     </w:p>
     <w:p>
       <w:pPr>
@@ -11533,77 +11399,42 @@
       <w:r>
         <w:t xml:space="preserve">If </w:t>
       </w:r>
-      <w:ins w:id="47" w:author="Ramin Miraftabi" w:date="2025-09-24T09:51:00Z" w16du:dateUtc="2025-09-24T07:51:00Z">
-        <w:r>
-          <w:t xml:space="preserve">the </w:t>
-        </w:r>
-      </w:ins>
-      <w:r>
-        <w:t xml:space="preserve">route goes through a </w:t>
-      </w:r>
-      <w:del w:id="48" w:author="Ramin Miraftabi" w:date="2025-09-24T09:50:00Z" w16du:dateUtc="2025-09-24T07:50:00Z">
-        <w:r>
-          <w:delText xml:space="preserve">new </w:delText>
-        </w:r>
-      </w:del>
-      <w:r>
-        <w:t>VTS area</w:t>
-      </w:r>
-      <w:ins w:id="49" w:author="Ramin Miraftabi" w:date="2025-09-24T09:50:00Z" w16du:dateUtc="2025-09-24T07:50:00Z">
-        <w:r>
-          <w:t xml:space="preserve"> that is new for the route</w:t>
-        </w:r>
-      </w:ins>
+      <w:r>
+        <w:t xml:space="preserve">the </w:t>
+      </w:r>
+      <w:r>
+        <w:t>route goes through a VTS area</w:t>
+      </w:r>
+      <w:r>
+        <w:t xml:space="preserve"> that is new for the route</w:t>
+      </w:r>
       <w:r>
         <w:t xml:space="preserve">, </w:t>
       </w:r>
-      <w:ins w:id="50" w:author="Ramin Miraftabi" w:date="2025-09-24T09:51:00Z" w16du:dateUtc="2025-09-24T07:51:00Z">
-        <w:r>
-          <w:t xml:space="preserve">the </w:t>
-        </w:r>
-      </w:ins>
-      <w:ins w:id="51" w:author="Ramin Miraftabi" w:date="2025-09-23T16:59:00Z" w16du:dateUtc="2025-09-23T14:59:00Z">
-        <w:r>
-          <w:t xml:space="preserve">vessel </w:t>
-        </w:r>
-        <w:r>
-          <w:t>should</w:t>
-        </w:r>
-        <w:r>
-          <w:t xml:space="preserve"> share the route</w:t>
-        </w:r>
-      </w:ins>
-      <w:del w:id="52" w:author="Ramin Miraftabi" w:date="2025-09-23T16:59:00Z" w16du:dateUtc="2025-09-23T14:59:00Z">
-        <w:r>
-          <w:delText>route is shared with</w:delText>
-        </w:r>
-      </w:del>
+      <w:r>
+        <w:t xml:space="preserve">the </w:t>
+      </w:r>
+      <w:r>
+        <w:t xml:space="preserve">vessel </w:t>
+      </w:r>
+      <w:r>
+        <w:t>should</w:t>
+      </w:r>
+      <w:r>
+        <w:t xml:space="preserve"> share the route</w:t>
+      </w:r>
       <w:r>
         <w:t xml:space="preserve"> </w:t>
       </w:r>
-      <w:del w:id="53" w:author="Ramin Miraftabi" w:date="2025-09-24T09:50:00Z" w16du:dateUtc="2025-09-24T07:50:00Z">
-        <w:r>
-          <w:delText xml:space="preserve">new </w:delText>
-        </w:r>
-      </w:del>
-      <w:ins w:id="54" w:author="Ramin Miraftabi" w:date="2025-09-24T09:52:00Z" w16du:dateUtc="2025-09-24T07:52:00Z">
-        <w:r>
-          <w:t>to that</w:t>
-        </w:r>
-      </w:ins>
-      <w:ins w:id="55" w:author="Ramin Miraftabi" w:date="2025-09-24T09:50:00Z" w16du:dateUtc="2025-09-24T07:50:00Z">
-        <w:r>
-          <w:t xml:space="preserve"> </w:t>
-        </w:r>
-      </w:ins>
+      <w:r>
+        <w:t>to that</w:t>
+      </w:r>
+      <w:r>
+        <w:t xml:space="preserve"> </w:t>
+      </w:r>
       <w:r>
         <w:t xml:space="preserve">VTS. </w:t>
       </w:r>
-      <w:del w:id="56" w:author="Ramin Miraftabi" w:date="2025-09-22T12:05:00Z" w16du:dateUtc="2025-09-22T10:05:00Z">
-        <w:r>
-          <w:delText>This is the only case where it is allowed for the route edition number to be greater than 1 when route is initially shared with VTS.</w:delText>
-        </w:r>
-      </w:del>
     </w:p>
     <w:p>
       <w:pPr>
@@ -11620,7 +11451,6 @@
         <w:ind w:left="709" w:hanging="425"/>
       </w:pPr>
       <w:r>
-        <w:lastRenderedPageBreak/>
         <w:t>VTS System can display the route as needed to the VTS personnel with ability to highlight the changes.</w:t>
       </w:r>
     </w:p>
@@ -11652,11 +11482,12 @@
       <w:pPr>
         <w:pStyle w:val="Heading3"/>
       </w:pPr>
-      <w:bookmarkStart w:id="57" w:name="_Toc196502187"/>
-      <w:r>
+      <w:bookmarkStart w:id="20" w:name="_Toc196502187"/>
+      <w:r>
+        <w:lastRenderedPageBreak/>
         <w:t>Use case 5 – Vessel does not arrive to VTS area as planned</w:t>
       </w:r>
-      <w:bookmarkEnd w:id="57"/>
+      <w:bookmarkEnd w:id="20"/>
     </w:p>
     <w:p>
       <w:pPr>
@@ -11771,7 +11602,7 @@
           <w:lang w:val="en-US"/>
         </w:rPr>
       </w:pPr>
-      <w:bookmarkStart w:id="58" w:name="_Toc196502188"/>
+      <w:bookmarkStart w:id="21" w:name="_Toc196502188"/>
       <w:r>
         <w:rPr>
           <w:lang w:val="en-US"/>
@@ -11784,35 +11615,25 @@
         </w:rPr>
         <w:t xml:space="preserve">VTS </w:t>
       </w:r>
-      <w:del w:id="59" w:author="Ramin Miraftabi" w:date="2025-09-24T09:03:00Z" w16du:dateUtc="2025-09-24T07:03:00Z">
-        <w:r>
-          <w:rPr>
-            <w:lang w:val="en-US"/>
-          </w:rPr>
-          <w:delText xml:space="preserve">acknowledges </w:delText>
-        </w:r>
-      </w:del>
-      <w:ins w:id="60" w:author="Ramin Miraftabi" w:date="2025-09-24T09:03:00Z" w16du:dateUtc="2025-09-24T07:03:00Z">
-        <w:r>
-          <w:rPr>
-            <w:lang w:val="en-US"/>
-          </w:rPr>
-          <w:t>checks</w:t>
-        </w:r>
-        <w:r>
-          <w:rPr>
-            <w:lang w:val="en-US"/>
-          </w:rPr>
-          <w:t xml:space="preserve"> </w:t>
-        </w:r>
-      </w:ins>
+      <w:r>
+        <w:rPr>
+          <w:lang w:val="en-US"/>
+        </w:rPr>
+        <w:t>checks</w:t>
+      </w:r>
+      <w:r>
+        <w:rPr>
+          <w:lang w:val="en-US"/>
+        </w:rPr>
+        <w:t xml:space="preserve"> </w:t>
+      </w:r>
       <w:r>
         <w:rPr>
           <w:lang w:val="en-US"/>
         </w:rPr>
         <w:t>the route with help from other services</w:t>
       </w:r>
-      <w:bookmarkEnd w:id="58"/>
+      <w:bookmarkEnd w:id="21"/>
     </w:p>
     <w:p>
       <w:pPr>
@@ -11841,78 +11662,48 @@
         </w:rPr>
         <w:t xml:space="preserve">VTS </w:t>
       </w:r>
-      <w:del w:id="61" w:author="Ramin Miraftabi" w:date="2025-09-24T09:03:00Z" w16du:dateUtc="2025-09-24T07:03:00Z">
-        <w:r>
-          <w:rPr>
-            <w:lang w:val="en-US"/>
-          </w:rPr>
-          <w:delText xml:space="preserve">acknowledges </w:delText>
-        </w:r>
-      </w:del>
-      <w:ins w:id="62" w:author="Ramin Miraftabi" w:date="2025-09-24T09:03:00Z" w16du:dateUtc="2025-09-24T07:03:00Z">
-        <w:r>
-          <w:rPr>
-            <w:lang w:val="en-US"/>
-          </w:rPr>
-          <w:t>checks</w:t>
-        </w:r>
-        <w:r>
-          <w:rPr>
-            <w:lang w:val="en-US"/>
-          </w:rPr>
-          <w:t xml:space="preserve"> </w:t>
-        </w:r>
-      </w:ins>
+      <w:r>
+        <w:rPr>
+          <w:lang w:val="en-US"/>
+        </w:rPr>
+        <w:t>checks</w:t>
+      </w:r>
+      <w:r>
+        <w:rPr>
+          <w:lang w:val="en-US"/>
+        </w:rPr>
+        <w:t xml:space="preserve"> </w:t>
+      </w:r>
       <w:r>
         <w:rPr>
           <w:lang w:val="en-US"/>
         </w:rPr>
         <w:t xml:space="preserve">vessel’s route without changes. The </w:t>
       </w:r>
-      <w:del w:id="63" w:author="Ramin Miraftabi" w:date="2025-09-24T09:03:00Z" w16du:dateUtc="2025-09-24T07:03:00Z">
-        <w:r>
-          <w:rPr>
-            <w:lang w:val="en-US"/>
-          </w:rPr>
-          <w:delText xml:space="preserve">acknowledgment </w:delText>
-        </w:r>
-      </w:del>
-      <w:ins w:id="64" w:author="Ramin Miraftabi" w:date="2025-09-24T09:03:00Z" w16du:dateUtc="2025-09-24T07:03:00Z">
-        <w:r>
-          <w:rPr>
-            <w:lang w:val="en-US"/>
-          </w:rPr>
-          <w:t>checking</w:t>
-        </w:r>
-        <w:r>
-          <w:rPr>
-            <w:lang w:val="en-US"/>
-          </w:rPr>
-          <w:t xml:space="preserve"> </w:t>
-        </w:r>
-      </w:ins>
+      <w:r>
+        <w:rPr>
+          <w:lang w:val="en-US"/>
+        </w:rPr>
+        <w:t>checking</w:t>
+      </w:r>
+      <w:r>
+        <w:rPr>
+          <w:lang w:val="en-US"/>
+        </w:rPr>
+        <w:t xml:space="preserve"> </w:t>
+      </w:r>
       <w:r>
         <w:rPr>
           <w:lang w:val="en-US"/>
         </w:rPr>
         <w:t xml:space="preserve">process includes the use of other systems, e.g. cross-check, to assist VTS personnel in manual route </w:t>
       </w:r>
-      <w:del w:id="65" w:author="Ramin Miraftabi" w:date="2025-09-24T09:03:00Z" w16du:dateUtc="2025-09-24T07:03:00Z">
-        <w:r>
-          <w:rPr>
-            <w:lang w:val="en-US"/>
-          </w:rPr>
-          <w:delText>acknowledgment</w:delText>
-        </w:r>
-      </w:del>
-      <w:ins w:id="66" w:author="Ramin Miraftabi" w:date="2025-09-24T09:03:00Z" w16du:dateUtc="2025-09-24T07:03:00Z">
-        <w:r>
-          <w:rPr>
-            <w:lang w:val="en-US"/>
-          </w:rPr>
-          <w:t>checking</w:t>
-        </w:r>
-      </w:ins>
+      <w:r>
+        <w:rPr>
+          <w:lang w:val="en-US"/>
+        </w:rPr>
+        <w:t>checking</w:t>
+      </w:r>
       <w:r>
         <w:rPr>
           <w:lang w:val="en-US"/>
@@ -12047,46 +11838,18 @@
         <w:pStyle w:val="ListParagraph"/>
         <w:ind w:left="709" w:hanging="425"/>
       </w:pPr>
-      <w:ins w:id="67" w:author="Ramin Miraftabi" w:date="2025-09-24T09:58:00Z" w16du:dateUtc="2025-09-24T07:58:00Z">
-        <w:r>
-          <w:t xml:space="preserve">The </w:t>
-        </w:r>
-      </w:ins>
+      <w:r>
+        <w:t xml:space="preserve">The </w:t>
+      </w:r>
       <w:r>
         <w:t xml:space="preserve">VTS system </w:t>
       </w:r>
-      <w:del w:id="68" w:author="Ramin Miraftabi" w:date="2025-09-24T09:59:00Z" w16du:dateUtc="2025-09-24T07:59:00Z">
-        <w:r>
-          <w:delText xml:space="preserve">sends </w:delText>
-        </w:r>
-        <w:r>
-          <w:delText xml:space="preserve">VTS </w:delText>
-        </w:r>
-      </w:del>
-      <w:del w:id="69" w:author="Ramin Miraftabi" w:date="2025-09-24T09:04:00Z" w16du:dateUtc="2025-09-24T07:04:00Z">
-        <w:r>
-          <w:delText xml:space="preserve">acknowledges </w:delText>
-        </w:r>
-      </w:del>
-      <w:del w:id="70" w:author="Ramin Miraftabi" w:date="2025-09-24T09:59:00Z" w16du:dateUtc="2025-09-24T07:59:00Z">
-        <w:r>
-          <w:delText>route</w:delText>
-        </w:r>
-        <w:r>
-          <w:delText xml:space="preserve"> to </w:delText>
-        </w:r>
-        <w:r>
-          <w:delText>on-board systems</w:delText>
-        </w:r>
-      </w:del>
-      <w:ins w:id="71" w:author="Ramin Miraftabi" w:date="2025-09-24T09:59:00Z" w16du:dateUtc="2025-09-24T07:59:00Z">
-        <w:r>
-          <w:t xml:space="preserve">sends a checked </w:t>
-        </w:r>
-        <w:r>
-          <w:t>route back to the on-board systems.</w:t>
-        </w:r>
-      </w:ins>
+      <w:r>
+        <w:t xml:space="preserve">sends a checked </w:t>
+      </w:r>
+      <w:r>
+        <w:t>route back to the on-board systems.</w:t>
+      </w:r>
     </w:p>
     <w:p>
       <w:pPr>
@@ -12111,16 +11874,9 @@
       <w:r>
         <w:t>The status of the route must be set to “</w:t>
       </w:r>
-      <w:del w:id="72" w:author="Ramin Miraftabi" w:date="2025-09-22T14:08:00Z" w16du:dateUtc="2025-09-22T12:08:00Z">
-        <w:r>
-          <w:delText>acknowledged</w:delText>
-        </w:r>
-      </w:del>
-      <w:ins w:id="73" w:author="Ramin Miraftabi" w:date="2025-09-22T14:08:00Z" w16du:dateUtc="2025-09-22T12:08:00Z">
-        <w:r>
-          <w:t>Checked</w:t>
-        </w:r>
-      </w:ins>
+      <w:r>
+        <w:t>Checked</w:t>
+      </w:r>
       <w:r>
         <w:t>”.</w:t>
       </w:r>
@@ -12154,16 +11910,9 @@
       <w:r>
         <w:t xml:space="preserve">VTS </w:t>
       </w:r>
-      <w:del w:id="74" w:author="Ramin Miraftabi" w:date="2025-09-22T14:08:00Z" w16du:dateUtc="2025-09-22T12:08:00Z">
-        <w:r>
-          <w:delText xml:space="preserve">acknowledged </w:delText>
-        </w:r>
-      </w:del>
-      <w:ins w:id="75" w:author="Ramin Miraftabi" w:date="2025-09-22T14:08:00Z" w16du:dateUtc="2025-09-22T12:08:00Z">
-        <w:r>
-          <w:t xml:space="preserve">checked </w:t>
-        </w:r>
-      </w:ins>
+      <w:r>
+        <w:t xml:space="preserve">checked </w:t>
+      </w:r>
       <w:r>
         <w:t>route</w:t>
       </w:r>
@@ -12176,12 +11925,11 @@
         <w:pStyle w:val="Heading3"/>
         <w:ind w:left="855" w:hanging="855"/>
       </w:pPr>
-      <w:bookmarkStart w:id="76" w:name="_Toc196502189"/>
-      <w:r>
-        <w:lastRenderedPageBreak/>
+      <w:bookmarkStart w:id="22" w:name="_Toc196502189"/>
+      <w:r>
         <w:t>Use case 7 - VTS personnel acknowledge the route without the use of other services</w:t>
       </w:r>
-      <w:bookmarkEnd w:id="76"/>
+      <w:bookmarkEnd w:id="22"/>
     </w:p>
     <w:p>
       <w:pPr>
@@ -12200,19 +11948,12 @@
       <w:r>
         <w:t xml:space="preserve">VTS personnel </w:t>
       </w:r>
-      <w:del w:id="77" w:author="Ramin Miraftabi" w:date="2025-09-22T14:08:00Z" w16du:dateUtc="2025-09-22T12:08:00Z">
-        <w:r>
-          <w:delText xml:space="preserve">acknowledges </w:delText>
-        </w:r>
-      </w:del>
-      <w:ins w:id="78" w:author="Ramin Miraftabi" w:date="2025-09-22T14:08:00Z" w16du:dateUtc="2025-09-22T12:08:00Z">
-        <w:r>
-          <w:t>checks</w:t>
-        </w:r>
-        <w:r>
-          <w:t xml:space="preserve"> </w:t>
-        </w:r>
-      </w:ins>
+      <w:r>
+        <w:t>checks</w:t>
+      </w:r>
+      <w:r>
+        <w:t xml:space="preserve"> </w:t>
+      </w:r>
       <w:r>
         <w:t>vessel’s route without changes. This use case does not include the use of external services to assist VTS personnel in the manual check of the route.</w:t>
       </w:r>
@@ -12274,6 +12015,7 @@
         <w:rPr>
           <w:lang w:val="en-US"/>
         </w:rPr>
+        <w:lastRenderedPageBreak/>
         <w:t xml:space="preserve">VTS </w:t>
       </w:r>
       <w:r>
@@ -12320,13 +12062,13 @@
       <w:pPr>
         <w:pStyle w:val="Heading3"/>
       </w:pPr>
-      <w:bookmarkStart w:id="79" w:name="_Toc193450697"/>
-      <w:bookmarkStart w:id="80" w:name="_Toc196502190"/>
+      <w:bookmarkStart w:id="23" w:name="_Toc193450697"/>
+      <w:bookmarkStart w:id="24" w:name="_Toc196502190"/>
       <w:r>
         <w:t>Use Case 8 - VTS sends route back with comments</w:t>
       </w:r>
-      <w:bookmarkEnd w:id="79"/>
-      <w:bookmarkEnd w:id="80"/>
+      <w:bookmarkEnd w:id="23"/>
+      <w:bookmarkEnd w:id="24"/>
     </w:p>
     <w:p>
       <w:pPr>
@@ -12504,16 +12246,16 @@
       <w:pPr>
         <w:pStyle w:val="Heading3"/>
       </w:pPr>
-      <w:bookmarkStart w:id="81" w:name="_Toc193450698"/>
-      <w:bookmarkStart w:id="82" w:name="_Toc196502191"/>
+      <w:bookmarkStart w:id="25" w:name="_Toc193450698"/>
+      <w:bookmarkStart w:id="26" w:name="_Toc196502191"/>
       <w:r>
         <w:t xml:space="preserve">Use Case 9 - </w:t>
       </w:r>
       <w:r>
         <w:t>Vessel gets multiple changes to their route</w:t>
       </w:r>
-      <w:bookmarkEnd w:id="81"/>
-      <w:bookmarkEnd w:id="82"/>
+      <w:bookmarkEnd w:id="25"/>
+      <w:bookmarkEnd w:id="26"/>
     </w:p>
     <w:p>
       <w:pPr>
@@ -12606,12 +12348,11 @@
         <w:pStyle w:val="Heading3"/>
         <w:ind w:left="855" w:hanging="855"/>
       </w:pPr>
-      <w:bookmarkStart w:id="83" w:name="_Toc196502192"/>
-      <w:r>
-        <w:lastRenderedPageBreak/>
+      <w:bookmarkStart w:id="27" w:name="_Toc196502192"/>
+      <w:r>
         <w:t>Use case 10 - VTS requests route from vessel</w:t>
       </w:r>
-      <w:bookmarkEnd w:id="83"/>
+      <w:bookmarkEnd w:id="27"/>
       <w:r>
         <w:t xml:space="preserve"> </w:t>
       </w:r>
@@ -12630,24 +12371,15 @@
       <w:r>
         <w:t xml:space="preserve">VTS requests route from vessel for situational awareness and/or traffic management. This is typically caused by the vessel neglecting to share the route </w:t>
       </w:r>
-      <w:del w:id="84" w:author="Ramin Miraftabi" w:date="2025-09-24T10:07:00Z" w16du:dateUtc="2025-09-24T08:07:00Z">
-        <w:r>
-          <w:delText>before the voyage has started with all necessary parties</w:delText>
-        </w:r>
-      </w:del>
-      <w:ins w:id="85" w:author="Ramin Miraftabi" w:date="2025-09-24T10:07:00Z" w16du:dateUtc="2025-09-24T08:07:00Z">
-        <w:r>
-          <w:t>with the VTS</w:t>
-        </w:r>
-      </w:ins>
+      <w:r>
+        <w:t>with the VTS</w:t>
+      </w:r>
       <w:r>
         <w:t>.</w:t>
       </w:r>
-      <w:ins w:id="86" w:author="Ramin Miraftabi" w:date="2025-09-23T11:47:00Z" w16du:dateUtc="2025-09-23T09:47:00Z">
-        <w:r>
-          <w:t xml:space="preserve"> Support for this use case is optional for the vessel.</w:t>
-        </w:r>
-      </w:ins>
+      <w:r>
+        <w:t xml:space="preserve"> Support for this use case is optional for the vessel.</w:t>
+      </w:r>
     </w:p>
     <w:p>
       <w:pPr>
@@ -12719,6 +12451,7 @@
         <w:ind w:left="709" w:hanging="349"/>
       </w:pPr>
       <w:r>
+        <w:lastRenderedPageBreak/>
         <w:t>Vessel</w:t>
       </w:r>
       <w:r>
@@ -12827,24 +12560,28 @@
         <w:rPr>
           <w:lang w:val="en-US"/>
         </w:rPr>
-        <w:t xml:space="preserve"> status as </w:t>
-      </w:r>
-      <w:del w:id="87" w:author="Ramin Miraftabi" w:date="2025-09-22T14:08:00Z" w16du:dateUtc="2025-09-22T12:08:00Z">
-        <w:r>
-          <w:rPr>
-            <w:lang w:val="en-US"/>
-          </w:rPr>
-          <w:delText>acknowledged</w:delText>
-        </w:r>
-      </w:del>
-      <w:ins w:id="88" w:author="Ramin Miraftabi" w:date="2025-09-22T14:08:00Z" w16du:dateUtc="2025-09-22T12:08:00Z">
-        <w:r>
-          <w:rPr>
-            <w:lang w:val="en-US"/>
-          </w:rPr>
-          <w:t>”Checked”</w:t>
-        </w:r>
-      </w:ins>
+        <w:t xml:space="preserve"> status </w:t>
+      </w:r>
+      <w:proofErr w:type="gramStart"/>
+      <w:r>
+        <w:rPr>
+          <w:lang w:val="en-US"/>
+        </w:rPr>
+        <w:t xml:space="preserve">as </w:t>
+      </w:r>
+      <w:r>
+        <w:rPr>
+          <w:lang w:val="en-US"/>
+        </w:rPr>
+        <w:t>”Checked</w:t>
+      </w:r>
+      <w:proofErr w:type="gramEnd"/>
+      <w:r>
+        <w:rPr>
+          <w:lang w:val="en-US"/>
+        </w:rPr>
+        <w:t>”</w:t>
+      </w:r>
     </w:p>
     <w:p>
       <w:pPr>
@@ -12883,14 +12620,14 @@
           <w:lang w:val="en-US"/>
         </w:rPr>
       </w:pPr>
-      <w:bookmarkStart w:id="89" w:name="_Toc196502193"/>
+      <w:bookmarkStart w:id="28" w:name="_Toc196502193"/>
       <w:r>
         <w:rPr>
           <w:lang w:val="en-US"/>
         </w:rPr>
         <w:t>Use Case 11 – Route exchange with the use of automated services</w:t>
       </w:r>
-      <w:bookmarkEnd w:id="89"/>
+      <w:bookmarkEnd w:id="28"/>
     </w:p>
     <w:p>
       <w:pPr>
@@ -13056,12 +12793,11 @@
         <w:pStyle w:val="Heading3"/>
         <w:ind w:left="855" w:hanging="855"/>
       </w:pPr>
-      <w:bookmarkStart w:id="90" w:name="_Toc196502194"/>
-      <w:r>
-        <w:lastRenderedPageBreak/>
+      <w:bookmarkStart w:id="29" w:name="_Toc196502194"/>
+      <w:r>
         <w:t>Use Case 12 – Update route status from planning to monitoring</w:t>
       </w:r>
-      <w:bookmarkEnd w:id="90"/>
+      <w:bookmarkEnd w:id="29"/>
     </w:p>
     <w:p>
       <w:pPr>
@@ -13110,6 +12846,7 @@
           <w:i/>
           <w:iCs/>
         </w:rPr>
+        <w:lastRenderedPageBreak/>
         <w:t>Typical sequence</w:t>
       </w:r>
       <w:r>
@@ -13197,19 +12934,12 @@
       <w:r>
         <w:t xml:space="preserve">VTS system checks to see that route is identical to latest </w:t>
       </w:r>
-      <w:del w:id="91" w:author="Ramin Miraftabi" w:date="2025-09-22T14:08:00Z" w16du:dateUtc="2025-09-22T12:08:00Z">
-        <w:r>
-          <w:delText xml:space="preserve">acknowledged </w:delText>
-        </w:r>
-      </w:del>
-      <w:ins w:id="92" w:author="Ramin Miraftabi" w:date="2025-09-22T14:08:00Z" w16du:dateUtc="2025-09-22T12:08:00Z">
-        <w:r>
-          <w:t>checked</w:t>
-        </w:r>
-        <w:r>
-          <w:t xml:space="preserve"> </w:t>
-        </w:r>
-      </w:ins>
+      <w:r>
+        <w:t>checked</w:t>
+      </w:r>
+      <w:r>
+        <w:t xml:space="preserve"> </w:t>
+      </w:r>
       <w:r>
         <w:t xml:space="preserve">route. </w:t>
       </w:r>
@@ -13268,11 +12998,11 @@
       <w:pPr>
         <w:pStyle w:val="Heading3"/>
       </w:pPr>
-      <w:bookmarkStart w:id="93" w:name="_Toc196502195"/>
+      <w:bookmarkStart w:id="30" w:name="_Toc196502195"/>
       <w:r>
         <w:t>Use Case 13 – Route retrieval from VTS route library</w:t>
       </w:r>
-      <w:bookmarkEnd w:id="93"/>
+      <w:bookmarkEnd w:id="30"/>
     </w:p>
     <w:p>
       <w:pPr>
@@ -13362,37 +13092,33 @@
       <w:r>
         <w:t xml:space="preserve"> of the location</w:t>
       </w:r>
-      <w:ins w:id="94" w:author="Ramin Miraftabi" w:date="2025-09-24T10:10:00Z" w16du:dateUtc="2025-09-24T08:10:00Z">
-        <w:r>
-          <w:t>. The UN/</w:t>
-        </w:r>
-        <w:proofErr w:type="spellStart"/>
-        <w:r>
-          <w:t>Locode</w:t>
-        </w:r>
-      </w:ins>
+      <w:r>
+        <w:t>. The UN/</w:t>
+      </w:r>
+      <w:proofErr w:type="spellStart"/>
+      <w:r>
+        <w:t>Locode</w:t>
+      </w:r>
       <w:proofErr w:type="spellEnd"/>
-      <w:ins w:id="95" w:author="Ramin Miraftabi" w:date="2025-09-24T10:11:00Z" w16du:dateUtc="2025-09-24T08:11:00Z">
-        <w:r>
-          <w:t xml:space="preserve"> parameter may also be the first two characters of the UN/</w:t>
-        </w:r>
-        <w:proofErr w:type="spellStart"/>
-        <w:r>
-          <w:t>Locode</w:t>
-        </w:r>
-        <w:proofErr w:type="spellEnd"/>
-        <w:r>
-          <w:t xml:space="preserve"> (e.g. FI) to search for all UN/</w:t>
-        </w:r>
-        <w:proofErr w:type="spellStart"/>
-        <w:r>
-          <w:t>Locodes</w:t>
-        </w:r>
-        <w:proofErr w:type="spellEnd"/>
-        <w:r>
-          <w:t xml:space="preserve"> in that country.</w:t>
-        </w:r>
-      </w:ins>
+      <w:r>
+        <w:t xml:space="preserve"> parameter may also be the first two characters of the UN/</w:t>
+      </w:r>
+      <w:proofErr w:type="spellStart"/>
+      <w:r>
+        <w:t>Locode</w:t>
+      </w:r>
+      <w:proofErr w:type="spellEnd"/>
+      <w:r>
+        <w:t xml:space="preserve"> (e.g. FI) to search for all UN/</w:t>
+      </w:r>
+      <w:proofErr w:type="spellStart"/>
+      <w:r>
+        <w:t>Locodes</w:t>
+      </w:r>
+      <w:proofErr w:type="spellEnd"/>
+      <w:r>
+        <w:t xml:space="preserve"> in that country.</w:t>
+      </w:r>
     </w:p>
     <w:p>
       <w:pPr>
@@ -13432,14 +13158,14 @@
       <w:pPr>
         <w:pStyle w:val="Heading3"/>
       </w:pPr>
-      <w:bookmarkStart w:id="96" w:name="_Toc196502196"/>
+      <w:bookmarkStart w:id="31" w:name="_Toc196502196"/>
       <w:r>
         <w:t xml:space="preserve">Use case 14 </w:t>
       </w:r>
       <w:r>
         <w:t>– Vessel can discover compatible route services</w:t>
       </w:r>
-      <w:bookmarkEnd w:id="96"/>
+      <w:bookmarkEnd w:id="31"/>
     </w:p>
     <w:p>
       <w:pPr>
@@ -13465,7 +13191,6 @@
           <w:i/>
           <w:iCs/>
         </w:rPr>
-        <w:lastRenderedPageBreak/>
         <w:t>Typical sequence</w:t>
       </w:r>
       <w:r>
@@ -13508,20 +13233,8 @@
         <w:ind w:left="709" w:hanging="349"/>
       </w:pPr>
       <w:r>
-        <w:t xml:space="preserve">During planning the ship system regularly checks that it has the service endpoints of all </w:t>
-      </w:r>
-      <w:proofErr w:type="gramStart"/>
-      <w:r>
-        <w:t>com</w:t>
-      </w:r>
-      <w:proofErr w:type="gramEnd"/>
-      <w:del w:id="97" w:author="Ramin Miraftabi" w:date="2025-09-25T11:10:00Z" w16du:dateUtc="2025-09-25T09:10:00Z">
-        <w:r>
-          <w:delText>-</w:delText>
-        </w:r>
-      </w:del>
-      <w:r>
-        <w:t>patible route exchange services that cover the area of the route. If parts of the route are not covered by any route exchange service, the ship system must search for route exchange ser-vices from the MSR.</w:t>
+        <w:lastRenderedPageBreak/>
+        <w:t>During planning the ship system regularly checks that it has the service endpoints of all compatible route exchange services that cover the area of the route. If parts of the route are not covered by any route exchange service, the ship system must search for route exchange ser-vices from the MSR.</w:t>
       </w:r>
     </w:p>
     <w:p>
@@ -13542,11 +13255,11 @@
         <w:pStyle w:val="Heading3"/>
         <w:ind w:left="855" w:hanging="855"/>
       </w:pPr>
-      <w:bookmarkStart w:id="98" w:name="_Toc196502197"/>
+      <w:bookmarkStart w:id="32" w:name="_Toc196502197"/>
       <w:r>
         <w:t>Use Case 15 – VTS requests route after it has been shared</w:t>
       </w:r>
-      <w:bookmarkEnd w:id="98"/>
+      <w:bookmarkEnd w:id="32"/>
     </w:p>
     <w:p>
       <w:pPr>
@@ -13565,11 +13278,9 @@
       <w:r>
         <w:t>VTS requests route from vessel for situational awareness and/or traffic management after the route has already been shared by vessel to VTS. This is typically caused by vessel not sending the vessel changes and VTS requiring an updated route.</w:t>
       </w:r>
-      <w:ins w:id="99" w:author="Ramin Miraftabi" w:date="2025-09-23T11:46:00Z" w16du:dateUtc="2025-09-23T09:46:00Z">
-        <w:r>
-          <w:t xml:space="preserve"> Supporting this use case is optional for the vessel.</w:t>
-        </w:r>
-      </w:ins>
+      <w:r>
+        <w:t xml:space="preserve"> Supporting this use case is optional for the vessel.</w:t>
+      </w:r>
     </w:p>
     <w:p>
       <w:pPr>
@@ -13684,11 +13395,11 @@
       <w:pPr>
         <w:pStyle w:val="Heading2"/>
       </w:pPr>
-      <w:bookmarkStart w:id="100" w:name="_Toc196502198"/>
+      <w:bookmarkStart w:id="33" w:name="_Toc196502198"/>
       <w:r>
         <w:t>Data flows</w:t>
       </w:r>
-      <w:bookmarkEnd w:id="100"/>
+      <w:bookmarkEnd w:id="33"/>
     </w:p>
     <w:p>
       <w:pPr>
@@ -13769,7 +13480,7 @@
       <w:pPr>
         <w:pStyle w:val="Caption"/>
       </w:pPr>
-      <w:bookmarkStart w:id="101" w:name="_Toc196500261"/>
+      <w:bookmarkStart w:id="34" w:name="_Toc196500261"/>
       <w:r>
         <w:t xml:space="preserve">Figure </w:t>
       </w:r>
@@ -13784,7 +13495,7 @@
       <w:r>
         <w:t xml:space="preserve"> Route Exchange Business Process</w:t>
       </w:r>
-      <w:bookmarkEnd w:id="101"/>
+      <w:bookmarkEnd w:id="34"/>
     </w:p>
     <w:p>
       <w:pPr>
@@ -13793,7 +13504,7 @@
           <w:lang w:val="en-US"/>
         </w:rPr>
       </w:pPr>
-      <w:bookmarkStart w:id="102" w:name="_Toc196502199"/>
+      <w:bookmarkStart w:id="35" w:name="_Toc196502199"/>
       <w:r>
         <w:rPr>
           <w:lang w:val="en-US"/>
@@ -13813,7 +13524,7 @@
         </w:rPr>
         <w:t>l and non-functional requirements</w:t>
       </w:r>
-      <w:bookmarkEnd w:id="102"/>
+      <w:bookmarkEnd w:id="35"/>
     </w:p>
     <w:p>
       <w:pPr>
@@ -13830,16 +13541,16 @@
           <w:lang w:val="en-US"/>
         </w:rPr>
       </w:pPr>
-      <w:bookmarkStart w:id="103" w:name="_Ref196500691"/>
-      <w:bookmarkStart w:id="104" w:name="_Toc196502200"/>
+      <w:bookmarkStart w:id="36" w:name="_Ref196500691"/>
+      <w:bookmarkStart w:id="37" w:name="_Toc196502200"/>
       <w:r>
         <w:rPr>
           <w:lang w:val="en-US"/>
         </w:rPr>
         <w:t>Functional requirements</w:t>
       </w:r>
-      <w:bookmarkEnd w:id="103"/>
-      <w:bookmarkEnd w:id="104"/>
+      <w:bookmarkEnd w:id="36"/>
+      <w:bookmarkEnd w:id="37"/>
     </w:p>
     <w:tbl>
       <w:tblPr>
@@ -15051,11 +14762,9 @@
             <w:r>
               <w:t>Service must be able to request the route or updates to the route from vessel automatically</w:t>
             </w:r>
-            <w:ins w:id="105" w:author="Ramin Miraftabi" w:date="2025-09-23T11:47:00Z" w16du:dateUtc="2025-09-23T09:47:00Z">
-              <w:r>
-                <w:t>.</w:t>
-              </w:r>
-            </w:ins>
+            <w:r>
+              <w:t>.</w:t>
+            </w:r>
           </w:p>
         </w:tc>
       </w:tr>
@@ -15101,18 +14810,13 @@
                 <w:numId w:val="0"/>
               </w:numPr>
               <w:spacing w:line="240" w:lineRule="auto"/>
-              <w:rPr>
-                <w:ins w:id="106" w:author="Ramin Miraftabi" w:date="2025-09-22T14:41:00Z" w16du:dateUtc="2025-09-22T12:41:00Z"/>
-              </w:rPr>
             </w:pPr>
             <w:r>
               <w:t>The service must be able to request the full route</w:t>
             </w:r>
-            <w:ins w:id="107" w:author="Ramin Miraftabi" w:date="2025-09-22T14:41:00Z" w16du:dateUtc="2025-09-22T12:41:00Z">
-              <w:r>
-                <w:t>.</w:t>
-              </w:r>
-            </w:ins>
+            <w:r>
+              <w:t>.</w:t>
+            </w:r>
           </w:p>
           <w:p>
             <w:pPr>
@@ -15123,24 +14827,12 @@
               </w:numPr>
               <w:spacing w:line="240" w:lineRule="auto"/>
             </w:pPr>
-            <w:ins w:id="108" w:author="Ramin Miraftabi" w:date="2025-09-22T14:41:00Z" w16du:dateUtc="2025-09-22T12:41:00Z">
-              <w:r>
-                <w:t xml:space="preserve">The service must be able to request </w:t>
-              </w:r>
-            </w:ins>
-            <w:del w:id="109" w:author="Ramin Miraftabi" w:date="2025-09-22T14:41:00Z" w16du:dateUtc="2025-09-22T12:41:00Z">
-              <w:r>
-                <w:delText xml:space="preserve"> or </w:delText>
-              </w:r>
-            </w:del>
+            <w:r>
+              <w:t xml:space="preserve">The service must be able to request </w:t>
+            </w:r>
             <w:r>
               <w:t xml:space="preserve">updates to the route when it changes. </w:t>
             </w:r>
-            <w:del w:id="110" w:author="Ramin Miraftabi" w:date="2025-09-22T14:43:00Z" w16du:dateUtc="2025-09-22T12:43:00Z">
-              <w:r>
-                <w:delText xml:space="preserve">It may request to receive updates only when the change affects the VTS’ area of interest. </w:delText>
-              </w:r>
-            </w:del>
           </w:p>
           <w:p>
             <w:pPr>
@@ -15150,31 +14842,19 @@
                 <w:numId w:val="0"/>
               </w:numPr>
               <w:spacing w:line="240" w:lineRule="auto"/>
-              <w:rPr>
-                <w:ins w:id="111" w:author="Ramin Miraftabi" w:date="2025-09-23T17:14:00Z" w16du:dateUtc="2025-09-23T15:14:00Z"/>
-              </w:rPr>
             </w:pPr>
             <w:r>
               <w:t xml:space="preserve">This means that the ship system </w:t>
             </w:r>
-            <w:del w:id="112" w:author="Ramin Miraftabi" w:date="2025-09-22T14:43:00Z" w16du:dateUtc="2025-09-22T12:43:00Z">
-              <w:r>
-                <w:delText xml:space="preserve">must </w:delText>
-              </w:r>
-            </w:del>
-            <w:ins w:id="113" w:author="Ramin Miraftabi" w:date="2025-09-22T14:43:00Z" w16du:dateUtc="2025-09-22T12:43:00Z">
-              <w:r>
-                <w:t xml:space="preserve">can </w:t>
-              </w:r>
-            </w:ins>
+            <w:r>
+              <w:t xml:space="preserve">can </w:t>
+            </w:r>
             <w:r>
               <w:t>have the ability to send the route when requested</w:t>
             </w:r>
-            <w:ins w:id="114" w:author="Ramin Miraftabi" w:date="2025-09-22T14:43:00Z" w16du:dateUtc="2025-09-22T12:43:00Z">
-              <w:r>
-                <w:t xml:space="preserve">. </w:t>
-              </w:r>
-            </w:ins>
+            <w:r>
+              <w:t xml:space="preserve">. </w:t>
+            </w:r>
           </w:p>
           <w:p>
             <w:pPr>
@@ -15185,29 +14865,12 @@
               </w:numPr>
               <w:spacing w:line="240" w:lineRule="auto"/>
             </w:pPr>
-            <w:ins w:id="115" w:author="Ramin Miraftabi" w:date="2025-09-22T14:43:00Z" w16du:dateUtc="2025-09-22T12:43:00Z">
-              <w:r>
-                <w:t>The ship must have the ability to send</w:t>
-              </w:r>
-            </w:ins>
-            <w:del w:id="116" w:author="Ramin Miraftabi" w:date="2025-09-22T14:43:00Z" w16du:dateUtc="2025-09-22T12:43:00Z">
-              <w:r>
-                <w:delText xml:space="preserve"> </w:delText>
-              </w:r>
-            </w:del>
-            <w:del w:id="117" w:author="Ramin Miraftabi" w:date="2025-09-22T14:44:00Z" w16du:dateUtc="2025-09-22T12:44:00Z">
-              <w:r>
-                <w:delText>or</w:delText>
-              </w:r>
-            </w:del>
+            <w:r>
+              <w:t>The ship must have the ability to send</w:t>
+            </w:r>
             <w:r>
               <w:t xml:space="preserve"> updates to the service when the route changes. </w:t>
             </w:r>
-            <w:del w:id="118" w:author="Ramin Miraftabi" w:date="2025-09-22T14:44:00Z" w16du:dateUtc="2025-09-22T12:44:00Z">
-              <w:r>
-                <w:delText>The ship system must be able to send the updates only when the change affects the area of interest of the service.</w:delText>
-              </w:r>
-            </w:del>
           </w:p>
         </w:tc>
       </w:tr>
@@ -15257,24 +14920,12 @@
             <w:r>
               <w:t xml:space="preserve"> </w:t>
             </w:r>
-            <w:del w:id="119" w:author="Ramin Miraftabi" w:date="2025-09-23T11:48:00Z" w16du:dateUtc="2025-09-23T09:48:00Z">
-              <w:r>
-                <w:delText>This is another core requirement of the service.</w:delText>
-              </w:r>
-            </w:del>
-            <w:ins w:id="120" w:author="Ramin Miraftabi" w:date="2025-09-23T11:48:00Z" w16du:dateUtc="2025-09-23T09:48:00Z">
-              <w:r>
-                <w:t xml:space="preserve">Due to complexity, this is optional to support on the vessel side but support in the service is required so that vessels that do support this functionality </w:t>
-              </w:r>
-              <w:r>
-                <w:t>can rece</w:t>
-              </w:r>
-            </w:ins>
-            <w:ins w:id="121" w:author="Ramin Miraftabi" w:date="2025-09-23T11:49:00Z" w16du:dateUtc="2025-09-23T09:49:00Z">
-              <w:r>
-                <w:t>ive better service.</w:t>
-              </w:r>
-            </w:ins>
+            <w:r>
+              <w:t xml:space="preserve">Due to complexity, this is optional to support on the vessel side but support in the service is required so that vessels that do support this functionality </w:t>
+            </w:r>
+            <w:r>
+              <w:t>can receive better service.</w:t>
+            </w:r>
           </w:p>
         </w:tc>
       </w:tr>
@@ -15627,7 +15278,7 @@
                 <w:color w:val="00558C"/>
               </w:rPr>
             </w:pPr>
-            <w:bookmarkStart w:id="122" w:name="_Hlk196459993"/>
+            <w:bookmarkStart w:id="38" w:name="_Hlk196459993"/>
             <w:r>
               <w:rPr>
                 <w:b/>
@@ -15817,17 +15468,15 @@
             <w:r>
               <w:t>All waypoints except the first and last waypoint must have a non-zero turn radius</w:t>
             </w:r>
-            <w:ins w:id="123" w:author="Ramin Miraftabi" w:date="2025-09-22T12:44:00Z" w16du:dateUtc="2025-09-22T10:44:00Z">
-              <w:r>
-                <w:t xml:space="preserve"> or have </w:t>
-              </w:r>
-              <w:r>
-                <w:t>both ETA and ETD defined and ETD must be later than ETA</w:t>
-              </w:r>
-              <w:r>
-                <w:t>.</w:t>
-              </w:r>
-            </w:ins>
+            <w:r>
+              <w:t xml:space="preserve"> or have </w:t>
+            </w:r>
+            <w:r>
+              <w:t>both ETA and ETD defined and ETD must be later than ETA</w:t>
+            </w:r>
+            <w:r>
+              <w:t>.</w:t>
+            </w:r>
           </w:p>
           <w:p>
             <w:pPr>
@@ -15858,16 +15507,9 @@
             <w:r>
               <w:t xml:space="preserve">All legs must have both port and starboard </w:t>
             </w:r>
-            <w:del w:id="124" w:author="Ramin Miraftabi" w:date="2025-09-22T12:45:00Z" w16du:dateUtc="2025-09-22T10:45:00Z">
-              <w:r>
-                <w:delText>XDT</w:delText>
-              </w:r>
-            </w:del>
-            <w:ins w:id="125" w:author="Ramin Miraftabi" w:date="2025-09-22T12:45:00Z" w16du:dateUtc="2025-09-22T10:45:00Z">
-              <w:r>
-                <w:t>C</w:t>
-              </w:r>
-            </w:ins>
+            <w:r>
+              <w:t>C</w:t>
+            </w:r>
             <w:r>
               <w:t>L defined</w:t>
             </w:r>
@@ -15886,11 +15528,9 @@
               <w:t>routeWaypointLegDraft</w:t>
             </w:r>
             <w:proofErr w:type="spellEnd"/>
-            <w:ins w:id="126" w:author="Ramin Miraftabi" w:date="2025-09-23T16:15:00Z" w16du:dateUtc="2025-09-23T14:15:00Z">
-              <w:r>
-                <w:t xml:space="preserve"> </w:t>
-              </w:r>
-            </w:ins>
+            <w:r>
+              <w:t xml:space="preserve"> </w:t>
+            </w:r>
             <w:r>
               <w:t>defined</w:t>
             </w:r>
@@ -16085,7 +15725,7 @@
           </w:p>
         </w:tc>
       </w:tr>
-      <w:bookmarkEnd w:id="122"/>
+      <w:bookmarkEnd w:id="38"/>
     </w:tbl>
     <w:p>
       <w:pPr>
@@ -16342,34 +15982,20 @@
             <w:r>
               <w:t xml:space="preserve"> must be populated and the content should </w:t>
             </w:r>
-            <w:ins w:id="127" w:author="Ramin Miraftabi" w:date="2025-09-22T14:02:00Z" w16du:dateUtc="2025-09-22T12:02:00Z">
-              <w:r>
-                <w:t>in</w:t>
-              </w:r>
-            </w:ins>
-            <w:ins w:id="128" w:author="Ramin Miraftabi" w:date="2025-09-22T14:03:00Z" w16du:dateUtc="2025-09-22T12:03:00Z">
-              <w:r>
-                <w:t xml:space="preserve">clude the </w:t>
-              </w:r>
-            </w:ins>
-            <w:ins w:id="129" w:author="Ramin Miraftabi" w:date="2025-09-23T16:37:00Z" w16du:dateUtc="2025-09-23T14:37:00Z">
-              <w:r>
-                <w:t xml:space="preserve">VTS </w:t>
-              </w:r>
-            </w:ins>
-            <w:ins w:id="130" w:author="Ramin Miraftabi" w:date="2025-09-22T14:04:00Z" w16du:dateUtc="2025-09-22T12:04:00Z">
-              <w:r>
-                <w:t xml:space="preserve">organization </w:t>
-              </w:r>
-            </w:ins>
-            <w:del w:id="131" w:author="Ramin Miraftabi" w:date="2025-09-22T14:05:00Z" w16du:dateUtc="2025-09-22T12:05:00Z">
-              <w:r>
-                <w:delText>be an understandable and traceable identification of the author</w:delText>
-              </w:r>
-            </w:del>
+            <w:r>
+              <w:t xml:space="preserve">include the </w:t>
+            </w:r>
+            <w:r>
+              <w:t xml:space="preserve">VTS </w:t>
+            </w:r>
+            <w:proofErr w:type="gramStart"/>
+            <w:r>
+              <w:t xml:space="preserve">organization </w:t>
+            </w:r>
             <w:r>
               <w:t>.</w:t>
             </w:r>
+            <w:proofErr w:type="gramEnd"/>
           </w:p>
           <w:p>
             <w:pPr>
@@ -16422,9 +16048,6 @@
               <w:pStyle w:val="Bullet1"/>
               <w:spacing w:before="0"/>
               <w:ind w:left="1080" w:hanging="360"/>
-              <w:rPr>
-                <w:ins w:id="132" w:author="Ramin Miraftabi" w:date="2025-09-22T14:05:00Z" w16du:dateUtc="2025-09-22T12:05:00Z"/>
-              </w:rPr>
             </w:pPr>
             <w:r>
               <w:t>Waypoints added or changed by VTS may leave out the schedule element.</w:t>
@@ -16436,37 +16059,31 @@
               <w:spacing w:before="0"/>
               <w:ind w:left="1080" w:hanging="360"/>
             </w:pPr>
-            <w:ins w:id="133" w:author="Ramin Miraftabi" w:date="2025-09-22T14:06:00Z" w16du:dateUtc="2025-09-22T12:06:00Z">
-              <w:r>
-                <w:t xml:space="preserve">If </w:t>
-              </w:r>
-              <w:proofErr w:type="spellStart"/>
-              <w:r>
-                <w:t>routeActionPointExternalReference</w:t>
-              </w:r>
-              <w:proofErr w:type="spellEnd"/>
-              <w:r>
-                <w:t xml:space="preserve"> or </w:t>
-              </w:r>
-              <w:proofErr w:type="spellStart"/>
-              <w:r>
-                <w:t>routeWaypointExternalReference</w:t>
-              </w:r>
-              <w:proofErr w:type="spellEnd"/>
-              <w:r>
-                <w:t xml:space="preserve"> is included, it must be </w:t>
-              </w:r>
-            </w:ins>
-            <w:ins w:id="134" w:author="Ramin Miraftabi" w:date="2025-09-24T10:18:00Z" w16du:dateUtc="2025-09-24T08:18:00Z">
-              <w:r>
-                <w:t>an</w:t>
-              </w:r>
-            </w:ins>
-            <w:ins w:id="135" w:author="Ramin Miraftabi" w:date="2025-09-22T14:06:00Z" w16du:dateUtc="2025-09-22T12:06:00Z">
-              <w:r>
-                <w:t xml:space="preserve"> MRN.</w:t>
-              </w:r>
-            </w:ins>
+            <w:r>
+              <w:t xml:space="preserve">If </w:t>
+            </w:r>
+            <w:proofErr w:type="spellStart"/>
+            <w:r>
+              <w:t>routeActionPointExternalReference</w:t>
+            </w:r>
+            <w:proofErr w:type="spellEnd"/>
+            <w:r>
+              <w:t xml:space="preserve"> or </w:t>
+            </w:r>
+            <w:proofErr w:type="spellStart"/>
+            <w:r>
+              <w:t>routeWaypointExternalReference</w:t>
+            </w:r>
+            <w:proofErr w:type="spellEnd"/>
+            <w:r>
+              <w:t xml:space="preserve"> is included, it must be </w:t>
+            </w:r>
+            <w:r>
+              <w:t>an</w:t>
+            </w:r>
+            <w:r>
+              <w:t xml:space="preserve"> MRN.</w:t>
+            </w:r>
           </w:p>
         </w:tc>
       </w:tr>
@@ -16611,7 +16228,7 @@
                 <w:color w:val="00558C"/>
               </w:rPr>
             </w:pPr>
-            <w:bookmarkStart w:id="136" w:name="_Hlk196460357"/>
+            <w:bookmarkStart w:id="39" w:name="_Hlk196460357"/>
             <w:r>
               <w:rPr>
                 <w:b/>
@@ -16771,9 +16388,6 @@
                 <w:numId w:val="0"/>
               </w:numPr>
               <w:spacing w:line="240" w:lineRule="auto"/>
-              <w:rPr>
-                <w:ins w:id="137" w:author="Ramin Miraftabi" w:date="2025-09-24T10:37:00Z" w16du:dateUtc="2025-09-24T08:37:00Z"/>
-              </w:rPr>
             </w:pPr>
             <w:r>
               <w:t xml:space="preserve">A consumer must have a valid maritime identity. </w:t>
@@ -16911,7 +16525,7 @@
           </w:p>
         </w:tc>
       </w:tr>
-      <w:bookmarkEnd w:id="136"/>
+      <w:bookmarkEnd w:id="39"/>
     </w:tbl>
     <w:p>
       <w:pPr>
@@ -17281,7 +16895,7 @@
                 <w:color w:val="00558C"/>
               </w:rPr>
             </w:pPr>
-            <w:bookmarkStart w:id="138" w:name="_Hlk196460583"/>
+            <w:bookmarkStart w:id="40" w:name="_Hlk196460583"/>
             <w:r>
               <w:rPr>
                 <w:b/>
@@ -17526,107 +17140,49 @@
               </w:numPr>
               <w:spacing w:line="240" w:lineRule="auto"/>
             </w:pPr>
+            <w:r>
+              <w:t>Depending o</w:t>
+            </w:r>
+            <w:r>
+              <w:t>n</w:t>
+            </w:r>
+            <w:r>
+              <w:t xml:space="preserve"> </w:t>
+            </w:r>
+            <w:r>
+              <w:t xml:space="preserve">the type of reference route and </w:t>
+            </w:r>
+            <w:r>
+              <w:t xml:space="preserve">local </w:t>
+            </w:r>
+            <w:r>
+              <w:t>conditions other attributes and elements may be required</w:t>
+            </w:r>
+            <w:r>
+              <w:t>. T</w:t>
+            </w:r>
+            <w:r>
+              <w:t xml:space="preserve">he </w:t>
+            </w:r>
+            <w:r>
+              <w:t xml:space="preserve">list </w:t>
+            </w:r>
+            <w:r>
+              <w:t xml:space="preserve">above serves as the baseline for all reference routes. A reference route </w:t>
+            </w:r>
             <w:proofErr w:type="gramStart"/>
             <w:r>
-              <w:t>Depending</w:t>
+              <w:t>b</w:t>
+            </w:r>
+            <w:r>
+              <w:t>y</w:t>
+            </w:r>
+            <w:r>
+              <w:t xml:space="preserve"> definition will</w:t>
             </w:r>
             <w:proofErr w:type="gramEnd"/>
             <w:r>
-              <w:t xml:space="preserve"> o</w:t>
-            </w:r>
-            <w:del w:id="139" w:author="Ramin Miraftabi" w:date="2025-09-24T10:19:00Z" w16du:dateUtc="2025-09-24T08:19:00Z">
-              <w:r>
-                <w:delText>f</w:delText>
-              </w:r>
-            </w:del>
-            <w:ins w:id="140" w:author="Ramin Miraftabi" w:date="2025-09-23T11:49:00Z" w16du:dateUtc="2025-09-23T09:49:00Z">
-              <w:r>
-                <w:t>n</w:t>
-              </w:r>
-            </w:ins>
-            <w:ins w:id="141" w:author="Ramin Miraftabi" w:date="2025-09-24T10:19:00Z" w16du:dateUtc="2025-09-24T08:19:00Z">
-              <w:r>
-                <w:t xml:space="preserve"> </w:t>
-              </w:r>
-            </w:ins>
-            <w:del w:id="142" w:author="Ramin Miraftabi" w:date="2025-09-23T11:49:00Z" w16du:dateUtc="2025-09-23T09:49:00Z">
-              <w:r>
-                <w:delText xml:space="preserve"> </w:delText>
-              </w:r>
-            </w:del>
-            <w:r>
-              <w:t xml:space="preserve">the type of reference route and </w:t>
-            </w:r>
-            <w:ins w:id="143" w:author="Ramin Miraftabi" w:date="2025-09-23T11:49:00Z" w16du:dateUtc="2025-09-23T09:49:00Z">
-              <w:r>
-                <w:t>lo</w:t>
-              </w:r>
-            </w:ins>
-            <w:ins w:id="144" w:author="Ramin Miraftabi" w:date="2025-09-23T11:50:00Z" w16du:dateUtc="2025-09-23T09:50:00Z">
-              <w:r>
-                <w:t xml:space="preserve">cal </w:t>
-              </w:r>
-            </w:ins>
-            <w:r>
-              <w:t>conditions other attributes and elements may be required</w:t>
-            </w:r>
-            <w:del w:id="145" w:author="Ramin Miraftabi" w:date="2025-09-24T10:20:00Z" w16du:dateUtc="2025-09-24T08:20:00Z">
-              <w:r>
-                <w:delText>, but t</w:delText>
-              </w:r>
-            </w:del>
-            <w:ins w:id="146" w:author="Ramin Miraftabi" w:date="2025-09-24T10:20:00Z" w16du:dateUtc="2025-09-24T08:20:00Z">
-              <w:r>
-                <w:t>. T</w:t>
-              </w:r>
-            </w:ins>
-            <w:r>
-              <w:t xml:space="preserve">he </w:t>
-            </w:r>
-            <w:ins w:id="147" w:author="Ramin Miraftabi" w:date="2025-09-24T10:20:00Z" w16du:dateUtc="2025-09-24T08:20:00Z">
-              <w:r>
-                <w:t xml:space="preserve">list </w:t>
-              </w:r>
-            </w:ins>
-            <w:r>
-              <w:t xml:space="preserve">above </w:t>
-            </w:r>
-            <w:del w:id="148" w:author="Ramin Miraftabi" w:date="2025-09-24T10:20:00Z" w16du:dateUtc="2025-09-24T08:20:00Z">
-              <w:r>
-                <w:delText xml:space="preserve">list </w:delText>
-              </w:r>
-            </w:del>
-            <w:r>
-              <w:t>serves as the baseline for all reference routes. A reference route b</w:t>
-            </w:r>
-            <w:ins w:id="149" w:author="Ramin Miraftabi" w:date="2025-09-23T11:50:00Z" w16du:dateUtc="2025-09-23T09:50:00Z">
-              <w:r>
-                <w:t>y</w:t>
-              </w:r>
-            </w:ins>
-            <w:del w:id="150" w:author="Ramin Miraftabi" w:date="2025-09-23T11:50:00Z" w16du:dateUtc="2025-09-23T09:50:00Z">
-              <w:r>
-                <w:delText>ut</w:delText>
-              </w:r>
-            </w:del>
-            <w:r>
-              <w:t xml:space="preserve"> definition will not have a schedule or </w:t>
-            </w:r>
-            <w:del w:id="151" w:author="Ramin Miraftabi" w:date="2025-09-24T10:20:00Z" w16du:dateUtc="2025-09-24T08:20:00Z">
-              <w:r>
-                <w:delText>m</w:delText>
-              </w:r>
-            </w:del>
-            <w:r>
-              <w:t>any other vessel dependent information</w:t>
-            </w:r>
-            <w:del w:id="152" w:author="Ramin Miraftabi" w:date="2025-09-24T10:21:00Z" w16du:dateUtc="2025-09-24T08:21:00Z">
-              <w:r>
-                <w:delText xml:space="preserve"> set</w:delText>
-              </w:r>
-            </w:del>
-            <w:r>
-              <w:t>.</w:t>
+              <w:t xml:space="preserve"> not have a schedule or any other vessel dependent information.</w:t>
             </w:r>
           </w:p>
         </w:tc>
@@ -17678,7 +17234,7 @@
           </w:p>
         </w:tc>
       </w:tr>
-      <w:bookmarkEnd w:id="138"/>
+      <w:bookmarkEnd w:id="40"/>
     </w:tbl>
     <w:p>
       <w:pPr>
@@ -17848,11 +17404,9 @@
             <w:r>
               <w:t>If VTS has requested updates to the route due to changes, vessel must send an update if the route is unloaded from ECDIS for updating</w:t>
             </w:r>
-            <w:ins w:id="153" w:author="Ramin Miraftabi" w:date="2025-09-23T17:17:00Z" w16du:dateUtc="2025-09-23T15:17:00Z">
-              <w:r>
-                <w:t xml:space="preserve"> </w:t>
-              </w:r>
-            </w:ins>
+            <w:r>
+              <w:t xml:space="preserve"> </w:t>
+            </w:r>
             <w:r>
               <w:t>before it is taken into monitoring again.</w:t>
             </w:r>
@@ -17917,16 +17471,9 @@
             <w:r>
               <w:t xml:space="preserve">The port or starboard </w:t>
             </w:r>
-            <w:del w:id="154" w:author="Ramin Miraftabi" w:date="2025-09-23T17:17:00Z" w16du:dateUtc="2025-09-23T15:17:00Z">
-              <w:r>
-                <w:delText xml:space="preserve">XDTL </w:delText>
-              </w:r>
-            </w:del>
-            <w:ins w:id="155" w:author="Ramin Miraftabi" w:date="2025-09-23T17:17:00Z" w16du:dateUtc="2025-09-23T15:17:00Z">
-              <w:r>
-                <w:t xml:space="preserve">CL </w:t>
-              </w:r>
-            </w:ins>
+            <w:r>
+              <w:t xml:space="preserve">CL </w:t>
+            </w:r>
             <w:r>
               <w:t>of a leg is changed</w:t>
             </w:r>
@@ -17979,16 +17526,9 @@
             <w:r>
               <w:t xml:space="preserve">These changes must be updated before route is moved to monitoring, i.e. normal procedure of planning must be followed and any previous status </w:t>
             </w:r>
-            <w:del w:id="156" w:author="Ramin Miraftabi" w:date="2025-09-22T14:08:00Z" w16du:dateUtc="2025-09-22T12:08:00Z">
-              <w:r>
-                <w:delText xml:space="preserve">acknowledged </w:delText>
-              </w:r>
-            </w:del>
-            <w:ins w:id="157" w:author="Ramin Miraftabi" w:date="2025-09-22T14:08:00Z" w16du:dateUtc="2025-09-22T12:08:00Z">
-              <w:r>
-                <w:t xml:space="preserve">checked </w:t>
-              </w:r>
-            </w:ins>
+            <w:r>
+              <w:t xml:space="preserve">checked </w:t>
+            </w:r>
             <w:r>
               <w:t>of the route from VTS is cleared by any of the above changes.</w:t>
             </w:r>
@@ -18015,29 +17555,18 @@
             <w:r>
               <w:t>12 hours if ETA is</w:t>
             </w:r>
-            <w:ins w:id="158" w:author="Ramin Miraftabi" w:date="2025-09-22T14:28:00Z" w16du:dateUtc="2025-09-22T12:28:00Z">
-              <w:r>
-                <w:t xml:space="preserve"> </w:t>
-              </w:r>
-            </w:ins>
-            <w:ins w:id="159" w:author="Ramin Miraftabi" w:date="2025-09-22T14:30:00Z" w16du:dateUtc="2025-09-22T12:30:00Z">
-              <w:r>
-                <w:t>over</w:t>
-              </w:r>
-            </w:ins>
-            <w:del w:id="160" w:author="Ramin Miraftabi" w:date="2025-09-22T14:28:00Z" w16du:dateUtc="2025-09-22T12:28:00Z">
-              <w:r>
-                <w:delText xml:space="preserve"> over</w:delText>
-              </w:r>
-            </w:del>
+            <w:r>
+              <w:t xml:space="preserve"> </w:t>
+            </w:r>
+            <w:r>
+              <w:t>over</w:t>
+            </w:r>
             <w:r>
               <w:t xml:space="preserve"> 168 hours away</w:t>
             </w:r>
-            <w:ins w:id="161" w:author="Ramin Miraftabi" w:date="2025-09-22T14:30:00Z" w16du:dateUtc="2025-09-22T12:30:00Z">
-              <w:r>
-                <w:t xml:space="preserve"> (t &gt;= 168)</w:t>
-              </w:r>
-            </w:ins>
+            <w:r>
+              <w:t xml:space="preserve"> (t &gt;= 168)</w:t>
+            </w:r>
           </w:p>
           <w:p>
             <w:pPr>
@@ -18048,62 +17577,39 @@
             <w:r>
               <w:t xml:space="preserve">6 hours if ETA is </w:t>
             </w:r>
-            <w:del w:id="162" w:author="Ramin Miraftabi" w:date="2025-09-22T14:28:00Z" w16du:dateUtc="2025-09-22T12:28:00Z">
-              <w:r>
-                <w:delText>over</w:delText>
-              </w:r>
-            </w:del>
-            <w:ins w:id="163" w:author="Ramin Miraftabi" w:date="2025-09-22T14:30:00Z" w16du:dateUtc="2025-09-22T12:30:00Z">
-              <w:r>
-                <w:t>between</w:t>
-              </w:r>
-            </w:ins>
+            <w:r>
+              <w:t>between</w:t>
+            </w:r>
             <w:r>
               <w:t xml:space="preserve"> 72 </w:t>
             </w:r>
-            <w:ins w:id="164" w:author="Ramin Miraftabi" w:date="2025-09-22T14:31:00Z" w16du:dateUtc="2025-09-22T12:31:00Z">
-              <w:r>
-                <w:t xml:space="preserve">and 168 </w:t>
-              </w:r>
-            </w:ins>
+            <w:r>
+              <w:t xml:space="preserve">and 168 </w:t>
+            </w:r>
             <w:r>
               <w:t>hours away</w:t>
             </w:r>
-            <w:ins w:id="165" w:author="Ramin Miraftabi" w:date="2025-09-22T14:30:00Z" w16du:dateUtc="2025-09-22T12:30:00Z">
-              <w:r>
-                <w:t xml:space="preserve"> (</w:t>
-              </w:r>
-            </w:ins>
-            <w:ins w:id="166" w:author="Ramin Miraftabi" w:date="2025-09-22T14:32:00Z" w16du:dateUtc="2025-09-22T12:32:00Z">
-              <w:r>
-                <w:t>72</w:t>
-              </w:r>
-            </w:ins>
-            <w:ins w:id="167" w:author="Ramin Miraftabi" w:date="2025-09-22T14:31:00Z" w16du:dateUtc="2025-09-22T12:31:00Z">
-              <w:r>
-                <w:t xml:space="preserve"> </w:t>
-              </w:r>
-            </w:ins>
-            <w:ins w:id="168" w:author="Ramin Miraftabi" w:date="2025-09-22T14:32:00Z" w16du:dateUtc="2025-09-22T12:32:00Z">
-              <w:r>
-                <w:t>&lt;=</w:t>
-              </w:r>
-            </w:ins>
-            <w:ins w:id="169" w:author="Ramin Miraftabi" w:date="2025-09-22T14:31:00Z" w16du:dateUtc="2025-09-22T12:31:00Z">
-              <w:r>
-                <w:t xml:space="preserve"> t </w:t>
-              </w:r>
-            </w:ins>
-            <w:ins w:id="170" w:author="Ramin Miraftabi" w:date="2025-09-22T14:32:00Z" w16du:dateUtc="2025-09-22T12:32:00Z">
-              <w:r>
-                <w:t>&lt; 168</w:t>
-              </w:r>
-            </w:ins>
-            <w:ins w:id="171" w:author="Ramin Miraftabi" w:date="2025-09-22T14:31:00Z" w16du:dateUtc="2025-09-22T12:31:00Z">
-              <w:r>
-                <w:t>)</w:t>
-              </w:r>
-            </w:ins>
+            <w:r>
+              <w:t xml:space="preserve"> (</w:t>
+            </w:r>
+            <w:r>
+              <w:t>72</w:t>
+            </w:r>
+            <w:r>
+              <w:t xml:space="preserve"> </w:t>
+            </w:r>
+            <w:r>
+              <w:t>&lt;=</w:t>
+            </w:r>
+            <w:r>
+              <w:t xml:space="preserve"> t </w:t>
+            </w:r>
+            <w:r>
+              <w:t>&lt; 168</w:t>
+            </w:r>
+            <w:r>
+              <w:t>)</w:t>
+            </w:r>
           </w:p>
           <w:p>
             <w:pPr>
@@ -18114,35 +17620,24 @@
             <w:r>
               <w:t xml:space="preserve">2 hours if ETA is </w:t>
             </w:r>
-            <w:del w:id="172" w:author="Ramin Miraftabi" w:date="2025-09-22T14:31:00Z" w16du:dateUtc="2025-09-22T12:31:00Z">
-              <w:r>
-                <w:delText xml:space="preserve">over </w:delText>
-              </w:r>
-            </w:del>
-            <w:ins w:id="173" w:author="Ramin Miraftabi" w:date="2025-09-22T14:31:00Z" w16du:dateUtc="2025-09-22T12:31:00Z">
-              <w:r>
-                <w:t xml:space="preserve">between </w:t>
-              </w:r>
-            </w:ins>
+            <w:r>
+              <w:t xml:space="preserve">between </w:t>
+            </w:r>
             <w:r>
               <w:t xml:space="preserve">24 </w:t>
             </w:r>
-            <w:ins w:id="174" w:author="Ramin Miraftabi" w:date="2025-09-22T14:32:00Z" w16du:dateUtc="2025-09-22T12:32:00Z">
-              <w:r>
-                <w:t xml:space="preserve">and 72 </w:t>
-              </w:r>
-            </w:ins>
+            <w:r>
+              <w:t xml:space="preserve">and 72 </w:t>
+            </w:r>
             <w:r>
               <w:t>hours away</w:t>
             </w:r>
-            <w:ins w:id="175" w:author="Ramin Miraftabi" w:date="2025-09-22T14:32:00Z" w16du:dateUtc="2025-09-22T12:32:00Z">
-              <w:r>
-                <w:t xml:space="preserve"> (</w:t>
-              </w:r>
-              <w:r>
-                <w:t>24 &lt;= t &lt; 72)</w:t>
-              </w:r>
-            </w:ins>
+            <w:r>
+              <w:t xml:space="preserve"> (</w:t>
+            </w:r>
+            <w:r>
+              <w:t>24 &lt;= t &lt; 72)</w:t>
+            </w:r>
           </w:p>
           <w:p>
             <w:pPr>
@@ -18153,32 +17648,21 @@
             <w:r>
               <w:t>1 hour if ETA is</w:t>
             </w:r>
-            <w:ins w:id="176" w:author="Ramin Miraftabi" w:date="2025-09-22T14:32:00Z" w16du:dateUtc="2025-09-22T12:32:00Z">
-              <w:r>
-                <w:t xml:space="preserve"> between</w:t>
-              </w:r>
-            </w:ins>
-            <w:del w:id="177" w:author="Ramin Miraftabi" w:date="2025-09-22T14:32:00Z" w16du:dateUtc="2025-09-22T12:32:00Z">
-              <w:r>
-                <w:delText xml:space="preserve"> over</w:delText>
-              </w:r>
-            </w:del>
+            <w:r>
+              <w:t xml:space="preserve"> between</w:t>
+            </w:r>
             <w:r>
               <w:t xml:space="preserve"> 12 </w:t>
             </w:r>
-            <w:ins w:id="178" w:author="Ramin Miraftabi" w:date="2025-09-22T14:32:00Z" w16du:dateUtc="2025-09-22T12:32:00Z">
-              <w:r>
-                <w:t xml:space="preserve">and 24 </w:t>
-              </w:r>
-            </w:ins>
+            <w:r>
+              <w:t xml:space="preserve">and 24 </w:t>
+            </w:r>
             <w:r>
               <w:t>hours away</w:t>
             </w:r>
-            <w:ins w:id="179" w:author="Ramin Miraftabi" w:date="2025-09-22T14:33:00Z" w16du:dateUtc="2025-09-22T12:33:00Z">
-              <w:r>
-                <w:t xml:space="preserve"> (12 &lt;= t &lt; 24)</w:t>
-              </w:r>
-            </w:ins>
+            <w:r>
+              <w:t xml:space="preserve"> (12 &lt;= t &lt; 24)</w:t>
+            </w:r>
           </w:p>
           <w:p>
             <w:pPr>
@@ -18189,32 +17673,21 @@
             <w:r>
               <w:t xml:space="preserve">30 minutes if ETA is </w:t>
             </w:r>
-            <w:del w:id="180" w:author="Ramin Miraftabi" w:date="2025-09-22T14:33:00Z" w16du:dateUtc="2025-09-22T12:33:00Z">
-              <w:r>
-                <w:delText xml:space="preserve">over </w:delText>
-              </w:r>
-            </w:del>
-            <w:ins w:id="181" w:author="Ramin Miraftabi" w:date="2025-09-22T14:33:00Z" w16du:dateUtc="2025-09-22T12:33:00Z">
-              <w:r>
-                <w:t xml:space="preserve">between </w:t>
-              </w:r>
-            </w:ins>
+            <w:r>
+              <w:t xml:space="preserve">between </w:t>
+            </w:r>
             <w:r>
               <w:t xml:space="preserve">6 </w:t>
             </w:r>
-            <w:ins w:id="182" w:author="Ramin Miraftabi" w:date="2025-09-22T14:33:00Z" w16du:dateUtc="2025-09-22T12:33:00Z">
-              <w:r>
-                <w:t xml:space="preserve">and 12 </w:t>
-              </w:r>
-            </w:ins>
+            <w:r>
+              <w:t xml:space="preserve">and 12 </w:t>
+            </w:r>
             <w:r>
               <w:t>hours away</w:t>
             </w:r>
-            <w:ins w:id="183" w:author="Ramin Miraftabi" w:date="2025-09-22T14:33:00Z" w16du:dateUtc="2025-09-22T12:33:00Z">
-              <w:r>
-                <w:t xml:space="preserve"> (6 &lt;= t &lt; 12)</w:t>
-              </w:r>
-            </w:ins>
+            <w:r>
+              <w:t xml:space="preserve"> (6 &lt;= t &lt; 12)</w:t>
+            </w:r>
           </w:p>
           <w:p>
             <w:pPr>
@@ -18298,7 +17771,6 @@
               <w:spacing w:line="240" w:lineRule="auto"/>
             </w:pPr>
             <w:r>
-              <w:lastRenderedPageBreak/>
               <w:t xml:space="preserve">Changes to significant other required parts of the route are </w:t>
             </w:r>
             <w:proofErr w:type="gramStart"/>
@@ -18830,35 +18302,15 @@
                 <w:numId w:val="0"/>
               </w:numPr>
               <w:spacing w:line="240" w:lineRule="auto"/>
-              <w:rPr>
-                <w:ins w:id="184" w:author="Ramin Miraftabi" w:date="2025-09-24T10:25:00Z" w16du:dateUtc="2025-09-24T08:25:00Z"/>
-              </w:rPr>
-            </w:pPr>
-            <w:ins w:id="185" w:author="Ramin Miraftabi" w:date="2025-09-24T10:24:00Z" w16du:dateUtc="2025-09-24T08:24:00Z">
-              <w:r>
-                <w:t xml:space="preserve">The </w:t>
-              </w:r>
-            </w:ins>
-            <w:ins w:id="186" w:author="Ramin Miraftabi" w:date="2025-09-24T10:25:00Z" w16du:dateUtc="2025-09-24T08:25:00Z">
-              <w:r>
-                <w:t>s</w:t>
-              </w:r>
-            </w:ins>
-            <w:del w:id="187" w:author="Ramin Miraftabi" w:date="2025-09-24T10:25:00Z" w16du:dateUtc="2025-09-24T08:25:00Z">
-              <w:r>
-                <w:delText>S</w:delText>
-              </w:r>
-            </w:del>
-            <w:r>
-              <w:t xml:space="preserve">ervice </w:t>
-            </w:r>
-            <w:del w:id="188" w:author="Ramin Miraftabi" w:date="2025-09-24T10:24:00Z" w16du:dateUtc="2025-09-24T08:24:00Z">
-              <w:r>
-                <w:delText xml:space="preserve">and consumer </w:delText>
-              </w:r>
-            </w:del>
-            <w:r>
-              <w:t>must support encryption of route payload so that only the recipient can open the route when intermediates are used during transport.</w:t>
+            </w:pPr>
+            <w:r>
+              <w:t xml:space="preserve">The </w:t>
+            </w:r>
+            <w:r>
+              <w:t>s</w:t>
+            </w:r>
+            <w:r>
+              <w:t>ervice must support encryption of route payload so that only the recipient can open the route when intermediates are used during transport.</w:t>
             </w:r>
           </w:p>
           <w:p>
@@ -18870,17 +18322,15 @@
               </w:numPr>
               <w:spacing w:line="240" w:lineRule="auto"/>
             </w:pPr>
-            <w:ins w:id="189" w:author="Ramin Miraftabi" w:date="2025-09-24T10:25:00Z" w16du:dateUtc="2025-09-24T08:25:00Z">
-              <w:r>
-                <w:t xml:space="preserve">The </w:t>
-              </w:r>
-              <w:r>
-                <w:t>vessel</w:t>
-              </w:r>
-              <w:r>
-                <w:t xml:space="preserve"> may support encryption of the route payload.</w:t>
-              </w:r>
-            </w:ins>
+            <w:r>
+              <w:t xml:space="preserve">The </w:t>
+            </w:r>
+            <w:r>
+              <w:t>vessel</w:t>
+            </w:r>
+            <w:r>
+              <w:t xml:space="preserve"> may support encryption of the route payload.</w:t>
+            </w:r>
           </w:p>
         </w:tc>
       </w:tr>
@@ -19029,14 +18479,15 @@
           <w:lang w:val="en-US"/>
         </w:rPr>
       </w:pPr>
-      <w:bookmarkStart w:id="190" w:name="_Toc196502201"/>
-      <w:r>
-        <w:rPr>
-          <w:lang w:val="en-US"/>
-        </w:rPr>
+      <w:bookmarkStart w:id="41" w:name="_Toc196502201"/>
+      <w:r>
+        <w:rPr>
+          <w:lang w:val="en-US"/>
+        </w:rPr>
+        <w:lastRenderedPageBreak/>
         <w:t>Non-functional requirements</w:t>
       </w:r>
-      <w:bookmarkEnd w:id="190"/>
+      <w:bookmarkEnd w:id="41"/>
     </w:p>
     <w:tbl>
       <w:tblPr>
@@ -20150,14 +19601,14 @@
           <w:lang w:val="en-US"/>
         </w:rPr>
       </w:pPr>
-      <w:bookmarkStart w:id="191" w:name="_Toc196502202"/>
+      <w:bookmarkStart w:id="42" w:name="_Toc196502202"/>
       <w:r>
         <w:rPr>
           <w:lang w:val="en-US"/>
         </w:rPr>
         <w:t>Other constraints</w:t>
       </w:r>
-      <w:bookmarkEnd w:id="191"/>
+      <w:bookmarkEnd w:id="42"/>
     </w:p>
     <w:p>
       <w:pPr>
@@ -20174,14 +19625,14 @@
           <w:lang w:val="en-US"/>
         </w:rPr>
       </w:pPr>
-      <w:bookmarkStart w:id="192" w:name="_Toc196502203"/>
+      <w:bookmarkStart w:id="43" w:name="_Toc196502203"/>
       <w:r>
         <w:rPr>
           <w:lang w:val="en-US"/>
         </w:rPr>
         <w:t>Relevant Industrial Standards</w:t>
       </w:r>
-      <w:bookmarkEnd w:id="192"/>
+      <w:bookmarkEnd w:id="43"/>
     </w:p>
     <w:p>
       <w:pPr>
@@ -20357,7 +19808,7 @@
           <w:lang w:val="en-US"/>
         </w:rPr>
       </w:pPr>
-      <w:bookmarkStart w:id="193" w:name="_Toc196502204"/>
+      <w:bookmarkStart w:id="44" w:name="_Toc196502204"/>
       <w:r>
         <w:rPr>
           <w:lang w:val="en-US"/>
@@ -20365,7 +19816,7 @@
         <w:lastRenderedPageBreak/>
         <w:t>Operational nodes</w:t>
       </w:r>
-      <w:bookmarkEnd w:id="193"/>
+      <w:bookmarkEnd w:id="44"/>
     </w:p>
     <w:p>
       <w:pPr>
@@ -20942,12 +20393,12 @@
       <w:pPr>
         <w:pStyle w:val="Heading1"/>
       </w:pPr>
-      <w:bookmarkStart w:id="194" w:name="_Toc196502205"/>
+      <w:bookmarkStart w:id="45" w:name="_Toc196502205"/>
       <w:r>
         <w:lastRenderedPageBreak/>
         <w:t>Service Overview</w:t>
       </w:r>
-      <w:bookmarkEnd w:id="194"/>
+      <w:bookmarkEnd w:id="45"/>
     </w:p>
     <w:p>
       <w:pPr>
@@ -20964,7 +20415,7 @@
           <w:lang w:val="en-US"/>
         </w:rPr>
       </w:pPr>
-      <w:bookmarkStart w:id="195" w:name="_Toc196502206"/>
+      <w:bookmarkStart w:id="46" w:name="_Toc196502206"/>
       <w:r>
         <w:rPr>
           <w:lang w:val="en-US"/>
@@ -20977,7 +20428,7 @@
         </w:rPr>
         <w:t>operations</w:t>
       </w:r>
-      <w:bookmarkEnd w:id="195"/>
+      <w:bookmarkEnd w:id="46"/>
     </w:p>
     <w:p>
       <w:pPr>
@@ -21666,19 +21117,9 @@
             <w:r>
               <w:t xml:space="preserve">The consumer </w:t>
             </w:r>
-            <w:del w:id="196" w:author="Ramin Miraftabi" w:date="2025-09-25T11:14:00Z" w16du:dateUtc="2025-09-25T09:14:00Z">
-              <w:r>
-                <w:delText xml:space="preserve">must </w:delText>
-              </w:r>
-            </w:del>
-            <w:ins w:id="197" w:author="Ramin Miraftabi" w:date="2025-09-25T11:14:00Z" w16du:dateUtc="2025-09-25T09:14:00Z">
-              <w:r>
-                <w:t>can</w:t>
-              </w:r>
-              <w:r>
-                <w:t xml:space="preserve"> </w:t>
-              </w:r>
-            </w:ins>
+            <w:r>
+              <w:t xml:space="preserve">can </w:t>
+            </w:r>
             <w:r>
               <w:t xml:space="preserve">support the service requesting a route (see </w:t>
             </w:r>
@@ -21744,16 +21185,9 @@
                 <w:lang w:val="en-US"/>
               </w:rPr>
             </w:pPr>
-            <w:ins w:id="198" w:author="Ramin Miraftabi" w:date="2025-09-25T11:14:00Z" w16du:dateUtc="2025-09-25T09:14:00Z">
-              <w:r>
-                <w:t>o</w:t>
-              </w:r>
-            </w:ins>
-            <w:del w:id="199" w:author="Ramin Miraftabi" w:date="2025-09-25T11:14:00Z" w16du:dateUtc="2025-09-25T09:14:00Z">
-              <w:r>
-                <w:delText>x</w:delText>
-              </w:r>
-            </w:del>
+            <w:r>
+              <w:t>o</w:t>
+            </w:r>
           </w:p>
         </w:tc>
         <w:tc>
@@ -21804,9 +21238,6 @@
                 <w:numId w:val="0"/>
               </w:numPr>
               <w:spacing w:line="240" w:lineRule="auto"/>
-              <w:rPr>
-                <w:ins w:id="200" w:author="Ramin Miraftabi" w:date="2025-09-25T11:14:00Z" w16du:dateUtc="2025-09-25T09:14:00Z"/>
-              </w:rPr>
             </w:pPr>
             <w:r>
               <w:t>The consumer must have way to discover if the service supports requesting a specific route or searching for routes.</w:t>
@@ -21821,16 +21252,9 @@
               </w:numPr>
               <w:spacing w:line="240" w:lineRule="auto"/>
             </w:pPr>
-            <w:ins w:id="201" w:author="Ramin Miraftabi" w:date="2025-09-25T11:14:00Z" w16du:dateUtc="2025-09-25T09:14:00Z">
-              <w:r>
-                <w:t>The service must have a way to discover if the c</w:t>
-              </w:r>
-            </w:ins>
-            <w:ins w:id="202" w:author="Ramin Miraftabi" w:date="2025-09-25T11:15:00Z" w16du:dateUtc="2025-09-25T09:15:00Z">
-              <w:r>
-                <w:t>onsumer supports payload encryption or requesting the route.</w:t>
-              </w:r>
-            </w:ins>
+            <w:r>
+              <w:t>The service must have a way to discover if the consumer supports payload encryption or requesting the route.</w:t>
+            </w:r>
           </w:p>
         </w:tc>
         <w:tc>
@@ -21860,14 +21284,12 @@
                 <w:lang w:val="en-US"/>
               </w:rPr>
             </w:pPr>
-            <w:ins w:id="203" w:author="Ramin Miraftabi" w:date="2025-09-25T11:14:00Z" w16du:dateUtc="2025-09-25T09:14:00Z">
-              <w:r>
-                <w:rPr>
-                  <w:lang w:val="en-US"/>
-                </w:rPr>
-                <w:t>x</w:t>
-              </w:r>
-            </w:ins>
+            <w:r>
+              <w:rPr>
+                <w:lang w:val="en-US"/>
+              </w:rPr>
+              <w:t>x</w:t>
+            </w:r>
           </w:p>
         </w:tc>
       </w:tr>
@@ -22138,14 +21560,14 @@
           <w:lang w:val="en-US"/>
         </w:rPr>
       </w:pPr>
-      <w:bookmarkStart w:id="204" w:name="_Toc196502207"/>
+      <w:bookmarkStart w:id="47" w:name="_Toc196502207"/>
       <w:r>
         <w:rPr>
           <w:lang w:val="en-US"/>
         </w:rPr>
         <w:t>Search Service Registry</w:t>
       </w:r>
-      <w:bookmarkEnd w:id="204"/>
+      <w:bookmarkEnd w:id="47"/>
     </w:p>
     <w:p>
       <w:pPr>
@@ -22315,14 +21737,14 @@
           <w:lang w:val="en-US"/>
         </w:rPr>
       </w:pPr>
-      <w:bookmarkStart w:id="205" w:name="_Toc196502208"/>
+      <w:bookmarkStart w:id="48" w:name="_Toc196502208"/>
       <w:r>
         <w:rPr>
           <w:lang w:val="en-US"/>
         </w:rPr>
         <w:t>Service registry updates</w:t>
       </w:r>
-      <w:bookmarkEnd w:id="205"/>
+      <w:bookmarkEnd w:id="48"/>
     </w:p>
     <w:p>
       <w:pPr>
@@ -22373,14 +21795,14 @@
           <w:lang w:val="en-US"/>
         </w:rPr>
       </w:pPr>
-      <w:bookmarkStart w:id="206" w:name="_Toc196502209"/>
+      <w:bookmarkStart w:id="49" w:name="_Toc196502209"/>
       <w:r>
         <w:rPr>
           <w:lang w:val="en-US"/>
         </w:rPr>
         <w:t>System status</w:t>
       </w:r>
-      <w:bookmarkEnd w:id="206"/>
+      <w:bookmarkEnd w:id="49"/>
     </w:p>
     <w:p>
       <w:pPr>
@@ -22404,14 +21826,14 @@
           <w:lang w:val="en-US"/>
         </w:rPr>
       </w:pPr>
-      <w:bookmarkStart w:id="207" w:name="_Toc196502210"/>
+      <w:bookmarkStart w:id="50" w:name="_Toc196502210"/>
       <w:r>
         <w:rPr>
           <w:lang w:val="en-US"/>
         </w:rPr>
         <w:t>Send and receive acknowledgment</w:t>
       </w:r>
-      <w:bookmarkEnd w:id="207"/>
+      <w:bookmarkEnd w:id="50"/>
     </w:p>
     <w:p>
       <w:pPr>
@@ -22475,14 +21897,14 @@
           <w:lang w:val="en-US"/>
         </w:rPr>
       </w:pPr>
-      <w:bookmarkStart w:id="208" w:name="_Toc196502211"/>
+      <w:bookmarkStart w:id="51" w:name="_Toc196502211"/>
       <w:r>
         <w:rPr>
           <w:lang w:val="en-US"/>
         </w:rPr>
         <w:t>Send route</w:t>
       </w:r>
-      <w:bookmarkEnd w:id="208"/>
+      <w:bookmarkEnd w:id="51"/>
     </w:p>
     <w:p>
       <w:pPr>
@@ -22505,14 +21927,14 @@
           <w:lang w:val="en-US"/>
         </w:rPr>
       </w:pPr>
-      <w:bookmarkStart w:id="209" w:name="_Toc196502212"/>
+      <w:bookmarkStart w:id="52" w:name="_Toc196502212"/>
       <w:r>
         <w:rPr>
           <w:lang w:val="en-US"/>
         </w:rPr>
         <w:t>Receive route</w:t>
       </w:r>
-      <w:bookmarkEnd w:id="209"/>
+      <w:bookmarkEnd w:id="52"/>
     </w:p>
     <w:p>
       <w:pPr>
@@ -22606,14 +22028,14 @@
           <w:lang w:val="en-US"/>
         </w:rPr>
       </w:pPr>
-      <w:bookmarkStart w:id="210" w:name="_Toc196502213"/>
+      <w:bookmarkStart w:id="53" w:name="_Toc196502213"/>
       <w:r>
         <w:rPr>
           <w:lang w:val="en-US"/>
         </w:rPr>
         <w:t>Subscribe to changes</w:t>
       </w:r>
-      <w:bookmarkEnd w:id="210"/>
+      <w:bookmarkEnd w:id="53"/>
     </w:p>
     <w:p>
       <w:pPr>
@@ -22636,7 +22058,7 @@
           <w:lang w:val="en-US"/>
         </w:rPr>
       </w:pPr>
-      <w:bookmarkStart w:id="211" w:name="_Toc196502214"/>
+      <w:bookmarkStart w:id="54" w:name="_Toc196502214"/>
       <w:r>
         <w:rPr>
           <w:lang w:val="en-US"/>
@@ -22644,7 +22066,7 @@
         <w:lastRenderedPageBreak/>
         <w:t>Route requests</w:t>
       </w:r>
-      <w:bookmarkEnd w:id="211"/>
+      <w:bookmarkEnd w:id="54"/>
     </w:p>
     <w:p>
       <w:pPr>
@@ -22715,41 +22137,17 @@
         </w:rPr>
         <w:t xml:space="preserve">The consumer </w:t>
       </w:r>
-      <w:del w:id="212" w:author="Ramin Miraftabi" w:date="2025-09-25T11:16:00Z" w16du:dateUtc="2025-09-25T09:16:00Z">
-        <w:r>
-          <w:rPr>
-            <w:lang w:val="en-US"/>
-          </w:rPr>
-          <w:delText>must be able</w:delText>
-        </w:r>
-      </w:del>
-      <w:ins w:id="213" w:author="Ramin Miraftabi" w:date="2025-09-25T11:16:00Z" w16du:dateUtc="2025-09-25T09:16:00Z">
-        <w:r>
-          <w:rPr>
-            <w:lang w:val="en-US"/>
-          </w:rPr>
-          <w:t>may</w:t>
-        </w:r>
-      </w:ins>
-      <w:r>
-        <w:rPr>
-          <w:lang w:val="en-US"/>
-        </w:rPr>
-        <w:t xml:space="preserve"> </w:t>
-      </w:r>
-      <w:del w:id="214" w:author="Ramin Miraftabi" w:date="2025-09-25T11:16:00Z" w16du:dateUtc="2025-09-25T09:16:00Z">
-        <w:r>
-          <w:rPr>
-            <w:lang w:val="en-US"/>
-          </w:rPr>
-          <w:delText xml:space="preserve">to </w:delText>
-        </w:r>
-      </w:del>
-      <w:r>
-        <w:rPr>
-          <w:lang w:val="en-US"/>
-        </w:rPr>
-        <w:t>support requests for a route without any search parameters or with a geometry parameter. When a request is received without any parameters the route under monitoring should be returned without an increase to the edition number. If the geometry parameter is present, the monitored route should be returned only if the search geometry and the route geometry intersect.</w:t>
+      <w:r>
+        <w:rPr>
+          <w:lang w:val="en-US"/>
+        </w:rPr>
+        <w:t>may</w:t>
+      </w:r>
+      <w:r>
+        <w:rPr>
+          <w:lang w:val="en-US"/>
+        </w:rPr>
+        <w:t xml:space="preserve"> support requests for a route without any search parameters or with a geometry parameter. When a request is received without any parameters the route under monitoring should be returned without an increase to the edition number. If the geometry parameter is present, the monitored route should be returned only if the search geometry and the route geometry intersect.</w:t>
       </w:r>
     </w:p>
     <w:p>
@@ -22759,14 +22157,14 @@
           <w:lang w:val="en-US"/>
         </w:rPr>
       </w:pPr>
-      <w:bookmarkStart w:id="215" w:name="_Toc196502215"/>
+      <w:bookmarkStart w:id="55" w:name="_Toc196502215"/>
       <w:r>
         <w:rPr>
           <w:lang w:val="en-US"/>
         </w:rPr>
         <w:t>Discovering service functionality</w:t>
       </w:r>
-      <w:bookmarkEnd w:id="215"/>
+      <w:bookmarkEnd w:id="55"/>
     </w:p>
     <w:p>
       <w:pPr>
@@ -22781,14 +22179,12 @@
         </w:rPr>
         <w:t xml:space="preserve">The </w:t>
       </w:r>
-      <w:ins w:id="216" w:author="Ramin Miraftabi" w:date="2025-09-25T11:16:00Z" w16du:dateUtc="2025-09-25T09:16:00Z">
-        <w:r>
-          <w:rPr>
-            <w:lang w:val="en-US"/>
-          </w:rPr>
-          <w:t xml:space="preserve">service and </w:t>
-        </w:r>
-      </w:ins>
+      <w:r>
+        <w:rPr>
+          <w:lang w:val="en-US"/>
+        </w:rPr>
+        <w:t xml:space="preserve">service and </w:t>
+      </w:r>
       <w:r>
         <w:rPr>
           <w:lang w:val="en-US"/>
@@ -22809,14 +22205,12 @@
         </w:rPr>
         <w:t xml:space="preserve"> the interfaces provided by the service. The service </w:t>
       </w:r>
-      <w:ins w:id="217" w:author="Ramin Miraftabi" w:date="2025-09-25T11:16:00Z" w16du:dateUtc="2025-09-25T09:16:00Z">
-        <w:r>
-          <w:rPr>
-            <w:lang w:val="en-US"/>
-          </w:rPr>
-          <w:t xml:space="preserve">and consumer </w:t>
-        </w:r>
-      </w:ins>
+      <w:r>
+        <w:rPr>
+          <w:lang w:val="en-US"/>
+        </w:rPr>
+        <w:t xml:space="preserve">and consumer </w:t>
+      </w:r>
       <w:r>
         <w:rPr>
           <w:lang w:val="en-US"/>
@@ -22831,14 +22225,14 @@
           <w:lang w:val="en-US"/>
         </w:rPr>
       </w:pPr>
-      <w:bookmarkStart w:id="218" w:name="_Toc196502216"/>
+      <w:bookmarkStart w:id="56" w:name="_Toc196502216"/>
       <w:r>
         <w:rPr>
           <w:lang w:val="en-US"/>
         </w:rPr>
         <w:t>Logical parameters</w:t>
       </w:r>
-      <w:bookmarkEnd w:id="218"/>
+      <w:bookmarkEnd w:id="56"/>
     </w:p>
     <w:p>
       <w:pPr>
@@ -22874,16 +22268,16 @@
           <w:lang w:val="en-US"/>
         </w:rPr>
       </w:pPr>
-      <w:bookmarkStart w:id="219" w:name="_Ref196501451"/>
-      <w:bookmarkStart w:id="220" w:name="_Toc196502217"/>
+      <w:bookmarkStart w:id="57" w:name="_Ref196501451"/>
+      <w:bookmarkStart w:id="58" w:name="_Toc196502217"/>
       <w:r>
         <w:rPr>
           <w:lang w:val="en-US"/>
         </w:rPr>
         <w:t>Callback</w:t>
       </w:r>
-      <w:bookmarkEnd w:id="219"/>
-      <w:bookmarkEnd w:id="220"/>
+      <w:bookmarkEnd w:id="57"/>
+      <w:bookmarkEnd w:id="58"/>
     </w:p>
     <w:p>
       <w:pPr>
@@ -22906,14 +22300,14 @@
           <w:lang w:val="en-US"/>
         </w:rPr>
       </w:pPr>
-      <w:bookmarkStart w:id="221" w:name="_Toc196502218"/>
+      <w:bookmarkStart w:id="59" w:name="_Toc196502218"/>
       <w:r>
         <w:rPr>
           <w:lang w:val="en-US"/>
         </w:rPr>
         <w:t>Geometry</w:t>
       </w:r>
-      <w:bookmarkEnd w:id="221"/>
+      <w:bookmarkEnd w:id="59"/>
     </w:p>
     <w:p>
       <w:pPr>
@@ -23000,14 +22394,14 @@
           <w:lang w:val="en-US"/>
         </w:rPr>
       </w:pPr>
-      <w:bookmarkStart w:id="222" w:name="_Toc196502219"/>
+      <w:bookmarkStart w:id="60" w:name="_Toc196502219"/>
       <w:r>
         <w:rPr>
           <w:lang w:val="en-US"/>
         </w:rPr>
         <w:t>Route</w:t>
       </w:r>
-      <w:bookmarkEnd w:id="222"/>
+      <w:bookmarkEnd w:id="60"/>
     </w:p>
     <w:p>
       <w:pPr>
@@ -23044,8 +22438,8 @@
           <w:lang w:val="en-US"/>
         </w:rPr>
       </w:pPr>
-      <w:bookmarkStart w:id="223" w:name="_Ref196501493"/>
-      <w:bookmarkStart w:id="224" w:name="_Toc196502220"/>
+      <w:bookmarkStart w:id="61" w:name="_Ref196501493"/>
+      <w:bookmarkStart w:id="62" w:name="_Toc196502220"/>
       <w:r>
         <w:rPr>
           <w:lang w:val="en-US"/>
@@ -23053,8 +22447,8 @@
         <w:lastRenderedPageBreak/>
         <w:t>Message identifier</w:t>
       </w:r>
-      <w:bookmarkEnd w:id="223"/>
-      <w:bookmarkEnd w:id="224"/>
+      <w:bookmarkEnd w:id="61"/>
+      <w:bookmarkEnd w:id="62"/>
     </w:p>
     <w:p>
       <w:pPr>
@@ -23077,14 +22471,14 @@
           <w:lang w:val="en-US"/>
         </w:rPr>
       </w:pPr>
-      <w:bookmarkStart w:id="225" w:name="_Toc196502221"/>
+      <w:bookmarkStart w:id="63" w:name="_Toc196502221"/>
       <w:r>
         <w:rPr>
           <w:lang w:val="en-US"/>
         </w:rPr>
         <w:t>Service discovery</w:t>
       </w:r>
-      <w:bookmarkEnd w:id="225"/>
+      <w:bookmarkEnd w:id="63"/>
     </w:p>
     <w:p>
       <w:pPr>
@@ -23118,12 +22512,12 @@
       <w:pPr>
         <w:pStyle w:val="Heading1"/>
       </w:pPr>
-      <w:bookmarkStart w:id="226" w:name="_Toc196502222"/>
+      <w:bookmarkStart w:id="64" w:name="_Toc196502222"/>
       <w:r>
         <w:lastRenderedPageBreak/>
         <w:t>Service Data Model</w:t>
       </w:r>
-      <w:bookmarkEnd w:id="226"/>
+      <w:bookmarkEnd w:id="64"/>
     </w:p>
     <w:p>
       <w:pPr>
@@ -23175,7 +22569,7 @@
           <w:lang w:val="de-DE" w:eastAsia="de-DE"/>
         </w:rPr>
         <w:drawing>
-          <wp:inline distT="0" distB="0" distL="0" distR="0" wp14:anchorId="18D4A4BF" wp14:editId="13D87176">
+          <wp:inline distT="0" distB="0" distL="0" distR="0" wp14:anchorId="18D4A4BF" wp14:editId="377B1B83">
             <wp:extent cx="6188710" cy="4108760"/>
             <wp:effectExtent l="0" t="0" r="2540" b="6350"/>
             <wp:docPr id="1814049254" name="Picture 1" descr="A screenshot of a computer&#10;&#10;Description automatically generated"/>
@@ -23221,7 +22615,7 @@
       <w:pPr>
         <w:pStyle w:val="Caption"/>
       </w:pPr>
-      <w:bookmarkStart w:id="227" w:name="_Toc196500262"/>
+      <w:bookmarkStart w:id="65" w:name="_Toc196500262"/>
       <w:r>
         <w:t xml:space="preserve">Figure </w:t>
       </w:r>
@@ -23236,7 +22630,7 @@
       <w:r>
         <w:t xml:space="preserve"> Abstract object model of the route plan data</w:t>
       </w:r>
-      <w:bookmarkEnd w:id="227"/>
+      <w:bookmarkEnd w:id="65"/>
     </w:p>
     <w:p>
       <w:pPr>
@@ -23265,14 +22659,14 @@
           <w:lang w:val="en-US"/>
         </w:rPr>
       </w:pPr>
-      <w:bookmarkStart w:id="228" w:name="_Toc196502223"/>
+      <w:bookmarkStart w:id="66" w:name="_Toc196502223"/>
       <w:r>
         <w:rPr>
           <w:lang w:val="en-US"/>
         </w:rPr>
         <w:t>Container type</w:t>
       </w:r>
-      <w:bookmarkEnd w:id="228"/>
+      <w:bookmarkEnd w:id="66"/>
     </w:p>
     <w:p>
       <w:pPr>
@@ -23324,14 +22718,14 @@
           <w:lang w:val="en-US"/>
         </w:rPr>
       </w:pPr>
-      <w:bookmarkStart w:id="229" w:name="_Toc196502224"/>
+      <w:bookmarkStart w:id="67" w:name="_Toc196502224"/>
       <w:r>
         <w:rPr>
           <w:lang w:val="en-US"/>
         </w:rPr>
         <w:t>End-to-end verification of data</w:t>
       </w:r>
-      <w:bookmarkEnd w:id="229"/>
+      <w:bookmarkEnd w:id="67"/>
     </w:p>
     <w:p>
       <w:pPr>
@@ -23362,14 +22756,14 @@
           <w:lang w:val="en-US"/>
         </w:rPr>
       </w:pPr>
-      <w:bookmarkStart w:id="230" w:name="_Toc196502225"/>
+      <w:bookmarkStart w:id="68" w:name="_Toc196502225"/>
       <w:r>
         <w:rPr>
           <w:lang w:val="en-US"/>
         </w:rPr>
         <w:t>Changing the route edition number</w:t>
       </w:r>
-      <w:bookmarkEnd w:id="230"/>
+      <w:bookmarkEnd w:id="68"/>
     </w:p>
     <w:p>
       <w:pPr>
@@ -23470,14 +22864,14 @@
           <w:lang w:val="en-US"/>
         </w:rPr>
       </w:pPr>
-      <w:bookmarkStart w:id="231" w:name="_Toc196502226"/>
+      <w:bookmarkStart w:id="69" w:name="_Toc196502226"/>
       <w:r>
         <w:rPr>
           <w:lang w:val="en-US"/>
         </w:rPr>
         <w:t>Coordinate systems</w:t>
       </w:r>
-      <w:bookmarkEnd w:id="231"/>
+      <w:bookmarkEnd w:id="69"/>
     </w:p>
     <w:p>
       <w:pPr>
@@ -23522,14 +22916,14 @@
           <w:lang w:val="en-US"/>
         </w:rPr>
       </w:pPr>
-      <w:bookmarkStart w:id="232" w:name="_Toc196502227"/>
+      <w:bookmarkStart w:id="70" w:name="_Toc196502227"/>
       <w:r>
         <w:rPr>
           <w:lang w:val="en-US"/>
         </w:rPr>
         <w:t>Route status</w:t>
       </w:r>
-      <w:bookmarkEnd w:id="232"/>
+      <w:bookmarkEnd w:id="70"/>
     </w:p>
     <w:p>
       <w:pPr>
@@ -23557,32 +22951,18 @@
       <w:pPr>
         <w:pStyle w:val="Bullet1"/>
       </w:pPr>
-      <w:del w:id="233" w:author="Ramin Miraftabi" w:date="2025-09-22T14:06:00Z" w16du:dateUtc="2025-09-22T12:06:00Z">
-        <w:r>
-          <w:delText>Acknowledged</w:delText>
-        </w:r>
-      </w:del>
-      <w:ins w:id="234" w:author="Ramin Miraftabi" w:date="2025-09-22T14:06:00Z" w16du:dateUtc="2025-09-22T12:06:00Z">
-        <w:r>
-          <w:t>Checked</w:t>
-        </w:r>
-      </w:ins>
+      <w:r>
+        <w:t>Checked</w:t>
+      </w:r>
       <w:r>
         <w:t xml:space="preserve">: VTS does not have any comments / issues / errors in route and has manually (or only automatically in the case of use case 11) </w:t>
       </w:r>
-      <w:del w:id="235" w:author="Ramin Miraftabi" w:date="2025-09-22T14:07:00Z" w16du:dateUtc="2025-09-22T12:07:00Z">
-        <w:r>
-          <w:delText xml:space="preserve">acknowledged </w:delText>
-        </w:r>
-      </w:del>
-      <w:ins w:id="236" w:author="Ramin Miraftabi" w:date="2025-09-22T14:07:00Z" w16du:dateUtc="2025-09-22T12:07:00Z">
-        <w:r>
-          <w:t>checked</w:t>
-        </w:r>
-        <w:r>
-          <w:t xml:space="preserve"> </w:t>
-        </w:r>
-      </w:ins>
+      <w:r>
+        <w:t>checked</w:t>
+      </w:r>
+      <w:r>
+        <w:t xml:space="preserve"> </w:t>
+      </w:r>
       <w:r>
         <w:t>the route. This does not imply that the route is error free or approved, just that VTS does not have any comments on the route.</w:t>
       </w:r>
@@ -23624,16 +23004,64 @@
         <w:pStyle w:val="Bullet1"/>
       </w:pPr>
       <w:r>
+        <w:t>Route issues: Route may have recommendations (see above</w:t>
+      </w:r>
+      <w:proofErr w:type="gramStart"/>
+      <w:r>
+        <w:t>)</w:t>
+      </w:r>
+      <w:proofErr w:type="gramEnd"/>
+      <w:r>
+        <w:t xml:space="preserve"> but it also has issues that VTS does not have a recommendation on how to solve. </w:t>
+      </w:r>
+      <w:proofErr w:type="spellStart"/>
+      <w:r>
+        <w:t>RouteInfoDescription</w:t>
+      </w:r>
+      <w:proofErr w:type="spellEnd"/>
+      <w:r>
+        <w:t xml:space="preserve">-element must have comment on issues and </w:t>
+      </w:r>
+      <w:proofErr w:type="spellStart"/>
+      <w:r>
+        <w:t>RouteWaypointLegIssue</w:t>
+      </w:r>
+      <w:proofErr w:type="spellEnd"/>
+      <w:r>
+        <w:t>-elements may be used to further identify issues.</w:t>
+      </w:r>
+    </w:p>
+    <w:p>
+      <w:pPr>
+        <w:pStyle w:val="Bullet1"/>
+      </w:pPr>
+      <w:r>
         <w:lastRenderedPageBreak/>
-        <w:t>Route issues: Route may have recommendations (see above</w:t>
+        <w:t xml:space="preserve">Route incomplete: Route has too many issues for VTS to comment upon in detail. </w:t>
+      </w:r>
+      <w:proofErr w:type="spellStart"/>
+      <w:r>
+        <w:t>RouteInfoDescription</w:t>
+      </w:r>
+      <w:proofErr w:type="spellEnd"/>
+      <w:r>
+        <w:t xml:space="preserve"> must have some description on what is needed, but this status does not require detailed instructions on how to improve the route.</w:t>
+      </w:r>
+    </w:p>
+    <w:p>
+      <w:pPr>
+        <w:pStyle w:val="Bullet1"/>
+      </w:pPr>
+      <w:r>
+        <w:t xml:space="preserve">Route errors: Route has errors identified by technical means. </w:t>
       </w:r>
       <w:proofErr w:type="gramStart"/>
       <w:r>
-        <w:t>)</w:t>
+        <w:t>Specifically</w:t>
       </w:r>
       <w:proofErr w:type="gramEnd"/>
       <w:r>
-        <w:t xml:space="preserve"> but it also has issues that VTS does not have a recommendation on how to solve. </w:t>
+        <w:t xml:space="preserve"> schema validation is passed but business rule validations have errors. </w:t>
       </w:r>
       <w:proofErr w:type="spellStart"/>
       <w:r>
@@ -23641,7 +23069,7 @@
       </w:r>
       <w:proofErr w:type="spellEnd"/>
       <w:r>
-        <w:t xml:space="preserve">-element must have comment on issues and </w:t>
+        <w:t xml:space="preserve"> must have a human readable list of errors found. </w:t>
       </w:r>
       <w:proofErr w:type="spellStart"/>
       <w:r>
@@ -23649,7 +23077,7 @@
       </w:r>
       <w:proofErr w:type="spellEnd"/>
       <w:r>
-        <w:t>-elements may be used to further identify issues.</w:t>
+        <w:t xml:space="preserve"> may also be used to pinpoint errors.</w:t>
       </w:r>
     </w:p>
     <w:p>
@@ -23657,54 +23085,6 @@
         <w:pStyle w:val="Bullet1"/>
       </w:pPr>
       <w:r>
-        <w:t xml:space="preserve">Route incomplete: Route has too many issues for VTS to comment upon in detail. </w:t>
-      </w:r>
-      <w:proofErr w:type="spellStart"/>
-      <w:r>
-        <w:t>RouteInfoDescription</w:t>
-      </w:r>
-      <w:proofErr w:type="spellEnd"/>
-      <w:r>
-        <w:t xml:space="preserve"> must have some description on what is needed, but this status does not require detailed instructions on how to improve the route.</w:t>
-      </w:r>
-    </w:p>
-    <w:p>
-      <w:pPr>
-        <w:pStyle w:val="Bullet1"/>
-      </w:pPr>
-      <w:r>
-        <w:t xml:space="preserve">Route errors: Route has errors identified by technical means. </w:t>
-      </w:r>
-      <w:proofErr w:type="gramStart"/>
-      <w:r>
-        <w:t>Specifically</w:t>
-      </w:r>
-      <w:proofErr w:type="gramEnd"/>
-      <w:r>
-        <w:t xml:space="preserve"> schema validation is passed but business rule validations have errors. </w:t>
-      </w:r>
-      <w:proofErr w:type="spellStart"/>
-      <w:r>
-        <w:t>RouteInfoDescription</w:t>
-      </w:r>
-      <w:proofErr w:type="spellEnd"/>
-      <w:r>
-        <w:t xml:space="preserve"> must have a human readable list of errors found. </w:t>
-      </w:r>
-      <w:proofErr w:type="spellStart"/>
-      <w:r>
-        <w:t>RouteWaypointLegIssue</w:t>
-      </w:r>
-      <w:proofErr w:type="spellEnd"/>
-      <w:r>
-        <w:t xml:space="preserve"> may also be used to pinpoint errors.</w:t>
-      </w:r>
-    </w:p>
-    <w:p>
-      <w:pPr>
-        <w:pStyle w:val="Bullet1"/>
-      </w:pPr>
-      <w:r>
         <w:t>Initial: When route is sent from the VTS route library. See RESF011 for detailed requirements on route contents.</w:t>
       </w:r>
     </w:p>
@@ -23712,11 +23092,11 @@
       <w:pPr>
         <w:pStyle w:val="Heading2"/>
       </w:pPr>
-      <w:bookmarkStart w:id="237" w:name="_Toc196502228"/>
+      <w:bookmarkStart w:id="71" w:name="_Toc196502228"/>
       <w:r>
         <w:t>Handling extensions</w:t>
       </w:r>
-      <w:bookmarkEnd w:id="237"/>
+      <w:bookmarkEnd w:id="71"/>
     </w:p>
     <w:p>
       <w:pPr>
@@ -23730,29 +23110,12 @@
       <w:r>
         <w:t xml:space="preserve">S-421 supports extensions to the data model in nearly all the main datatypes. Unless otherwise specified in this specification, consumer and service </w:t>
       </w:r>
-      <w:del w:id="238" w:author="Ramin Miraftabi" w:date="2025-09-22T14:10:00Z" w16du:dateUtc="2025-09-22T12:10:00Z">
-        <w:r>
-          <w:delText xml:space="preserve">do not need to </w:delText>
-        </w:r>
-      </w:del>
-      <w:ins w:id="239" w:author="Ramin Miraftabi" w:date="2025-09-22T14:10:00Z" w16du:dateUtc="2025-09-22T12:10:00Z">
-        <w:r>
-          <w:t xml:space="preserve">must not </w:t>
-        </w:r>
-        <w:r>
-          <w:t>mainta</w:t>
-        </w:r>
-      </w:ins>
-      <w:ins w:id="240" w:author="Ramin Miraftabi" w:date="2025-09-22T14:11:00Z" w16du:dateUtc="2025-09-22T12:11:00Z">
-        <w:r>
-          <w:t>in the contents of extensions after changes. Any unsupported extensions must be removed from the response.</w:t>
-        </w:r>
-      </w:ins>
-      <w:del w:id="241" w:author="Ramin Miraftabi" w:date="2025-09-22T14:11:00Z" w16du:dateUtc="2025-09-22T12:11:00Z">
-        <w:r>
-          <w:delText>ensure that the contents of extensions are maintained after changes have been made in route.</w:delText>
-        </w:r>
-      </w:del>
+      <w:r>
+        <w:t xml:space="preserve">must not </w:t>
+      </w:r>
+      <w:r>
+        <w:t>maintain the contents of extensions after changes. Any unsupported extensions must be removed from the response.</w:t>
+      </w:r>
       <w:r>
         <w:t xml:space="preserve"> This service defines route exchange using S-421 and support for any kind of data in extensions is purely optional.</w:t>
       </w:r>
@@ -23760,31 +23123,18 @@
     <w:p>
       <w:pPr>
         <w:pStyle w:val="BodyText"/>
-        <w:rPr>
-          <w:del w:id="242" w:author="Ramin Miraftabi" w:date="2025-09-22T14:11:00Z" w16du:dateUtc="2025-09-22T12:11:00Z"/>
-        </w:rPr>
-      </w:pPr>
-      <w:del w:id="243" w:author="Ramin Miraftabi" w:date="2025-09-22T14:11:00Z" w16du:dateUtc="2025-09-22T12:11:00Z">
-        <w:r>
-          <w:delText>For any deleted items (waypoints, action points, schedule items etc) the extension data must not be maintained as there is no way to add the extension data without the parent element.</w:delText>
-        </w:r>
-      </w:del>
-    </w:p>
-    <w:p>
-      <w:pPr>
-        <w:pStyle w:val="BodyText"/>
       </w:pPr>
     </w:p>
     <w:p>
       <w:pPr>
         <w:pStyle w:val="Heading1"/>
       </w:pPr>
-      <w:bookmarkStart w:id="244" w:name="_Toc196502229"/>
+      <w:bookmarkStart w:id="72" w:name="_Toc196502229"/>
       <w:r>
         <w:lastRenderedPageBreak/>
         <w:t>Service Dynamic Behaviour</w:t>
       </w:r>
-      <w:bookmarkEnd w:id="244"/>
+      <w:bookmarkEnd w:id="72"/>
     </w:p>
     <w:p>
       <w:pPr>
@@ -23996,14 +23346,14 @@
           <w:lang w:val="en-US"/>
         </w:rPr>
       </w:pPr>
-      <w:bookmarkStart w:id="245" w:name="_Toc196502230"/>
+      <w:bookmarkStart w:id="73" w:name="_Toc196502230"/>
       <w:r>
         <w:rPr>
           <w:lang w:val="en-US"/>
         </w:rPr>
         <w:t>Acknowledgement messages</w:t>
       </w:r>
-      <w:bookmarkEnd w:id="245"/>
+      <w:bookmarkEnd w:id="73"/>
     </w:p>
     <w:p>
       <w:pPr>
@@ -24048,14 +23398,14 @@
           <w:lang w:val="en-US"/>
         </w:rPr>
       </w:pPr>
-      <w:bookmarkStart w:id="246" w:name="_Toc196502231"/>
+      <w:bookmarkStart w:id="74" w:name="_Toc196502231"/>
       <w:r>
         <w:rPr>
           <w:lang w:val="en-US"/>
         </w:rPr>
         <w:t>Sharing of route</w:t>
       </w:r>
-      <w:bookmarkEnd w:id="246"/>
+      <w:bookmarkEnd w:id="74"/>
     </w:p>
     <w:p>
       <w:pPr>
@@ -24181,7 +23531,7 @@
       <w:pPr>
         <w:pStyle w:val="Caption"/>
       </w:pPr>
-      <w:bookmarkStart w:id="247" w:name="_Toc196500263"/>
+      <w:bookmarkStart w:id="75" w:name="_Toc196500263"/>
       <w:r>
         <w:t xml:space="preserve">Figure </w:t>
       </w:r>
@@ -24196,7 +23546,7 @@
       <w:r>
         <w:t xml:space="preserve"> Initial sharing of route</w:t>
       </w:r>
-      <w:bookmarkEnd w:id="247"/>
+      <w:bookmarkEnd w:id="75"/>
     </w:p>
     <w:p>
       <w:pPr>
@@ -24507,7 +23857,7 @@
       <w:pPr>
         <w:pStyle w:val="Caption"/>
       </w:pPr>
-      <w:bookmarkStart w:id="248" w:name="_Toc196500264"/>
+      <w:bookmarkStart w:id="76" w:name="_Toc196500264"/>
       <w:r>
         <w:t xml:space="preserve">Figure </w:t>
       </w:r>
@@ -24522,7 +23872,7 @@
       <w:r>
         <w:t xml:space="preserve"> Requesting updates to route upon changes</w:t>
       </w:r>
-      <w:bookmarkEnd w:id="248"/>
+      <w:bookmarkEnd w:id="76"/>
     </w:p>
     <w:p>
       <w:pPr>
@@ -24596,7 +23946,7 @@
       <w:pPr>
         <w:pStyle w:val="Caption"/>
       </w:pPr>
-      <w:bookmarkStart w:id="249" w:name="_Toc196500265"/>
+      <w:bookmarkStart w:id="77" w:name="_Toc196500265"/>
       <w:r>
         <w:t xml:space="preserve">Figure </w:t>
       </w:r>
@@ -24611,7 +23961,7 @@
       <w:r>
         <w:t xml:space="preserve"> Moving route to monitoring</w:t>
       </w:r>
-      <w:bookmarkEnd w:id="249"/>
+      <w:bookmarkEnd w:id="77"/>
     </w:p>
     <w:p>
       <w:pPr>
@@ -24626,28 +23976,18 @@
         </w:rPr>
         <w:t xml:space="preserve">The complexity of interaction in use case 9 (see diagram) means that the process outlined above is repeated multiple times and sharing of route to VTS’ that have already </w:t>
       </w:r>
-      <w:del w:id="250" w:author="Ramin Miraftabi" w:date="2025-09-22T14:07:00Z" w16du:dateUtc="2025-09-22T12:07:00Z">
-        <w:r>
-          <w:rPr>
-            <w:lang w:val="en-US"/>
-          </w:rPr>
-          <w:delText xml:space="preserve">acknowledged </w:delText>
-        </w:r>
-      </w:del>
-      <w:ins w:id="251" w:author="Ramin Miraftabi" w:date="2025-09-22T14:07:00Z" w16du:dateUtc="2025-09-22T12:07:00Z">
-        <w:r>
-          <w:rPr>
-            <w:lang w:val="en-US"/>
-          </w:rPr>
-          <w:t>checked</w:t>
-        </w:r>
-        <w:r>
-          <w:rPr>
-            <w:lang w:val="en-US"/>
-          </w:rPr>
-          <w:t xml:space="preserve"> </w:t>
-        </w:r>
-      </w:ins>
+      <w:r>
+        <w:rPr>
+          <w:lang w:val="en-US"/>
+        </w:rPr>
+        <w:t>checked</w:t>
+      </w:r>
+      <w:r>
+        <w:rPr>
+          <w:lang w:val="en-US"/>
+        </w:rPr>
+        <w:t xml:space="preserve"> </w:t>
+      </w:r>
       <w:r>
         <w:rPr>
           <w:lang w:val="en-US"/>
@@ -24668,14 +24008,12 @@
         </w:rPr>
         <w:t>Thus</w:t>
       </w:r>
-      <w:ins w:id="252" w:author="Ramin Miraftabi" w:date="2025-09-22T14:13:00Z" w16du:dateUtc="2025-09-22T12:13:00Z">
-        <w:r>
-          <w:rPr>
-            <w:lang w:val="en-US"/>
-          </w:rPr>
-          <w:t>,</w:t>
-        </w:r>
-      </w:ins>
+      <w:r>
+        <w:rPr>
+          <w:lang w:val="en-US"/>
+        </w:rPr>
+        <w:t>,</w:t>
+      </w:r>
       <w:r>
         <w:rPr>
           <w:lang w:val="en-US"/>
@@ -24696,7 +24034,6 @@
           <w:noProof/>
           <w:lang w:val="de-DE" w:eastAsia="de-DE"/>
         </w:rPr>
-        <w:lastRenderedPageBreak/>
         <w:drawing>
           <wp:inline distT="0" distB="0" distL="0" distR="0" wp14:anchorId="72AE95BD" wp14:editId="2EB35D16">
             <wp:extent cx="4758407" cy="3222625"/>
@@ -24744,8 +24081,9 @@
       <w:pPr>
         <w:pStyle w:val="Caption"/>
       </w:pPr>
-      <w:bookmarkStart w:id="253" w:name="_Toc196500266"/>
-      <w:r>
+      <w:bookmarkStart w:id="78" w:name="_Toc196500266"/>
+      <w:r>
+        <w:lastRenderedPageBreak/>
         <w:t xml:space="preserve">Figure </w:t>
       </w:r>
       <w:fldSimple w:instr=" SEQ Figure \* ARABIC ">
@@ -24759,7 +24097,7 @@
       <w:r>
         <w:t xml:space="preserve"> Sharing route with multiple VTS</w:t>
       </w:r>
-      <w:bookmarkEnd w:id="253"/>
+      <w:bookmarkEnd w:id="78"/>
     </w:p>
     <w:p>
       <w:pPr>
@@ -24788,7 +24126,7 @@
           <w:lang w:val="de-DE" w:eastAsia="de-DE"/>
         </w:rPr>
         <w:drawing>
-          <wp:inline distT="0" distB="0" distL="0" distR="0" wp14:anchorId="1F9B2BF3" wp14:editId="0F037CD3">
+          <wp:inline distT="0" distB="0" distL="0" distR="0" wp14:anchorId="1F9B2BF3" wp14:editId="2C3990F7">
             <wp:extent cx="6023610" cy="3346450"/>
             <wp:effectExtent l="0" t="0" r="0" b="6350"/>
             <wp:docPr id="1984840577" name="Graphic 5"/>
@@ -24834,7 +24172,7 @@
       <w:pPr>
         <w:pStyle w:val="Caption"/>
       </w:pPr>
-      <w:bookmarkStart w:id="254" w:name="_Toc196500267"/>
+      <w:bookmarkStart w:id="79" w:name="_Toc196500267"/>
       <w:r>
         <w:t xml:space="preserve">Figure </w:t>
       </w:r>
@@ -24849,7 +24187,7 @@
       <w:r>
         <w:t xml:space="preserve"> Changing route</w:t>
       </w:r>
-      <w:bookmarkEnd w:id="254"/>
+      <w:bookmarkEnd w:id="79"/>
     </w:p>
     <w:p>
       <w:pPr>
@@ -24876,7 +24214,6 @@
         <w:rPr>
           <w:lang w:val="en-US"/>
         </w:rPr>
-        <w:lastRenderedPageBreak/>
         <w:t>If the changed route no longer enters a VTS area the ship system must send a cancellation of the route to the VTS in question. The route cancellation must include the entire route as defined when sharing the route from vessel to VTS.</w:t>
       </w:r>
     </w:p>
@@ -24892,6 +24229,7 @@
           <w:noProof/>
           <w:lang w:val="de-DE" w:eastAsia="de-DE"/>
         </w:rPr>
+        <w:lastRenderedPageBreak/>
         <w:drawing>
           <wp:inline distT="0" distB="0" distL="0" distR="0" wp14:anchorId="5B8E2D40" wp14:editId="786AE7FC">
             <wp:extent cx="6056017" cy="3698240"/>
@@ -24939,7 +24277,7 @@
       <w:pPr>
         <w:pStyle w:val="Caption"/>
       </w:pPr>
-      <w:bookmarkStart w:id="255" w:name="_Toc196500268"/>
+      <w:bookmarkStart w:id="80" w:name="_Toc196500268"/>
       <w:r>
         <w:t xml:space="preserve">Figure </w:t>
       </w:r>
@@ -24954,7 +24292,7 @@
       <w:r>
         <w:t xml:space="preserve"> Route cancellation</w:t>
       </w:r>
-      <w:bookmarkEnd w:id="255"/>
+      <w:bookmarkEnd w:id="80"/>
     </w:p>
     <w:p>
       <w:pPr>
@@ -25023,19 +24361,12 @@
       <w:r>
         <w:t xml:space="preserve">VTS A </w:t>
       </w:r>
-      <w:del w:id="256" w:author="Ramin Miraftabi" w:date="2025-09-24T09:05:00Z" w16du:dateUtc="2025-09-24T07:05:00Z">
-        <w:r>
-          <w:delText xml:space="preserve">acknowledges </w:delText>
-        </w:r>
-      </w:del>
-      <w:ins w:id="257" w:author="Ramin Miraftabi" w:date="2025-09-24T09:05:00Z" w16du:dateUtc="2025-09-24T07:05:00Z">
-        <w:r>
-          <w:t>checks</w:t>
-        </w:r>
-        <w:r>
-          <w:t xml:space="preserve"> </w:t>
-        </w:r>
-      </w:ins>
+      <w:r>
+        <w:t>checks</w:t>
+      </w:r>
+      <w:r>
+        <w:t xml:space="preserve"> </w:t>
+      </w:r>
       <w:r>
         <w:t>route (route edition number 1), VTS B sends recommendations (route edition number 2)</w:t>
       </w:r>
@@ -25097,27 +24428,27 @@
         <w:pStyle w:val="BodyText"/>
       </w:pPr>
       <w:r>
+        <w:t xml:space="preserve">If the route is being shared as a reaction to VTS requesting the route (use case 10) all requirements above are true with the exception that route edition number should be greater than 1 as route should have already been sent to at least some VTS and moved to monitoring. </w:t>
+      </w:r>
+      <w:proofErr w:type="gramStart"/>
+      <w:r>
+        <w:t>Both of these</w:t>
+      </w:r>
+      <w:proofErr w:type="gramEnd"/>
+      <w:r>
+        <w:t xml:space="preserve"> actions should already have affected the edition number at least once if not more.</w:t>
+      </w:r>
+    </w:p>
+    <w:p>
+      <w:pPr>
+        <w:pStyle w:val="Heading2"/>
+      </w:pPr>
+      <w:bookmarkStart w:id="81" w:name="_Toc196502232"/>
+      <w:r>
         <w:lastRenderedPageBreak/>
-        <w:t xml:space="preserve">If the route is being shared as a reaction to VTS requesting the route (use case 10) all requirements above are true with the exception that route edition number should be greater than 1 as route should have already been sent to at least some VTS and moved to monitoring. </w:t>
-      </w:r>
-      <w:proofErr w:type="gramStart"/>
-      <w:r>
-        <w:t>Both of these</w:t>
-      </w:r>
-      <w:proofErr w:type="gramEnd"/>
-      <w:r>
-        <w:t xml:space="preserve"> actions should already have affected the edition number at least once if not more.</w:t>
-      </w:r>
-    </w:p>
-    <w:p>
-      <w:pPr>
-        <w:pStyle w:val="Heading2"/>
-      </w:pPr>
-      <w:bookmarkStart w:id="258" w:name="_Toc196502232"/>
-      <w:r>
         <w:t>Route responses from VTS to vessel</w:t>
       </w:r>
-      <w:bookmarkEnd w:id="258"/>
+      <w:bookmarkEnd w:id="81"/>
     </w:p>
     <w:p>
       <w:pPr>
@@ -25164,22 +24495,12 @@
           <w:lang w:val="en-US"/>
         </w:rPr>
       </w:pPr>
-      <w:del w:id="259" w:author="Ramin Miraftabi" w:date="2025-09-22T14:07:00Z" w16du:dateUtc="2025-09-22T12:07:00Z">
-        <w:r>
-          <w:rPr>
-            <w:lang w:val="en-US"/>
-          </w:rPr>
-          <w:delText>Acknowledged</w:delText>
-        </w:r>
-      </w:del>
-      <w:ins w:id="260" w:author="Ramin Miraftabi" w:date="2025-09-22T14:07:00Z" w16du:dateUtc="2025-09-22T12:07:00Z">
-        <w:r>
-          <w:rPr>
-            <w:lang w:val="en-US"/>
-          </w:rPr>
-          <w:t>Checked</w:t>
-        </w:r>
-      </w:ins>
+      <w:r>
+        <w:rPr>
+          <w:lang w:val="en-US"/>
+        </w:rPr>
+        <w:t>Checked</w:t>
+      </w:r>
     </w:p>
     <w:p>
       <w:pPr>
@@ -25333,22 +24654,12 @@
       <w:r>
         <w:t xml:space="preserve">VTS </w:t>
       </w:r>
-      <w:del w:id="261" w:author="Ramin Miraftabi" w:date="2025-09-24T09:06:00Z" w16du:dateUtc="2025-09-24T07:06:00Z">
-        <w:r>
-          <w:delText>a</w:delText>
-        </w:r>
-        <w:r>
-          <w:delText xml:space="preserve">cknowledges </w:delText>
-        </w:r>
-      </w:del>
-      <w:ins w:id="262" w:author="Ramin Miraftabi" w:date="2025-09-24T09:06:00Z" w16du:dateUtc="2025-09-24T07:06:00Z">
-        <w:r>
-          <w:t>checks</w:t>
-        </w:r>
-        <w:r>
-          <w:t xml:space="preserve"> </w:t>
-        </w:r>
-      </w:ins>
+      <w:r>
+        <w:t>checks</w:t>
+      </w:r>
+      <w:r>
+        <w:t xml:space="preserve"> </w:t>
+      </w:r>
       <w:r>
         <w:t>/ edits / comments route with required annotations.</w:t>
       </w:r>
@@ -25487,7 +24798,7 @@
       <w:pPr>
         <w:pStyle w:val="Caption"/>
       </w:pPr>
-      <w:bookmarkStart w:id="263" w:name="_Toc196500269"/>
+      <w:bookmarkStart w:id="82" w:name="_Toc196500269"/>
       <w:r>
         <w:t xml:space="preserve">Figure </w:t>
       </w:r>
@@ -25502,7 +24813,7 @@
       <w:r>
         <w:t xml:space="preserve"> Route recommendation from VTS to vessel</w:t>
       </w:r>
-      <w:bookmarkEnd w:id="263"/>
+      <w:bookmarkEnd w:id="82"/>
     </w:p>
     <w:p>
       <w:pPr>
@@ -25517,28 +24828,18 @@
         </w:rPr>
         <w:t xml:space="preserve">If VTS </w:t>
       </w:r>
-      <w:del w:id="264" w:author="Ramin Miraftabi" w:date="2025-09-24T09:06:00Z" w16du:dateUtc="2025-09-24T07:06:00Z">
-        <w:r>
-          <w:rPr>
-            <w:lang w:val="en-US"/>
-          </w:rPr>
-          <w:delText xml:space="preserve">acknowledges </w:delText>
-        </w:r>
-      </w:del>
-      <w:ins w:id="265" w:author="Ramin Miraftabi" w:date="2025-09-24T09:06:00Z" w16du:dateUtc="2025-09-24T07:06:00Z">
-        <w:r>
-          <w:rPr>
-            <w:lang w:val="en-US"/>
-          </w:rPr>
-          <w:t>checks</w:t>
-        </w:r>
-        <w:r>
-          <w:rPr>
-            <w:lang w:val="en-US"/>
-          </w:rPr>
-          <w:t xml:space="preserve"> </w:t>
-        </w:r>
-      </w:ins>
+      <w:r>
+        <w:rPr>
+          <w:lang w:val="en-US"/>
+        </w:rPr>
+        <w:t>checks</w:t>
+      </w:r>
+      <w:r>
+        <w:rPr>
+          <w:lang w:val="en-US"/>
+        </w:rPr>
+        <w:t xml:space="preserve"> </w:t>
+      </w:r>
       <w:r>
         <w:rPr>
           <w:lang w:val="en-US"/>
@@ -25559,22 +24860,12 @@
         </w:rPr>
         <w:t>-element and its required contents with the status set to “</w:t>
       </w:r>
-      <w:del w:id="266" w:author="Ramin Miraftabi" w:date="2025-09-22T14:07:00Z" w16du:dateUtc="2025-09-22T12:07:00Z">
-        <w:r>
-          <w:rPr>
-            <w:lang w:val="en-US"/>
-          </w:rPr>
-          <w:delText>Acknowledged</w:delText>
-        </w:r>
-      </w:del>
-      <w:ins w:id="267" w:author="Ramin Miraftabi" w:date="2025-09-22T14:07:00Z" w16du:dateUtc="2025-09-22T12:07:00Z">
-        <w:r>
-          <w:rPr>
-            <w:lang w:val="en-US"/>
-          </w:rPr>
-          <w:t>Checked</w:t>
-        </w:r>
-      </w:ins>
+      <w:r>
+        <w:rPr>
+          <w:lang w:val="en-US"/>
+        </w:rPr>
+        <w:t>Checked</w:t>
+      </w:r>
       <w:r>
         <w:rPr>
           <w:lang w:val="en-US"/>
@@ -25595,28 +24886,18 @@
         </w:rPr>
         <w:t xml:space="preserve"> must be updated to reflect time that route was </w:t>
       </w:r>
-      <w:del w:id="268" w:author="Ramin Miraftabi" w:date="2025-09-22T14:07:00Z" w16du:dateUtc="2025-09-22T12:07:00Z">
-        <w:r>
-          <w:rPr>
-            <w:lang w:val="en-US"/>
-          </w:rPr>
-          <w:delText xml:space="preserve">acknowledged </w:delText>
-        </w:r>
-      </w:del>
-      <w:ins w:id="269" w:author="Ramin Miraftabi" w:date="2025-09-22T14:07:00Z" w16du:dateUtc="2025-09-22T12:07:00Z">
-        <w:r>
-          <w:rPr>
-            <w:lang w:val="en-US"/>
-          </w:rPr>
-          <w:t>checked</w:t>
-        </w:r>
-        <w:r>
-          <w:rPr>
-            <w:lang w:val="en-US"/>
-          </w:rPr>
-          <w:t xml:space="preserve"> </w:t>
-        </w:r>
-      </w:ins>
+      <w:r>
+        <w:rPr>
+          <w:lang w:val="en-US"/>
+        </w:rPr>
+        <w:t>checked</w:t>
+      </w:r>
+      <w:r>
+        <w:rPr>
+          <w:lang w:val="en-US"/>
+        </w:rPr>
+        <w:t xml:space="preserve"> </w:t>
+      </w:r>
       <w:r>
         <w:rPr>
           <w:lang w:val="en-US"/>
@@ -25698,7 +24979,7 @@
       <w:pPr>
         <w:pStyle w:val="Caption"/>
       </w:pPr>
-      <w:bookmarkStart w:id="270" w:name="_Toc196500270"/>
+      <w:bookmarkStart w:id="83" w:name="_Toc196500270"/>
       <w:r>
         <w:t xml:space="preserve">Figure </w:t>
       </w:r>
@@ -25713,7 +24994,7 @@
       <w:r>
         <w:t xml:space="preserve"> Route acknowledgement by VTS</w:t>
       </w:r>
-      <w:bookmarkEnd w:id="270"/>
+      <w:bookmarkEnd w:id="83"/>
     </w:p>
     <w:p>
       <w:pPr>
@@ -25728,30 +25009,18 @@
         </w:rPr>
         <w:t xml:space="preserve">If the reply to the route from VTS is </w:t>
       </w:r>
-      <w:del w:id="271" w:author="Ramin Miraftabi" w:date="2025-09-24T09:10:00Z" w16du:dateUtc="2025-09-24T07:10:00Z">
-        <w:r>
-          <w:rPr>
-            <w:lang w:val="en-US"/>
-          </w:rPr>
-          <w:delText>not an acknowledgment</w:delText>
-        </w:r>
-      </w:del>
-      <w:ins w:id="272" w:author="Ramin Miraftabi" w:date="2025-09-24T10:29:00Z" w16du:dateUtc="2025-09-24T08:29:00Z">
-        <w:r>
-          <w:rPr>
-            <w:lang w:val="en-US"/>
-          </w:rPr>
-          <w:t xml:space="preserve">not </w:t>
-        </w:r>
-      </w:ins>
-      <w:ins w:id="273" w:author="Ramin Miraftabi" w:date="2025-09-24T09:10:00Z" w16du:dateUtc="2025-09-24T07:10:00Z">
-        <w:r>
-          <w:rPr>
-            <w:lang w:val="en-US"/>
-          </w:rPr>
-          <w:t>a checked route</w:t>
-        </w:r>
-      </w:ins>
+      <w:r>
+        <w:rPr>
+          <w:lang w:val="en-US"/>
+        </w:rPr>
+        <w:t xml:space="preserve">not </w:t>
+      </w:r>
+      <w:r>
+        <w:rPr>
+          <w:lang w:val="en-US"/>
+        </w:rPr>
+        <w:t>a checked route</w:t>
+      </w:r>
       <w:r>
         <w:rPr>
           <w:lang w:val="en-US"/>
@@ -25931,7 +25200,7 @@
       <w:pPr>
         <w:pStyle w:val="Caption"/>
       </w:pPr>
-      <w:bookmarkStart w:id="274" w:name="_Toc196500271"/>
+      <w:bookmarkStart w:id="84" w:name="_Toc196500271"/>
       <w:r>
         <w:t xml:space="preserve">Figure </w:t>
       </w:r>
@@ -25946,7 +25215,7 @@
       <w:r>
         <w:t xml:space="preserve"> Route response from VTS to vessel with open issues</w:t>
       </w:r>
-      <w:bookmarkEnd w:id="274"/>
+      <w:bookmarkEnd w:id="84"/>
     </w:p>
     <w:p>
       <w:pPr>
@@ -25955,39 +25224,28 @@
           <w:lang w:val="en-US"/>
         </w:rPr>
       </w:pPr>
-      <w:bookmarkStart w:id="275" w:name="_Toc196502233"/>
+      <w:bookmarkStart w:id="85" w:name="_Toc196502233"/>
       <w:r>
         <w:rPr>
           <w:lang w:val="en-US"/>
         </w:rPr>
         <w:t>Route request from VTS without a shared route</w:t>
       </w:r>
-      <w:bookmarkEnd w:id="275"/>
+      <w:bookmarkEnd w:id="85"/>
     </w:p>
     <w:p>
       <w:pPr>
         <w:pStyle w:val="BodyText"/>
         <w:rPr>
-          <w:ins w:id="276" w:author="Ramin Miraftabi" w:date="2025-09-24T09:12:00Z" w16du:dateUtc="2025-09-24T07:12:00Z"/>
-          <w:lang w:val="en-US"/>
-        </w:rPr>
-      </w:pPr>
-      <w:ins w:id="277" w:author="Ramin Miraftabi" w:date="2025-09-24T09:12:00Z" w16du:dateUtc="2025-09-24T07:12:00Z">
-        <w:r>
-          <w:rPr>
-            <w:lang w:val="en-US"/>
-          </w:rPr>
-          <w:t>Consumer support for</w:t>
-        </w:r>
-      </w:ins>
-      <w:ins w:id="278" w:author="Ramin Miraftabi" w:date="2025-09-24T09:13:00Z" w16du:dateUtc="2025-09-24T07:13:00Z">
-        <w:r>
-          <w:rPr>
-            <w:lang w:val="en-US"/>
-          </w:rPr>
-          <w:t xml:space="preserve"> this use case is optional.</w:t>
-        </w:r>
-      </w:ins>
+          <w:lang w:val="en-US"/>
+        </w:rPr>
+      </w:pPr>
+      <w:r>
+        <w:rPr>
+          <w:lang w:val="en-US"/>
+        </w:rPr>
+        <w:t>Consumer support for this use case is optional.</w:t>
+      </w:r>
     </w:p>
     <w:p>
       <w:pPr>
@@ -26016,28 +25274,18 @@
         </w:rPr>
         <w:t xml:space="preserve">Consumers compliant with this specification </w:t>
       </w:r>
-      <w:del w:id="279" w:author="Ramin Miraftabi" w:date="2025-09-24T09:12:00Z" w16du:dateUtc="2025-09-24T07:12:00Z">
-        <w:r>
-          <w:rPr>
-            <w:lang w:val="en-US"/>
-          </w:rPr>
-          <w:delText xml:space="preserve">must </w:delText>
-        </w:r>
-      </w:del>
-      <w:ins w:id="280" w:author="Ramin Miraftabi" w:date="2025-09-24T09:12:00Z" w16du:dateUtc="2025-09-24T07:12:00Z">
-        <w:r>
-          <w:rPr>
-            <w:lang w:val="en-US"/>
-          </w:rPr>
-          <w:t>can</w:t>
-        </w:r>
-        <w:r>
-          <w:rPr>
-            <w:lang w:val="en-US"/>
-          </w:rPr>
-          <w:t xml:space="preserve"> </w:t>
-        </w:r>
-      </w:ins>
+      <w:r>
+        <w:rPr>
+          <w:lang w:val="en-US"/>
+        </w:rPr>
+        <w:t>can</w:t>
+      </w:r>
+      <w:r>
+        <w:rPr>
+          <w:lang w:val="en-US"/>
+        </w:rPr>
+        <w:t xml:space="preserve"> </w:t>
+      </w:r>
       <w:r>
         <w:rPr>
           <w:lang w:val="en-US"/>
@@ -26162,16 +25410,9 @@
       <w:r>
         <w:t xml:space="preserve"> as </w:t>
       </w:r>
-      <w:del w:id="281" w:author="Ramin Miraftabi" w:date="2025-09-22T14:08:00Z" w16du:dateUtc="2025-09-22T12:08:00Z">
-        <w:r>
-          <w:delText>acknowledged</w:delText>
-        </w:r>
-      </w:del>
-      <w:ins w:id="282" w:author="Ramin Miraftabi" w:date="2025-09-22T14:08:00Z" w16du:dateUtc="2025-09-22T12:08:00Z">
-        <w:r>
-          <w:t>checked</w:t>
-        </w:r>
-      </w:ins>
+      <w:r>
+        <w:t>checked</w:t>
+      </w:r>
     </w:p>
     <w:p>
       <w:pPr>
@@ -26269,7 +25510,7 @@
       <w:pPr>
         <w:pStyle w:val="Caption"/>
       </w:pPr>
-      <w:bookmarkStart w:id="283" w:name="_Toc196500272"/>
+      <w:bookmarkStart w:id="86" w:name="_Toc196500272"/>
       <w:r>
         <w:t xml:space="preserve">Figure </w:t>
       </w:r>
@@ -26284,7 +25525,7 @@
       <w:r>
         <w:t xml:space="preserve"> Requesting route from vessel</w:t>
       </w:r>
-      <w:bookmarkEnd w:id="283"/>
+      <w:bookmarkEnd w:id="86"/>
     </w:p>
     <w:p>
       <w:pPr>
@@ -26293,31 +25534,28 @@
           <w:lang w:val="en-US"/>
         </w:rPr>
       </w:pPr>
-      <w:bookmarkStart w:id="284" w:name="_Toc196502234"/>
+      <w:bookmarkStart w:id="87" w:name="_Toc196502234"/>
       <w:r>
         <w:rPr>
           <w:lang w:val="en-US"/>
         </w:rPr>
         <w:t>Route request from VTS after route has been shared</w:t>
       </w:r>
-      <w:bookmarkEnd w:id="284"/>
+      <w:bookmarkEnd w:id="87"/>
     </w:p>
     <w:p>
       <w:pPr>
         <w:pStyle w:val="BodyText"/>
         <w:rPr>
-          <w:ins w:id="285" w:author="Ramin Miraftabi" w:date="2025-09-24T09:13:00Z" w16du:dateUtc="2025-09-24T07:13:00Z"/>
-          <w:lang w:val="en-US"/>
-        </w:rPr>
-      </w:pPr>
-      <w:ins w:id="286" w:author="Ramin Miraftabi" w:date="2025-09-24T09:13:00Z" w16du:dateUtc="2025-09-24T07:13:00Z">
-        <w:r>
-          <w:rPr>
-            <w:lang w:val="en-US"/>
-          </w:rPr>
-          <w:t>Consumer support for this use case is optional.</w:t>
-        </w:r>
-      </w:ins>
+          <w:lang w:val="en-US"/>
+        </w:rPr>
+      </w:pPr>
+      <w:r>
+        <w:rPr>
+          <w:lang w:val="en-US"/>
+        </w:rPr>
+        <w:t>Consumer support for this use case is optional.</w:t>
+      </w:r>
     </w:p>
     <w:p>
       <w:pPr>
@@ -26332,44 +25570,38 @@
         </w:rPr>
         <w:t xml:space="preserve">ECDIS must support an interface through which the currently monitored route can be requested by the service to get an updated version of the monitored route to display in VTS systems. This request </w:t>
       </w:r>
-      <w:ins w:id="287" w:author="Ramin Miraftabi" w:date="2025-09-24T09:13:00Z" w16du:dateUtc="2025-09-24T07:13:00Z">
-        <w:r>
-          <w:rPr>
-            <w:lang w:val="en-US"/>
-          </w:rPr>
-          <w:t>can be</w:t>
-        </w:r>
-      </w:ins>
-      <w:del w:id="288" w:author="Ramin Miraftabi" w:date="2025-09-24T09:13:00Z" w16du:dateUtc="2025-09-24T07:13:00Z">
-        <w:r>
-          <w:rPr>
-            <w:lang w:val="en-US"/>
-          </w:rPr>
-          <w:delText>is</w:delText>
-        </w:r>
-      </w:del>
-      <w:r>
-        <w:rPr>
-          <w:lang w:val="en-US"/>
-        </w:rPr>
-        <w:t xml:space="preserve"> automatically processed by ECDIS and the updated route </w:t>
-      </w:r>
-      <w:ins w:id="289" w:author="Ramin Miraftabi" w:date="2025-09-24T09:13:00Z" w16du:dateUtc="2025-09-24T07:13:00Z">
-        <w:r>
-          <w:rPr>
-            <w:lang w:val="en-US"/>
-          </w:rPr>
-          <w:t>can be</w:t>
-        </w:r>
-      </w:ins>
-      <w:del w:id="290" w:author="Ramin Miraftabi" w:date="2025-09-24T09:13:00Z" w16du:dateUtc="2025-09-24T07:13:00Z">
-        <w:r>
-          <w:rPr>
-            <w:lang w:val="en-US"/>
-          </w:rPr>
-          <w:delText>is</w:delText>
-        </w:r>
-      </w:del>
+      <w:r>
+        <w:rPr>
+          <w:lang w:val="en-US"/>
+        </w:rPr>
+        <w:t>can be</w:t>
+      </w:r>
+      <w:r>
+        <w:rPr>
+          <w:lang w:val="en-US"/>
+        </w:rPr>
+        <w:t xml:space="preserve"> automatically processed by </w:t>
+      </w:r>
+      <w:proofErr w:type="gramStart"/>
+      <w:r>
+        <w:rPr>
+          <w:lang w:val="en-US"/>
+        </w:rPr>
+        <w:t>ECDIS</w:t>
+      </w:r>
+      <w:proofErr w:type="gramEnd"/>
+      <w:r>
+        <w:rPr>
+          <w:lang w:val="en-US"/>
+        </w:rPr>
+        <w:t xml:space="preserve"> and the updated route </w:t>
+      </w:r>
+      <w:r>
+        <w:rPr>
+          <w:lang w:val="en-US"/>
+        </w:rPr>
+        <w:t>can be</w:t>
+      </w:r>
       <w:r>
         <w:rPr>
           <w:lang w:val="en-US"/>
@@ -26437,7 +25669,7 @@
       <w:pPr>
         <w:pStyle w:val="Caption"/>
       </w:pPr>
-      <w:bookmarkStart w:id="291" w:name="_Toc196500273"/>
+      <w:bookmarkStart w:id="88" w:name="_Toc196500273"/>
       <w:r>
         <w:t xml:space="preserve">Figure </w:t>
       </w:r>
@@ -26452,7 +25684,7 @@
       <w:r>
         <w:t xml:space="preserve"> Requesting updated route from vessel</w:t>
       </w:r>
-      <w:bookmarkEnd w:id="291"/>
+      <w:bookmarkEnd w:id="88"/>
     </w:p>
     <w:p>
       <w:pPr>
@@ -26461,14 +25693,14 @@
           <w:lang w:val="en-US"/>
         </w:rPr>
       </w:pPr>
-      <w:bookmarkStart w:id="292" w:name="_Toc196502235"/>
+      <w:bookmarkStart w:id="89" w:name="_Toc196502235"/>
       <w:r>
         <w:rPr>
           <w:lang w:val="en-US"/>
         </w:rPr>
         <w:t>Using a route reference library</w:t>
       </w:r>
-      <w:bookmarkEnd w:id="292"/>
+      <w:bookmarkEnd w:id="89"/>
     </w:p>
     <w:p>
       <w:pPr>
@@ -26671,7 +25903,7 @@
       <w:pPr>
         <w:pStyle w:val="Caption"/>
       </w:pPr>
-      <w:bookmarkStart w:id="293" w:name="_Toc196500274"/>
+      <w:bookmarkStart w:id="90" w:name="_Toc196500274"/>
       <w:r>
         <w:t xml:space="preserve">Figure </w:t>
       </w:r>
@@ -26686,7 +25918,7 @@
       <w:r>
         <w:t xml:space="preserve"> Route library usage flow</w:t>
       </w:r>
-      <w:bookmarkEnd w:id="293"/>
+      <w:bookmarkEnd w:id="90"/>
     </w:p>
     <w:p>
       <w:pPr>
@@ -26695,14 +25927,14 @@
           <w:lang w:val="en-US"/>
         </w:rPr>
       </w:pPr>
-      <w:bookmarkStart w:id="294" w:name="_Toc196502236"/>
+      <w:bookmarkStart w:id="91" w:name="_Toc196502236"/>
       <w:r>
         <w:rPr>
           <w:lang w:val="en-US"/>
         </w:rPr>
         <w:t>Service discovery</w:t>
       </w:r>
-      <w:bookmarkEnd w:id="294"/>
+      <w:bookmarkEnd w:id="91"/>
     </w:p>
     <w:p>
       <w:pPr>
@@ -26843,7 +26075,7 @@
       <w:pPr>
         <w:pStyle w:val="Caption"/>
       </w:pPr>
-      <w:bookmarkStart w:id="295" w:name="_Toc196500275"/>
+      <w:bookmarkStart w:id="92" w:name="_Toc196500275"/>
       <w:r>
         <w:t xml:space="preserve">Figure </w:t>
       </w:r>
@@ -26858,7 +26090,7 @@
       <w:r>
         <w:t xml:space="preserve"> Service discovery flow</w:t>
       </w:r>
-      <w:bookmarkEnd w:id="295"/>
+      <w:bookmarkEnd w:id="92"/>
     </w:p>
     <w:p>
       <w:pPr>
@@ -26880,12 +26112,12 @@
       <w:pPr>
         <w:pStyle w:val="Heading1"/>
       </w:pPr>
-      <w:bookmarkStart w:id="296" w:name="_Toc196502237"/>
+      <w:bookmarkStart w:id="93" w:name="_Toc196502237"/>
       <w:r>
         <w:lastRenderedPageBreak/>
         <w:t>Definitions</w:t>
       </w:r>
-      <w:bookmarkEnd w:id="296"/>
+      <w:bookmarkEnd w:id="93"/>
     </w:p>
     <w:p>
       <w:pPr>
@@ -27120,12 +26352,12 @@
       <w:pPr>
         <w:pStyle w:val="Heading1"/>
       </w:pPr>
-      <w:bookmarkStart w:id="297" w:name="_Toc196502238"/>
+      <w:bookmarkStart w:id="94" w:name="_Toc196502238"/>
       <w:r>
         <w:lastRenderedPageBreak/>
         <w:t>Abbreviations</w:t>
       </w:r>
-      <w:bookmarkEnd w:id="297"/>
+      <w:bookmarkEnd w:id="94"/>
     </w:p>
     <w:p>
       <w:pPr>
@@ -27471,12 +26703,12 @@
       <w:pPr>
         <w:pStyle w:val="Heading1"/>
       </w:pPr>
-      <w:bookmarkStart w:id="298" w:name="_Toc196502239"/>
+      <w:bookmarkStart w:id="95" w:name="_Toc196502239"/>
       <w:r>
         <w:lastRenderedPageBreak/>
         <w:t>References</w:t>
       </w:r>
-      <w:bookmarkEnd w:id="298"/>
+      <w:bookmarkEnd w:id="95"/>
     </w:p>
     <w:p>
       <w:pPr>
@@ -27493,7 +26725,7 @@
           <w:lang w:val="en-US"/>
         </w:rPr>
       </w:pPr>
-      <w:bookmarkStart w:id="299" w:name="_Ref196500408"/>
+      <w:bookmarkStart w:id="96" w:name="_Ref196500408"/>
       <w:r>
         <w:rPr>
           <w:lang w:val="en-US"/>
@@ -27518,7 +26750,7 @@
         </w:rPr>
         <w:t>Navigation Technical Services</w:t>
       </w:r>
-      <w:bookmarkEnd w:id="299"/>
+      <w:bookmarkEnd w:id="96"/>
     </w:p>
     <w:p>
       <w:pPr>
@@ -27553,7 +26785,7 @@
           <w:lang w:val="en-US"/>
         </w:rPr>
       </w:pPr>
-      <w:bookmarkStart w:id="300" w:name="_Ref196501240"/>
+      <w:bookmarkStart w:id="97" w:name="_Ref196501240"/>
       <w:r>
         <w:rPr>
           <w:lang w:val="en-US"/>
@@ -27566,7 +26798,7 @@
         </w:rPr>
         <w:t>2022. Guideline G1183 Provision of MCP Identities</w:t>
       </w:r>
-      <w:bookmarkEnd w:id="300"/>
+      <w:bookmarkEnd w:id="97"/>
     </w:p>
     <w:p>
       <w:pPr>
@@ -27607,7 +26839,7 @@
           <w:lang w:val="en-US"/>
         </w:rPr>
       </w:pPr>
-      <w:bookmarkStart w:id="301" w:name="_Ref196500527"/>
+      <w:bookmarkStart w:id="98" w:name="_Ref196500527"/>
       <w:r>
         <w:rPr>
           <w:lang w:val="en-US"/>
@@ -27656,45 +26888,25 @@
         </w:rPr>
         <w:t>Committee Draft 80/</w:t>
       </w:r>
-      <w:ins w:id="302" w:author="Ramin Miraftabi" w:date="2025-09-25T08:42:00Z" w16du:dateUtc="2025-09-25T06:42:00Z">
-        <w:r>
-          <w:rPr>
-            <w:lang w:val="en-US"/>
-          </w:rPr>
-          <w:t>2542</w:t>
-        </w:r>
-      </w:ins>
-      <w:del w:id="303" w:author="Ramin Miraftabi" w:date="2025-09-25T08:41:00Z" w16du:dateUtc="2025-09-25T06:41:00Z">
-        <w:r>
-          <w:rPr>
-            <w:lang w:val="en-US"/>
-          </w:rPr>
-          <w:delText>1148</w:delText>
-        </w:r>
-      </w:del>
+      <w:r>
+        <w:rPr>
+          <w:lang w:val="en-US"/>
+        </w:rPr>
+        <w:t>2542</w:t>
+      </w:r>
       <w:r>
         <w:rPr>
           <w:lang w:val="en-US"/>
         </w:rPr>
         <w:t>/</w:t>
       </w:r>
-      <w:ins w:id="304" w:author="Ramin Miraftabi" w:date="2025-09-25T08:42:00Z" w16du:dateUtc="2025-09-25T06:42:00Z">
-        <w:r>
-          <w:rPr>
-            <w:lang w:val="en-US"/>
-          </w:rPr>
-          <w:t>PCC</w:t>
-        </w:r>
-      </w:ins>
-      <w:del w:id="305" w:author="Ramin Miraftabi" w:date="2025-09-25T08:42:00Z" w16du:dateUtc="2025-09-25T06:42:00Z">
-        <w:r>
-          <w:rPr>
-            <w:lang w:val="en-US"/>
-          </w:rPr>
-          <w:delText>CD</w:delText>
-        </w:r>
-      </w:del>
-      <w:bookmarkEnd w:id="301"/>
+      <w:r>
+        <w:rPr>
+          <w:lang w:val="en-US"/>
+        </w:rPr>
+        <w:t>PCC</w:t>
+      </w:r>
+      <w:bookmarkEnd w:id="98"/>
     </w:p>
     <w:p>
       <w:pPr>
@@ -27704,7 +26916,7 @@
           <w:lang w:val="en-US"/>
         </w:rPr>
       </w:pPr>
-      <w:bookmarkStart w:id="306" w:name="_Ref196500518"/>
+      <w:bookmarkStart w:id="99" w:name="_Ref196500518"/>
       <w:r>
         <w:rPr>
           <w:lang w:val="en-US"/>
@@ -27741,45 +26953,25 @@
         </w:rPr>
         <w:t>Committee Draft 80/</w:t>
       </w:r>
-      <w:ins w:id="307" w:author="Ramin Miraftabi" w:date="2025-09-25T08:41:00Z" w16du:dateUtc="2025-09-25T06:41:00Z">
-        <w:r>
-          <w:rPr>
-            <w:lang w:val="en-US"/>
-          </w:rPr>
-          <w:t>2532</w:t>
-        </w:r>
-      </w:ins>
-      <w:del w:id="308" w:author="Ramin Miraftabi" w:date="2025-09-25T08:41:00Z" w16du:dateUtc="2025-09-25T06:41:00Z">
-        <w:r>
-          <w:rPr>
-            <w:lang w:val="en-US"/>
-          </w:rPr>
-          <w:delText>1149</w:delText>
-        </w:r>
-      </w:del>
+      <w:r>
+        <w:rPr>
+          <w:lang w:val="en-US"/>
+        </w:rPr>
+        <w:t>2532</w:t>
+      </w:r>
       <w:r>
         <w:rPr>
           <w:lang w:val="en-US"/>
         </w:rPr>
         <w:t>/</w:t>
       </w:r>
-      <w:ins w:id="309" w:author="Ramin Miraftabi" w:date="2025-09-25T08:41:00Z" w16du:dateUtc="2025-09-25T06:41:00Z">
-        <w:r>
-          <w:rPr>
-            <w:lang w:val="en-US"/>
-          </w:rPr>
-          <w:t>PCC</w:t>
-        </w:r>
-      </w:ins>
-      <w:del w:id="310" w:author="Ramin Miraftabi" w:date="2025-09-25T08:41:00Z" w16du:dateUtc="2025-09-25T06:41:00Z">
-        <w:r>
-          <w:rPr>
-            <w:lang w:val="en-US"/>
-          </w:rPr>
-          <w:delText>CD</w:delText>
-        </w:r>
-      </w:del>
-      <w:bookmarkEnd w:id="306"/>
+      <w:r>
+        <w:rPr>
+          <w:lang w:val="en-US"/>
+        </w:rPr>
+        <w:t>PCC</w:t>
+      </w:r>
+      <w:bookmarkEnd w:id="99"/>
     </w:p>
     <w:p>
       <w:pPr>
@@ -27789,7 +26981,7 @@
           <w:lang w:val="en-US"/>
         </w:rPr>
       </w:pPr>
-      <w:bookmarkStart w:id="311" w:name="_Ref196501273"/>
+      <w:bookmarkStart w:id="100" w:name="_Ref196501273"/>
       <w:r>
         <w:rPr>
           <w:lang w:val="en-US"/>
@@ -27835,7 +27027,7 @@
           <w:t>https://iacs.org.uk/resolutions/unified-requirements/ur-e</w:t>
         </w:r>
       </w:hyperlink>
-      <w:bookmarkEnd w:id="311"/>
+      <w:bookmarkEnd w:id="100"/>
     </w:p>
     <w:p>
       <w:pPr>
@@ -27845,7 +27037,7 @@
           <w:lang w:val="en-US"/>
         </w:rPr>
       </w:pPr>
-      <w:bookmarkStart w:id="312" w:name="_Ref196501347"/>
+      <w:bookmarkStart w:id="101" w:name="_Ref196501347"/>
       <w:r>
         <w:rPr>
           <w:lang w:val="en-US"/>
@@ -27876,7 +27068,7 @@
         </w:rPr>
         <w:t>Establishing Functional Performance Requirements</w:t>
       </w:r>
-      <w:bookmarkEnd w:id="312"/>
+      <w:bookmarkEnd w:id="101"/>
     </w:p>
     <w:p>
       <w:pPr>
@@ -27886,7 +27078,7 @@
           <w:lang w:val="en-US"/>
         </w:rPr>
       </w:pPr>
-      <w:bookmarkStart w:id="313" w:name="_Ref196500547"/>
+      <w:bookmarkStart w:id="102" w:name="_Ref196500547"/>
       <w:r>
         <w:rPr>
           <w:lang w:val="en-US"/>
@@ -27941,7 +27133,7 @@
         </w:rPr>
         <w:t>IEC TC80 MT7 December 2024 meeting outcome</w:t>
       </w:r>
-      <w:bookmarkEnd w:id="313"/>
+      <w:bookmarkEnd w:id="102"/>
     </w:p>
     <w:p>
       <w:pPr>
@@ -27968,36 +27160,24 @@
         </w:rPr>
         <w:t>MSC.530(106)</w:t>
       </w:r>
-      <w:ins w:id="314" w:author="Ramin Miraftabi" w:date="2025-10-01T14:37:00Z" w16du:dateUtc="2025-10-01T12:37:00Z">
-        <w:r>
-          <w:rPr>
-            <w:lang w:val="en-US"/>
-          </w:rPr>
-          <w:t>/</w:t>
-        </w:r>
-      </w:ins>
-      <w:del w:id="315" w:author="Ramin Miraftabi" w:date="2025-10-01T14:38:00Z" w16du:dateUtc="2025-10-01T12:38:00Z">
-        <w:r>
-          <w:rPr>
-            <w:lang w:val="en-US"/>
-          </w:rPr>
-          <w:delText>REV</w:delText>
-        </w:r>
-      </w:del>
-      <w:ins w:id="316" w:author="Ramin Miraftabi" w:date="2025-10-01T14:38:00Z" w16du:dateUtc="2025-10-01T12:38:00Z">
-        <w:r>
-          <w:rPr>
-            <w:lang w:val="en-US"/>
-          </w:rPr>
-          <w:t>R</w:t>
-        </w:r>
-        <w:r>
-          <w:rPr>
-            <w:lang w:val="en-US"/>
-          </w:rPr>
-          <w:t>ev</w:t>
-        </w:r>
-      </w:ins>
+      <w:r>
+        <w:rPr>
+          <w:lang w:val="en-US"/>
+        </w:rPr>
+        <w:t>/</w:t>
+      </w:r>
+      <w:r>
+        <w:rPr>
+          <w:lang w:val="en-US"/>
+        </w:rPr>
+        <w:t>R</w:t>
+      </w:r>
+      <w:r>
+        <w:rPr>
+          <w:lang w:val="en-US"/>
+        </w:rPr>
+        <w:t>ev</w:t>
+      </w:r>
       <w:r>
         <w:rPr>
           <w:lang w:val="en-US"/>
@@ -28011,7 +27191,21 @@
         <w:rPr>
           <w:lang w:val="en-US"/>
         </w:rPr>
-        <w:t>Performance Standards For Electronic Chart Display And Information Systems (ECDIS)</w:t>
+        <w:t xml:space="preserve">Performance Standards </w:t>
+      </w:r>
+      <w:proofErr w:type="gramStart"/>
+      <w:r>
+        <w:rPr>
+          <w:lang w:val="en-US"/>
+        </w:rPr>
+        <w:t>For</w:t>
+      </w:r>
+      <w:proofErr w:type="gramEnd"/>
+      <w:r>
+        <w:rPr>
+          <w:lang w:val="en-US"/>
+        </w:rPr>
+        <w:t xml:space="preserve"> Electronic Chart Display And Information Systems (ECDIS)</w:t>
       </w:r>
       <w:r>
         <w:rPr>
@@ -28019,32 +27213,9 @@
         </w:rPr>
         <w:t xml:space="preserve"> </w:t>
       </w:r>
-      <w:ins w:id="317" w:author="Ramin Miraftabi" w:date="2025-10-01T14:47:00Z" w16du:dateUtc="2025-10-01T12:47:00Z">
-        <w:r>
-          <w:t>https://docs.imo.org/Shared/Download.aspx?did=151274</w:t>
-        </w:r>
-      </w:ins>
-      <w:del w:id="318" w:author="Ramin Miraftabi" w:date="2025-10-01T14:47:00Z" w16du:dateUtc="2025-10-01T12:47:00Z">
-        <w:r>
-          <w:fldChar w:fldCharType="begin"/>
-        </w:r>
-        <w:r>
-          <w:delInstrText>HYPERLINK "https://wwwcdn.imo.org/localresources/en/KnowledgeCentre/IndexofIMOResolutions/MSCResolutions/MSC.530(106).pdf"</w:delInstrText>
-        </w:r>
-        <w:r>
-          <w:fldChar w:fldCharType="separate"/>
-        </w:r>
-        <w:r>
-          <w:rPr>
-            <w:rStyle w:val="Hyperlink"/>
-            <w:lang w:val="en-US"/>
-          </w:rPr>
-          <w:delText>https://wwwcdn.imo.org/localresources/en/KnowledgeCentre/IndexofIMOResolutions/MSCResolutions/MSC.530(106).pdf</w:delText>
-        </w:r>
-        <w:r>
-          <w:fldChar w:fldCharType="end"/>
-        </w:r>
-      </w:del>
+      <w:r>
+        <w:t>https://docs.imo.org/Shared/Download.aspx?did=151274</w:t>
+      </w:r>
     </w:p>
     <w:p>
       <w:pPr>
@@ -28053,7 +27224,7 @@
           <w:lang w:val="en-US"/>
         </w:rPr>
       </w:pPr>
-      <w:bookmarkStart w:id="319" w:name="_Ref196501667"/>
+      <w:bookmarkStart w:id="103" w:name="_Ref196501667"/>
       <w:r>
         <w:rPr>
           <w:lang w:val="en-US"/>
@@ -28072,72 +27243,48 @@
         </w:rPr>
         <w:t>MSC.1</w:t>
       </w:r>
-      <w:ins w:id="320" w:author="Ramin Miraftabi" w:date="2025-10-01T15:08:00Z" w16du:dateUtc="2025-10-01T13:08:00Z">
-        <w:r>
-          <w:rPr>
-            <w:lang w:val="en-US"/>
-          </w:rPr>
-          <w:t>/</w:t>
-        </w:r>
-      </w:ins>
+      <w:r>
+        <w:rPr>
+          <w:lang w:val="en-US"/>
+        </w:rPr>
+        <w:t>/</w:t>
+      </w:r>
       <w:r>
         <w:rPr>
           <w:lang w:val="en-US"/>
         </w:rPr>
         <w:t>C</w:t>
       </w:r>
-      <w:ins w:id="321" w:author="Ramin Miraftabi" w:date="2025-10-01T15:08:00Z" w16du:dateUtc="2025-10-01T13:08:00Z">
-        <w:r>
-          <w:rPr>
-            <w:lang w:val="en-US"/>
-          </w:rPr>
-          <w:t>irc</w:t>
-        </w:r>
-      </w:ins>
-      <w:del w:id="322" w:author="Ramin Miraftabi" w:date="2025-10-01T15:08:00Z" w16du:dateUtc="2025-10-01T13:08:00Z">
-        <w:r>
-          <w:rPr>
-            <w:lang w:val="en-US"/>
-          </w:rPr>
-          <w:delText>IRC</w:delText>
-        </w:r>
-      </w:del>
+      <w:r>
+        <w:rPr>
+          <w:lang w:val="en-US"/>
+        </w:rPr>
+        <w:t>irc</w:t>
+      </w:r>
       <w:r>
         <w:rPr>
           <w:lang w:val="en-US"/>
         </w:rPr>
         <w:t>.1610</w:t>
       </w:r>
-      <w:ins w:id="323" w:author="Ramin Miraftabi" w:date="2025-10-01T15:08:00Z" w16du:dateUtc="2025-10-01T13:08:00Z">
-        <w:r>
-          <w:rPr>
-            <w:lang w:val="en-US"/>
-          </w:rPr>
-          <w:t>/</w:t>
-        </w:r>
-      </w:ins>
+      <w:r>
+        <w:rPr>
+          <w:lang w:val="en-US"/>
+        </w:rPr>
+        <w:t>/</w:t>
+      </w:r>
       <w:r>
         <w:rPr>
           <w:lang w:val="en-US"/>
         </w:rPr>
         <w:t>R</w:t>
       </w:r>
-      <w:ins w:id="324" w:author="Ramin Miraftabi" w:date="2025-10-01T15:08:00Z" w16du:dateUtc="2025-10-01T13:08:00Z">
-        <w:r>
-          <w:rPr>
-            <w:lang w:val="en-US"/>
-          </w:rPr>
-          <w:t>ev</w:t>
-        </w:r>
-      </w:ins>
-      <w:del w:id="325" w:author="Ramin Miraftabi" w:date="2025-10-01T15:08:00Z" w16du:dateUtc="2025-10-01T13:08:00Z">
-        <w:r>
-          <w:rPr>
-            <w:lang w:val="en-US"/>
-          </w:rPr>
-          <w:delText>EV</w:delText>
-        </w:r>
-      </w:del>
+      <w:r>
+        <w:rPr>
+          <w:lang w:val="en-US"/>
+        </w:rPr>
+        <w:t>ev</w:t>
+      </w:r>
       <w:r>
         <w:rPr>
           <w:lang w:val="en-US"/>
@@ -28156,57 +27303,21 @@
         </w:rPr>
         <w:t xml:space="preserve"> </w:t>
       </w:r>
-      <w:ins w:id="326" w:author="Ramin Miraftabi" w:date="2025-10-01T11:59:00Z" w16du:dateUtc="2025-10-01T09:59:00Z">
-        <w:r>
-          <w:fldChar w:fldCharType="begin"/>
-        </w:r>
-        <w:r>
-          <w:instrText>HYPERLINK "https://docs.imo.org/Shared/Download.aspx?did=150086"</w:instrText>
-        </w:r>
-        <w:r>
-          <w:fldChar w:fldCharType="separate"/>
-        </w:r>
+      <w:hyperlink r:id="rId44" w:history="1">
         <w:r>
           <w:rPr>
             <w:rStyle w:val="Hyperlink"/>
           </w:rPr>
           <w:t>https://docs.imo.org/Shared/Download.aspx?did=150086</w:t>
         </w:r>
-        <w:r>
-          <w:fldChar w:fldCharType="end"/>
-        </w:r>
-      </w:ins>
-      <w:del w:id="327" w:author="Ramin Miraftabi" w:date="2025-10-01T11:59:00Z" w16du:dateUtc="2025-10-01T09:59:00Z">
-        <w:r>
-          <w:rPr>
-            <w:lang w:val="en-US"/>
-          </w:rPr>
-          <w:delText>https://wwwcdn.imo.org/localresources/en/OurWork/Safety/Documents/enavigation/MSC.1-CIRC.1610%20-</w:delText>
-        </w:r>
-      </w:del>
-      <w:del w:id="328" w:author="Ramin Miraftabi" w:date="2025-10-01T11:53:00Z" w16du:dateUtc="2025-10-01T09:53:00Z">
-        <w:r>
-          <w:rPr>
-            <w:lang w:val="en-US"/>
-          </w:rPr>
-          <w:delText xml:space="preserve"> </w:delText>
-        </w:r>
-      </w:del>
-      <w:del w:id="329" w:author="Ramin Miraftabi" w:date="2025-10-01T11:59:00Z" w16du:dateUtc="2025-10-01T09:59:00Z">
-        <w:r>
-          <w:rPr>
-            <w:lang w:val="en-US"/>
-          </w:rPr>
-          <w:delText>%20Initial%20Descriptions%20Of%20Maritime%20ServicesIn%20The%20Context%20Of%20E-Navigation%20(Secretariat)%20(1).pdf</w:delText>
-        </w:r>
-      </w:del>
-      <w:bookmarkEnd w:id="319"/>
+      </w:hyperlink>
+      <w:bookmarkEnd w:id="103"/>
     </w:p>
     <w:sectPr>
-      <w:headerReference w:type="even" r:id="rId44"/>
-      <w:headerReference w:type="default" r:id="rId45"/>
-      <w:headerReference w:type="first" r:id="rId46"/>
-      <w:footerReference w:type="first" r:id="rId47"/>
+      <w:headerReference w:type="even" r:id="rId45"/>
+      <w:headerReference w:type="default" r:id="rId46"/>
+      <w:headerReference w:type="first" r:id="rId47"/>
+      <w:footerReference w:type="first" r:id="rId48"/>
       <w:pgSz w:w="11906" w:h="16838" w:code="9"/>
       <w:pgMar w:top="1276" w:right="1080" w:bottom="1440" w:left="1080" w:header="454" w:footer="313" w:gutter="0"/>
       <w:cols w:space="720"/>
@@ -28628,7 +27739,7 @@
       <w:rPr>
         <w:lang w:val="en-GB"/>
       </w:rPr>
-      <w:t>Edition 1.0.1</w:t>
+      <w:t>Edition 1.1</w:t>
     </w:r>
     <w:r>
       <w:rPr>
@@ -28685,16 +27796,6 @@
       </w:rPr>
       <w:t>:ed1.</w:t>
     </w:r>
-    <w:del w:id="9" w:author="Ramin Miraftabi" w:date="2025-09-24T10:30:00Z" w16du:dateUtc="2025-09-24T08:30:00Z">
-      <w:r>
-        <w:rPr>
-          <w:rFonts w:eastAsiaTheme="minorEastAsia" w:hint="eastAsia"/>
-          <w:noProof w:val="0"/>
-          <w:lang w:val="en-GB" w:eastAsia="ko-KR"/>
-        </w:rPr>
-        <w:delText>0.</w:delText>
-      </w:r>
-    </w:del>
     <w:r>
       <w:rPr>
         <w:rFonts w:eastAsiaTheme="minorEastAsia" w:hint="eastAsia"/>
@@ -29412,11 +28513,6 @@
       <w:rPr>
         <w:noProof/>
       </w:rPr>
-    </w:r>
-    <w:r>
-      <w:rPr>
-        <w:noProof/>
-      </w:rPr>
       <w:pict w14:anchorId="0CC6EFED">
         <v:shapetype id="_x0000_t136" coordsize="21600,21600" o:spt="136" adj="10800" path="m@7,l@8,m@5,21600l@6,21600e">
           <v:formulas>
@@ -29517,12 +28613,6 @@
         <w:noProof/>
         <w:lang w:val="en-GB"/>
       </w:rPr>
-    </w:r>
-    <w:r>
-      <w:rPr>
-        <w:noProof/>
-        <w:lang w:val="en-GB"/>
-      </w:rPr>
       <w:pict w14:anchorId="79966170">
         <v:shape id="_x0000_s1025" type="#_x0000_t136" alt="" style="position:absolute;left:0;text-align:left;margin-left:0;margin-top:0;width:429.4pt;height:257.6pt;rotation:315;z-index:-251658220;mso-wrap-edited:f;mso-width-percent:0;mso-height-percent:0;mso-position-horizontal:center;mso-position-horizontal-relative:margin;mso-position-vertical:center;mso-position-vertical-relative:margin;mso-width-percent:0;mso-height-percent:0" o:allowincell="f" fillcolor="silver" stroked="f">
           <v:fill opacity=".5"/>
@@ -29558,8 +28648,8 @@
         <w:lang w:val="en-GB"/>
       </w:rPr>
     </w:pPr>
-    <w:bookmarkStart w:id="7" w:name="_Hlk196499351"/>
-    <w:bookmarkStart w:id="8" w:name="_Hlk196499352"/>
+    <w:bookmarkStart w:id="2" w:name="_Hlk196499351"/>
+    <w:bookmarkStart w:id="3" w:name="_Hlk196499352"/>
     <w:r>
       <w:rPr>
         <w:noProof/>
@@ -29669,8 +28759,8 @@
       <w:t>CONTENTS</w:t>
     </w:r>
   </w:p>
-  <w:bookmarkEnd w:id="7"/>
-  <w:bookmarkEnd w:id="8"/>
+  <w:bookmarkEnd w:id="2"/>
+  <w:bookmarkEnd w:id="3"/>
   <w:p>
     <w:pPr>
       <w:pStyle w:val="Header"/>
@@ -31885,14 +30975,6 @@
   </w:num>
   <w:numIdMacAtCleanup w:val="41"/>
 </w:numbering>
-</file>
-
-<file path=word/people.xml><?xml version="1.0" encoding="utf-8"?>
-<w15:people xmlns:wpc="http://schemas.microsoft.com/office/word/2010/wordprocessingCanvas" xmlns:cx="http://schemas.microsoft.com/office/drawing/2014/chartex" xmlns:cx1="http://schemas.microsoft.com/office/drawing/2015/9/8/chartex" xmlns:cx2="http://schemas.microsoft.com/office/drawing/2015/10/21/chartex" xmlns:cx3="http://schemas.microsoft.com/office/drawing/2016/5/9/chartex" xmlns:cx4="http://schemas.microsoft.com/office/drawing/2016/5/10/chartex" xmlns:cx5="http://schemas.microsoft.com/office/drawing/2016/5/11/chartex" xmlns:cx6="http://schemas.microsoft.com/office/drawing/2016/5/12/chartex" xmlns:cx7="http://schemas.microsoft.com/office/drawing/2016/5/13/chartex" xmlns:cx8="http://schemas.microsoft.com/office/drawing/2016/5/14/chartex" xmlns:mc="http://schemas.openxmlformats.org/markup-compatibility/2006" xmlns:aink="http://schemas.microsoft.com/office/drawing/2016/ink" xmlns:am3d="http://schemas.microsoft.com/office/drawing/2017/model3d" xmlns:o="urn:schemas-microsoft-com:office:office" xmlns:oel="http://schemas.microsoft.com/office/2019/extlst" xmlns:r="http://schemas.openxmlformats.org/officeDocument/2006/relationships" xmlns:m="http://schemas.openxmlformats.org/officeDocument/2006/math" xmlns:v="urn:schemas-microsoft-com:vml" xmlns:wp14="http://schemas.microsoft.com/office/word/2010/wordprocessingDrawing" xmlns:wp="http://schemas.openxmlformats.org/drawingml/2006/wordprocessingDrawing" xmlns:w10="urn:schemas-microsoft-com:office:word" xmlns:w="http://schemas.openxmlformats.org/wordprocessingml/2006/main" xmlns:w14="http://schemas.microsoft.com/office/word/2010/wordml" xmlns:w15="http://schemas.microsoft.com/office/word/2012/wordml" xmlns:w16cex="http://schemas.microsoft.com/office/word/2018/wordml/cex" xmlns:w16cid="http://schemas.microsoft.com/office/word/2016/wordml/cid" xmlns:w16="http://schemas.microsoft.com/office/word/2018/wordml" xmlns:w16du="http://schemas.microsoft.com/office/word/2023/wordml/word16du" xmlns:w16sdtdh="http://schemas.microsoft.com/office/word/2020/wordml/sdtdatahash" xmlns:w16sdtfl="http://schemas.microsoft.com/office/word/2024/wordml/sdtformatlock" xmlns:w16se="http://schemas.microsoft.com/office/word/2015/wordml/symex" xmlns:wpg="http://schemas.microsoft.com/office/word/2010/wordprocessingGroup" xmlns:wpi="http://schemas.microsoft.com/office/word/2010/wordprocessingInk" xmlns:wne="http://schemas.microsoft.com/office/word/2006/wordml" xmlns:wps="http://schemas.microsoft.com/office/word/2010/wordprocessingShape" mc:Ignorable="w14 w15 w16se w16cid w16 w16cex w16sdtdh w16sdtfl w16du wp14">
-  <w15:person w15:author="Ramin Miraftabi">
-    <w15:presenceInfo w15:providerId="AD" w15:userId="S::ramin.miraftabi@solita.fi::2b2afade-f6d4-4ff8-a2b6-55c0e35e373a"/>
-  </w15:person>
-</w15:people>
 </file>
 
 <file path=word/styles.xml><?xml version="1.0" encoding="utf-8"?>
@@ -35901,12 +34983,6 @@
 </file>
 
 <file path=customXml/item1.xml><?xml version="1.0" encoding="utf-8"?>
-<p:properties xmlns:p="http://schemas.microsoft.com/office/2006/metadata/properties" xmlns:xsi="http://www.w3.org/2001/XMLSchema-instance" xmlns:pc="http://schemas.microsoft.com/office/infopath/2007/PartnerControls">
-  <documentManagement/>
-</p:properties>
-</file>
-
-<file path=customXml/item2.xml><?xml version="1.0" encoding="utf-8"?>
 <ct:contentTypeSchema xmlns:ct="http://schemas.microsoft.com/office/2006/metadata/contentType" xmlns:ma="http://schemas.microsoft.com/office/2006/metadata/properties/metaAttributes" ct:_="" ma:_="" ma:contentTypeName="Document" ma:contentTypeID="0x010100284E6750EF669B4994C5AA314AD74706" ma:contentTypeVersion="4" ma:contentTypeDescription="Create a new document." ma:contentTypeScope="" ma:versionID="5349f7a552eb3508e8640300697618ef">
   <xsd:schema xmlns:xsd="http://www.w3.org/2001/XMLSchema" xmlns:xs="http://www.w3.org/2001/XMLSchema" xmlns:p="http://schemas.microsoft.com/office/2006/metadata/properties" xmlns:ns2="c2004fb5-89e3-4e27-9b02-7c9c93f1d461" targetNamespace="http://schemas.microsoft.com/office/2006/metadata/properties" ma:root="true" ma:fieldsID="3a6de98f78d3cb9e2b5679560cce1828" ns2:_="">
     <xsd:import namespace="c2004fb5-89e3-4e27-9b02-7c9c93f1d461"/>
@@ -36048,6 +35124,15 @@
     <xs:element name="TermId" type="xs:string"/>
   </xs:schema>
 </ct:contentTypeSchema>
+</file>
+
+<file path=customXml/item2.xml><?xml version="1.0" encoding="utf-8"?>
+<?mso-contentType ?>
+<FormTemplates xmlns="http://schemas.microsoft.com/sharepoint/v3/contenttype/forms">
+  <Display>DocumentLibraryForm</Display>
+  <Edit>DocumentLibraryForm</Edit>
+  <New>DocumentLibraryForm</New>
+</FormTemplates>
 </file>
 
 <file path=customXml/item3.xml><?xml version="1.0" encoding="utf-8"?>
@@ -36266,27 +35351,35 @@
 </file>
 
 <file path=customXml/item4.xml><?xml version="1.0" encoding="utf-8"?>
-<?mso-contentType ?>
-<FormTemplates xmlns="http://schemas.microsoft.com/sharepoint/v3/contenttype/forms">
-  <Display>DocumentLibraryForm</Display>
-  <Edit>DocumentLibraryForm</Edit>
-  <New>DocumentLibraryForm</New>
-</FormTemplates>
+<p:properties xmlns:p="http://schemas.microsoft.com/office/2006/metadata/properties" xmlns:xsi="http://www.w3.org/2001/XMLSchema-instance" xmlns:pc="http://schemas.microsoft.com/office/infopath/2007/PartnerControls">
+  <documentManagement/>
+</p:properties>
 </file>
 
 <file path=customXml/itemProps1.xml><?xml version="1.0" encoding="utf-8"?>
-<ds:datastoreItem xmlns:ds="http://schemas.openxmlformats.org/officeDocument/2006/customXml" ds:itemID="{D5FDC2FB-9500-44B6-A7BA-95BA7070BAA6}">
+<ds:datastoreItem xmlns:ds="http://schemas.openxmlformats.org/officeDocument/2006/customXml" ds:itemID="{CA95E551-58E3-465A-911B-B92DD33F3A89}">
   <ds:schemaRefs>
+    <ds:schemaRef ds:uri="http://schemas.microsoft.com/office/2006/metadata/contentType"/>
+    <ds:schemaRef ds:uri="http://schemas.microsoft.com/office/2006/metadata/properties/metaAttributes"/>
+    <ds:schemaRef ds:uri="http://www.w3.org/2001/XMLSchema"/>
     <ds:schemaRef ds:uri="http://schemas.microsoft.com/office/2006/metadata/properties"/>
+    <ds:schemaRef ds:uri="c2004fb5-89e3-4e27-9b02-7c9c93f1d461"/>
+    <ds:schemaRef ds:uri="http://schemas.microsoft.com/office/2006/documentManagement/types"/>
     <ds:schemaRef ds:uri="http://schemas.microsoft.com/office/infopath/2007/PartnerControls"/>
-    <ds:schemaRef ds:uri="1bfdac25-5417-4dce-b783-1e79583e09c2"/>
-    <ds:schemaRef ds:uri="ed72da13-45cf-4b5b-99f8-a2a89cf55939"/>
+    <ds:schemaRef ds:uri="http://schemas.openxmlformats.org/package/2006/metadata/core-properties"/>
+    <ds:schemaRef ds:uri="http://purl.org/dc/elements/1.1/"/>
+    <ds:schemaRef ds:uri="http://purl.org/dc/terms/"/>
+    <ds:schemaRef ds:uri="http://schemas.microsoft.com/internal/obd"/>
   </ds:schemaRefs>
 </ds:datastoreItem>
 </file>
 
 <file path=customXml/itemProps2.xml><?xml version="1.0" encoding="utf-8"?>
-<ds:datastoreItem xmlns:ds="http://schemas.openxmlformats.org/officeDocument/2006/customXml" ds:itemID="{CA95E551-58E3-465A-911B-B92DD33F3A89}"/>
+<ds:datastoreItem xmlns:ds="http://schemas.openxmlformats.org/officeDocument/2006/customXml" ds:itemID="{C3656318-0EE2-412C-AE7F-2060B4C2E029}">
+  <ds:schemaRefs>
+    <ds:schemaRef ds:uri="http://schemas.microsoft.com/sharepoint/v3/contenttype/forms"/>
+  </ds:schemaRefs>
+</ds:datastoreItem>
 </file>
 
 <file path=customXml/itemProps3.xml><?xml version="1.0" encoding="utf-8"?>
@@ -36298,9 +35391,10 @@
 </file>
 
 <file path=customXml/itemProps4.xml><?xml version="1.0" encoding="utf-8"?>
-<ds:datastoreItem xmlns:ds="http://schemas.openxmlformats.org/officeDocument/2006/customXml" ds:itemID="{C3656318-0EE2-412C-AE7F-2060B4C2E029}">
+<ds:datastoreItem xmlns:ds="http://schemas.openxmlformats.org/officeDocument/2006/customXml" ds:itemID="{D5FDC2FB-9500-44B6-A7BA-95BA7070BAA6}">
   <ds:schemaRefs>
-    <ds:schemaRef ds:uri="http://schemas.microsoft.com/sharepoint/v3/contenttype/forms"/>
+    <ds:schemaRef ds:uri="http://schemas.microsoft.com/office/2006/metadata/properties"/>
+    <ds:schemaRef ds:uri="http://schemas.microsoft.com/office/infopath/2007/PartnerControls"/>
   </ds:schemaRefs>
 </ds:datastoreItem>
 </file>
</xml_diff>